<commit_message>
fix bugs in `firm_two_year_reg.dta`
</commit_message>
<xml_diff>
--- a/manuscript/notes/结果汇总20260111.docx
+++ b/manuscript/notes/结果汇总20260111.docx
@@ -5,14 +5,14 @@
     <w:p>
       <w:pPr>
         <w:rPr>
-          <w:rFonts w:ascii="Times New Roman" w:eastAsia="宋体" w:hAnsi="Times New Roman"/>
+          <w:rFonts w:ascii="Times New Roman" w:eastAsia="SimSun" w:hAnsi="Times New Roman"/>
           <w:b/>
           <w:bCs/>
         </w:rPr>
       </w:pPr>
       <w:r>
         <w:rPr>
-          <w:rFonts w:ascii="Times New Roman" w:eastAsia="宋体" w:hAnsi="Times New Roman" w:hint="eastAsia"/>
+          <w:rFonts w:ascii="Times New Roman" w:eastAsia="SimSun" w:hAnsi="Times New Roman" w:hint="eastAsia"/>
           <w:b/>
           <w:bCs/>
         </w:rPr>
@@ -20,7 +20,7 @@
       </w:r>
       <w:r>
         <w:rPr>
-          <w:rFonts w:ascii="Times New Roman" w:eastAsia="宋体" w:hAnsi="Times New Roman" w:hint="eastAsia"/>
+          <w:rFonts w:ascii="Times New Roman" w:eastAsia="SimSun" w:hAnsi="Times New Roman" w:hint="eastAsia"/>
           <w:b/>
           <w:bCs/>
         </w:rPr>
@@ -30,204 +30,206 @@
     <w:p>
       <w:pPr>
         <w:rPr>
-          <w:rFonts w:ascii="Times New Roman" w:eastAsia="宋体" w:hAnsi="Times New Roman"/>
+          <w:rFonts w:ascii="Times New Roman" w:eastAsia="SimSun" w:hAnsi="Times New Roman"/>
         </w:rPr>
       </w:pPr>
       <w:r>
         <w:rPr>
-          <w:rFonts w:ascii="Times New Roman" w:eastAsia="宋体" w:hAnsi="Times New Roman" w:hint="eastAsia"/>
+          <w:rFonts w:ascii="Times New Roman" w:eastAsia="SimSun" w:hAnsi="Times New Roman" w:hint="eastAsia"/>
         </w:rPr>
         <w:t>1</w:t>
       </w:r>
       <w:r>
         <w:rPr>
-          <w:rFonts w:ascii="Times New Roman" w:eastAsia="宋体" w:hAnsi="Times New Roman" w:hint="eastAsia"/>
+          <w:rFonts w:ascii="Times New Roman" w:eastAsia="SimSun" w:hAnsi="Times New Roman" w:hint="eastAsia"/>
         </w:rPr>
         <w:t>、</w:t>
       </w:r>
       <w:r>
         <w:rPr>
-          <w:rFonts w:ascii="Times New Roman" w:eastAsia="宋体" w:hAnsi="Times New Roman" w:hint="eastAsia"/>
+          <w:rFonts w:ascii="Times New Roman" w:eastAsia="SimSun" w:hAnsi="Times New Roman" w:hint="eastAsia"/>
         </w:rPr>
         <w:t>数据：（</w:t>
       </w:r>
       <w:r>
         <w:rPr>
-          <w:rFonts w:ascii="Times New Roman" w:eastAsia="宋体" w:hAnsi="Times New Roman" w:hint="eastAsia"/>
+          <w:rFonts w:ascii="Times New Roman" w:eastAsia="SimSun" w:hAnsi="Times New Roman" w:hint="eastAsia"/>
         </w:rPr>
         <w:t>1</w:t>
       </w:r>
       <w:r>
         <w:rPr>
-          <w:rFonts w:ascii="Times New Roman" w:eastAsia="宋体" w:hAnsi="Times New Roman" w:hint="eastAsia"/>
+          <w:rFonts w:ascii="Times New Roman" w:eastAsia="SimSun" w:hAnsi="Times New Roman" w:hint="eastAsia"/>
         </w:rPr>
         <w:t>）</w:t>
       </w:r>
       <w:r>
         <w:rPr>
-          <w:rFonts w:ascii="Times New Roman" w:eastAsia="宋体" w:hAnsi="Times New Roman" w:hint="eastAsia"/>
+          <w:rFonts w:ascii="Times New Roman" w:eastAsia="SimSun" w:hAnsi="Times New Roman" w:hint="eastAsia"/>
         </w:rPr>
         <w:t>使用</w:t>
       </w:r>
-      <w:r>
-        <w:rPr>
-          <w:rFonts w:ascii="Times New Roman" w:eastAsia="宋体" w:hAnsi="Times New Roman" w:hint="eastAsia"/>
+      <w:proofErr w:type="spellStart"/>
+      <w:r>
+        <w:rPr>
+          <w:rFonts w:ascii="Times New Roman" w:eastAsia="SimSun" w:hAnsi="Times New Roman" w:hint="eastAsia"/>
         </w:rPr>
         <w:t>Rstata</w:t>
       </w:r>
-      <w:r>
-        <w:rPr>
-          <w:rFonts w:ascii="Times New Roman" w:eastAsia="宋体" w:hAnsi="Times New Roman" w:hint="eastAsia"/>
+      <w:proofErr w:type="spellEnd"/>
+      <w:r>
+        <w:rPr>
+          <w:rFonts w:ascii="Times New Roman" w:eastAsia="SimSun" w:hAnsi="Times New Roman" w:hint="eastAsia"/>
         </w:rPr>
         <w:t>税调数据（此前是铁瑛版本）</w:t>
       </w:r>
       <w:r>
         <w:rPr>
-          <w:rFonts w:ascii="Times New Roman" w:eastAsia="宋体" w:hAnsi="Times New Roman" w:hint="eastAsia"/>
+          <w:rFonts w:ascii="Times New Roman" w:eastAsia="SimSun" w:hAnsi="Times New Roman" w:hint="eastAsia"/>
         </w:rPr>
         <w:t>，</w:t>
       </w:r>
       <w:r>
         <w:rPr>
-          <w:rFonts w:ascii="Times New Roman" w:eastAsia="宋体" w:hAnsi="Times New Roman" w:hint="eastAsia"/>
+          <w:rFonts w:ascii="Times New Roman" w:eastAsia="SimSun" w:hAnsi="Times New Roman" w:hint="eastAsia"/>
         </w:rPr>
         <w:t>精细地处理了税调与工企的匹配。</w:t>
       </w:r>
       <w:r>
         <w:rPr>
-          <w:rFonts w:ascii="Times New Roman" w:eastAsia="宋体" w:hAnsi="Times New Roman" w:hint="eastAsia"/>
+          <w:rFonts w:ascii="Times New Roman" w:eastAsia="SimSun" w:hAnsi="Times New Roman" w:hint="eastAsia"/>
         </w:rPr>
         <w:t>（</w:t>
       </w:r>
       <w:r>
         <w:rPr>
-          <w:rFonts w:ascii="Times New Roman" w:eastAsia="宋体" w:hAnsi="Times New Roman" w:hint="eastAsia"/>
+          <w:rFonts w:ascii="Times New Roman" w:eastAsia="SimSun" w:hAnsi="Times New Roman" w:hint="eastAsia"/>
         </w:rPr>
         <w:t>2</w:t>
       </w:r>
       <w:r>
         <w:rPr>
-          <w:rFonts w:ascii="Times New Roman" w:eastAsia="宋体" w:hAnsi="Times New Roman" w:hint="eastAsia"/>
+          <w:rFonts w:ascii="Times New Roman" w:eastAsia="SimSun" w:hAnsi="Times New Roman" w:hint="eastAsia"/>
         </w:rPr>
         <w:t>）</w:t>
       </w:r>
       <w:r>
         <w:rPr>
-          <w:rFonts w:ascii="Times New Roman" w:eastAsia="宋体" w:hAnsi="Times New Roman" w:hint="eastAsia"/>
+          <w:rFonts w:ascii="Times New Roman" w:eastAsia="SimSun" w:hAnsi="Times New Roman" w:hint="eastAsia"/>
         </w:rPr>
         <w:t>QGIS</w:t>
       </w:r>
       <w:r>
         <w:rPr>
-          <w:rFonts w:ascii="Times New Roman" w:eastAsia="宋体" w:hAnsi="Times New Roman" w:hint="eastAsia"/>
+          <w:rFonts w:ascii="Times New Roman" w:eastAsia="SimSun" w:hAnsi="Times New Roman" w:hint="eastAsia"/>
         </w:rPr>
         <w:t>计算最快</w:t>
       </w:r>
       <w:r>
         <w:rPr>
-          <w:rFonts w:ascii="Times New Roman" w:eastAsia="宋体" w:hAnsi="Times New Roman" w:hint="eastAsia"/>
+          <w:rFonts w:ascii="Times New Roman" w:eastAsia="SimSun" w:hAnsi="Times New Roman" w:hint="eastAsia"/>
         </w:rPr>
         <w:t>时间</w:t>
       </w:r>
       <w:r>
         <w:rPr>
-          <w:rFonts w:ascii="Times New Roman" w:eastAsia="宋体" w:hAnsi="Times New Roman" w:hint="eastAsia"/>
+          <w:rFonts w:ascii="Times New Roman" w:eastAsia="SimSun" w:hAnsi="Times New Roman" w:hint="eastAsia"/>
         </w:rPr>
         <w:t>很慢（一次近</w:t>
       </w:r>
       <w:r>
         <w:rPr>
-          <w:rFonts w:ascii="Times New Roman" w:eastAsia="宋体" w:hAnsi="Times New Roman" w:hint="eastAsia"/>
+          <w:rFonts w:ascii="Times New Roman" w:eastAsia="SimSun" w:hAnsi="Times New Roman" w:hint="eastAsia"/>
         </w:rPr>
         <w:t>1h</w:t>
       </w:r>
       <w:r>
         <w:rPr>
-          <w:rFonts w:ascii="Times New Roman" w:eastAsia="宋体" w:hAnsi="Times New Roman" w:hint="eastAsia"/>
+          <w:rFonts w:ascii="Times New Roman" w:eastAsia="SimSun" w:hAnsi="Times New Roman" w:hint="eastAsia"/>
         </w:rPr>
         <w:t>），且总有一些“企业</w:t>
       </w:r>
       <w:r>
         <w:rPr>
-          <w:rFonts w:ascii="Times New Roman" w:eastAsia="宋体" w:hAnsi="Times New Roman" w:hint="eastAsia"/>
+          <w:rFonts w:ascii="Times New Roman" w:eastAsia="SimSun" w:hAnsi="Times New Roman" w:hint="eastAsia"/>
         </w:rPr>
         <w:t>-</w:t>
       </w:r>
       <w:r>
         <w:rPr>
-          <w:rFonts w:ascii="Times New Roman" w:eastAsia="宋体" w:hAnsi="Times New Roman" w:hint="eastAsia"/>
+          <w:rFonts w:ascii="Times New Roman" w:eastAsia="SimSun" w:hAnsi="Times New Roman" w:hint="eastAsia"/>
         </w:rPr>
         <w:t>政府”算不出来；换用了</w:t>
       </w:r>
       <w:r>
         <w:rPr>
-          <w:rFonts w:ascii="Times New Roman" w:eastAsia="宋体" w:hAnsi="Times New Roman" w:hint="eastAsia"/>
+          <w:rFonts w:ascii="Times New Roman" w:eastAsia="SimSun" w:hAnsi="Times New Roman" w:hint="eastAsia"/>
         </w:rPr>
         <w:t>Python</w:t>
       </w:r>
       <w:r>
         <w:rPr>
-          <w:rFonts w:ascii="Times New Roman" w:eastAsia="宋体" w:hAnsi="Times New Roman" w:hint="eastAsia"/>
+          <w:rFonts w:ascii="Times New Roman" w:eastAsia="SimSun" w:hAnsi="Times New Roman" w:hint="eastAsia"/>
         </w:rPr>
         <w:t>计算，几秒钟就能出结果</w:t>
       </w:r>
       <w:r>
         <w:rPr>
-          <w:rFonts w:ascii="Times New Roman" w:eastAsia="宋体" w:hAnsi="Times New Roman" w:hint="eastAsia"/>
+          <w:rFonts w:ascii="Times New Roman" w:eastAsia="SimSun" w:hAnsi="Times New Roman" w:hint="eastAsia"/>
         </w:rPr>
         <w:t>，且没有缺失。</w:t>
       </w:r>
       <w:r>
         <w:rPr>
-          <w:rFonts w:ascii="Times New Roman" w:eastAsia="宋体" w:hAnsi="Times New Roman" w:hint="eastAsia"/>
+          <w:rFonts w:ascii="Times New Roman" w:eastAsia="SimSun" w:hAnsi="Times New Roman" w:hint="eastAsia"/>
         </w:rPr>
         <w:t>QGIS</w:t>
       </w:r>
       <w:r>
         <w:rPr>
-          <w:rFonts w:ascii="Times New Roman" w:eastAsia="宋体" w:hAnsi="Times New Roman" w:hint="eastAsia"/>
+          <w:rFonts w:ascii="Times New Roman" w:eastAsia="SimSun" w:hAnsi="Times New Roman" w:hint="eastAsia"/>
         </w:rPr>
         <w:t>和</w:t>
       </w:r>
       <w:r>
         <w:rPr>
-          <w:rFonts w:ascii="Times New Roman" w:eastAsia="宋体" w:hAnsi="Times New Roman" w:hint="eastAsia"/>
+          <w:rFonts w:ascii="Times New Roman" w:eastAsia="SimSun" w:hAnsi="Times New Roman" w:hint="eastAsia"/>
         </w:rPr>
         <w:t>Python</w:t>
       </w:r>
       <w:r>
         <w:rPr>
-          <w:rFonts w:ascii="Times New Roman" w:eastAsia="宋体" w:hAnsi="Times New Roman" w:hint="eastAsia"/>
+          <w:rFonts w:ascii="Times New Roman" w:eastAsia="SimSun" w:hAnsi="Times New Roman" w:hint="eastAsia"/>
         </w:rPr>
         <w:t>结果差别</w:t>
       </w:r>
       <w:r>
         <w:rPr>
-          <w:rFonts w:ascii="Times New Roman" w:eastAsia="宋体" w:hAnsi="Times New Roman" w:hint="eastAsia"/>
+          <w:rFonts w:ascii="Times New Roman" w:eastAsia="SimSun" w:hAnsi="Times New Roman" w:hint="eastAsia"/>
         </w:rPr>
         <w:t>不大</w:t>
       </w:r>
       <w:r>
         <w:rPr>
-          <w:rFonts w:ascii="Times New Roman" w:eastAsia="宋体" w:hAnsi="Times New Roman" w:hint="eastAsia"/>
+          <w:rFonts w:ascii="Times New Roman" w:eastAsia="SimSun" w:hAnsi="Times New Roman" w:hint="eastAsia"/>
         </w:rPr>
         <w:t>，相关性</w:t>
       </w:r>
       <w:r>
         <w:rPr>
-          <w:rFonts w:ascii="Times New Roman" w:eastAsia="宋体" w:hAnsi="Times New Roman" w:hint="eastAsia"/>
+          <w:rFonts w:ascii="Times New Roman" w:eastAsia="SimSun" w:hAnsi="Times New Roman" w:hint="eastAsia"/>
         </w:rPr>
         <w:t>0.97</w:t>
       </w:r>
       <w:r>
         <w:rPr>
-          <w:rFonts w:ascii="Times New Roman" w:eastAsia="宋体" w:hAnsi="Times New Roman" w:hint="eastAsia"/>
+          <w:rFonts w:ascii="Times New Roman" w:eastAsia="SimSun" w:hAnsi="Times New Roman" w:hint="eastAsia"/>
         </w:rPr>
         <w:t>+</w:t>
       </w:r>
       <w:r>
         <w:rPr>
-          <w:rFonts w:ascii="Times New Roman" w:eastAsia="宋体" w:hAnsi="Times New Roman" w:hint="eastAsia"/>
+          <w:rFonts w:ascii="Times New Roman" w:eastAsia="SimSun" w:hAnsi="Times New Roman" w:hint="eastAsia"/>
         </w:rPr>
         <w:t>；</w:t>
       </w:r>
@@ -235,84 +237,84 @@
     <w:p>
       <w:pPr>
         <w:rPr>
-          <w:rFonts w:ascii="Times New Roman" w:eastAsia="宋体" w:hAnsi="Times New Roman"/>
+          <w:rFonts w:ascii="Times New Roman" w:eastAsia="SimSun" w:hAnsi="Times New Roman"/>
         </w:rPr>
       </w:pPr>
       <w:r>
         <w:rPr>
-          <w:rFonts w:ascii="Times New Roman" w:eastAsia="宋体" w:hAnsi="Times New Roman" w:hint="eastAsia"/>
+          <w:rFonts w:ascii="Times New Roman" w:eastAsia="SimSun" w:hAnsi="Times New Roman" w:hint="eastAsia"/>
         </w:rPr>
         <w:t>3</w:t>
       </w:r>
       <w:r>
         <w:rPr>
-          <w:rFonts w:ascii="Times New Roman" w:eastAsia="宋体" w:hAnsi="Times New Roman" w:hint="eastAsia"/>
+          <w:rFonts w:ascii="Times New Roman" w:eastAsia="SimSun" w:hAnsi="Times New Roman" w:hint="eastAsia"/>
         </w:rPr>
         <w:t>、</w:t>
       </w:r>
       <w:r>
         <w:rPr>
-          <w:rFonts w:ascii="Times New Roman" w:eastAsia="宋体" w:hAnsi="Times New Roman" w:hint="eastAsia"/>
+          <w:rFonts w:ascii="Times New Roman" w:eastAsia="SimSun" w:hAnsi="Times New Roman" w:hint="eastAsia"/>
         </w:rPr>
         <w:t>回归：</w:t>
       </w:r>
       <w:r>
         <w:rPr>
-          <w:rFonts w:ascii="Times New Roman" w:eastAsia="宋体" w:hAnsi="Times New Roman" w:hint="eastAsia"/>
+          <w:rFonts w:ascii="Times New Roman" w:eastAsia="SimSun" w:hAnsi="Times New Roman" w:hint="eastAsia"/>
         </w:rPr>
         <w:t>用新数据跑了对</w:t>
       </w:r>
       <w:r>
         <w:rPr>
-          <w:rFonts w:ascii="Times New Roman" w:eastAsia="宋体" w:hAnsi="Times New Roman" w:hint="eastAsia"/>
+          <w:rFonts w:ascii="Times New Roman" w:eastAsia="SimSun" w:hAnsi="Times New Roman" w:hint="eastAsia"/>
         </w:rPr>
         <w:t>employ</w:t>
       </w:r>
       <w:r>
         <w:rPr>
-          <w:rFonts w:ascii="Times New Roman" w:eastAsia="宋体" w:hAnsi="Times New Roman" w:hint="eastAsia"/>
+          <w:rFonts w:ascii="Times New Roman" w:eastAsia="SimSun" w:hAnsi="Times New Roman" w:hint="eastAsia"/>
         </w:rPr>
         <w:t>、</w:t>
       </w:r>
       <w:r>
         <w:rPr>
-          <w:rFonts w:ascii="Times New Roman" w:eastAsia="宋体" w:hAnsi="Times New Roman" w:hint="eastAsia"/>
+          <w:rFonts w:ascii="Times New Roman" w:eastAsia="SimSun" w:hAnsi="Times New Roman" w:hint="eastAsia"/>
         </w:rPr>
         <w:t>markdown</w:t>
       </w:r>
       <w:r>
         <w:rPr>
-          <w:rFonts w:ascii="Times New Roman" w:eastAsia="宋体" w:hAnsi="Times New Roman" w:hint="eastAsia"/>
+          <w:rFonts w:ascii="Times New Roman" w:eastAsia="SimSun" w:hAnsi="Times New Roman" w:hint="eastAsia"/>
         </w:rPr>
         <w:t>、</w:t>
       </w:r>
       <w:r>
         <w:rPr>
-          <w:rFonts w:ascii="Times New Roman" w:eastAsia="宋体" w:hAnsi="Times New Roman" w:hint="eastAsia"/>
+          <w:rFonts w:ascii="Times New Roman" w:eastAsia="SimSun" w:hAnsi="Times New Roman" w:hint="eastAsia"/>
         </w:rPr>
         <w:t>wage</w:t>
       </w:r>
       <w:r>
         <w:rPr>
-          <w:rFonts w:ascii="Times New Roman" w:eastAsia="宋体" w:hAnsi="Times New Roman" w:hint="eastAsia"/>
+          <w:rFonts w:ascii="Times New Roman" w:eastAsia="SimSun" w:hAnsi="Times New Roman" w:hint="eastAsia"/>
         </w:rPr>
         <w:t>的影响，</w:t>
       </w:r>
       <w:r>
         <w:rPr>
-          <w:rFonts w:ascii="Times New Roman" w:eastAsia="宋体" w:hAnsi="Times New Roman" w:hint="eastAsia"/>
+          <w:rFonts w:ascii="Times New Roman" w:eastAsia="SimSun" w:hAnsi="Times New Roman" w:hint="eastAsia"/>
         </w:rPr>
         <w:t>labor reallocation</w:t>
       </w:r>
       <w:r>
         <w:rPr>
-          <w:rFonts w:ascii="Times New Roman" w:eastAsia="宋体" w:hAnsi="Times New Roman" w:hint="eastAsia"/>
+          <w:rFonts w:ascii="Times New Roman" w:eastAsia="SimSun" w:hAnsi="Times New Roman" w:hint="eastAsia"/>
         </w:rPr>
         <w:t>依然稳健</w:t>
       </w:r>
       <w:r>
         <w:rPr>
-          <w:rFonts w:ascii="Times New Roman" w:eastAsia="宋体" w:hAnsi="Times New Roman" w:hint="eastAsia"/>
+          <w:rFonts w:ascii="Times New Roman" w:eastAsia="SimSun" w:hAnsi="Times New Roman" w:hint="eastAsia"/>
         </w:rPr>
         <w:t>；</w:t>
       </w:r>
@@ -320,109 +322,111 @@
     <w:p>
       <w:pPr>
         <w:rPr>
-          <w:rFonts w:ascii="Times New Roman" w:eastAsia="宋体" w:hAnsi="Times New Roman"/>
+          <w:rFonts w:ascii="Times New Roman" w:eastAsia="SimSun" w:hAnsi="Times New Roman"/>
           <w:iCs/>
         </w:rPr>
       </w:pPr>
       <w:r>
         <w:rPr>
-          <w:rFonts w:ascii="Times New Roman" w:eastAsia="宋体" w:hAnsi="Times New Roman" w:hint="eastAsia"/>
+          <w:rFonts w:ascii="Times New Roman" w:eastAsia="SimSun" w:hAnsi="Times New Roman" w:hint="eastAsia"/>
         </w:rPr>
         <w:t>4</w:t>
       </w:r>
       <w:r>
         <w:rPr>
-          <w:rFonts w:ascii="Times New Roman" w:eastAsia="宋体" w:hAnsi="Times New Roman" w:hint="eastAsia"/>
+          <w:rFonts w:ascii="Times New Roman" w:eastAsia="SimSun" w:hAnsi="Times New Roman" w:hint="eastAsia"/>
         </w:rPr>
         <w:t>、</w:t>
       </w:r>
       <w:r>
         <w:rPr>
-          <w:rFonts w:ascii="Times New Roman" w:eastAsia="宋体" w:hAnsi="Times New Roman" w:hint="eastAsia"/>
+          <w:rFonts w:ascii="Times New Roman" w:eastAsia="SimSun" w:hAnsi="Times New Roman" w:hint="eastAsia"/>
         </w:rPr>
         <w:t>模型：</w:t>
       </w:r>
       <w:r>
         <w:rPr>
-          <w:rFonts w:ascii="Times New Roman" w:eastAsia="宋体" w:hAnsi="Times New Roman" w:hint="eastAsia"/>
+          <w:rFonts w:ascii="Times New Roman" w:eastAsia="SimSun" w:hAnsi="Times New Roman" w:hint="eastAsia"/>
         </w:rPr>
         <w:t>（</w:t>
       </w:r>
       <w:r>
         <w:rPr>
-          <w:rFonts w:ascii="Times New Roman" w:eastAsia="宋体" w:hAnsi="Times New Roman" w:hint="eastAsia"/>
+          <w:rFonts w:ascii="Times New Roman" w:eastAsia="SimSun" w:hAnsi="Times New Roman" w:hint="eastAsia"/>
         </w:rPr>
         <w:t>1</w:t>
       </w:r>
       <w:r>
         <w:rPr>
-          <w:rFonts w:ascii="Times New Roman" w:eastAsia="宋体" w:hAnsi="Times New Roman" w:hint="eastAsia"/>
+          <w:rFonts w:ascii="Times New Roman" w:eastAsia="SimSun" w:hAnsi="Times New Roman" w:hint="eastAsia"/>
         </w:rPr>
         <w:t>）</w:t>
       </w:r>
       <w:r>
         <w:rPr>
-          <w:rFonts w:ascii="Times New Roman" w:eastAsia="宋体" w:hAnsi="Times New Roman" w:hint="eastAsia"/>
+          <w:rFonts w:ascii="Times New Roman" w:eastAsia="SimSun" w:hAnsi="Times New Roman" w:hint="eastAsia"/>
         </w:rPr>
         <w:t>估计企业生产率使用</w:t>
       </w:r>
       <w:r>
         <w:rPr>
-          <w:rFonts w:ascii="Times New Roman" w:eastAsia="宋体" w:hAnsi="Times New Roman" w:hint="eastAsia"/>
+          <w:rFonts w:ascii="Times New Roman" w:eastAsia="SimSun" w:hAnsi="Times New Roman" w:hint="eastAsia"/>
         </w:rPr>
         <w:t>revenue</w:t>
       </w:r>
       <w:r>
         <w:rPr>
-          <w:rFonts w:ascii="Times New Roman" w:eastAsia="宋体" w:hAnsi="Times New Roman" w:hint="eastAsia"/>
+          <w:rFonts w:ascii="Times New Roman" w:eastAsia="SimSun" w:hAnsi="Times New Roman" w:hint="eastAsia"/>
         </w:rPr>
         <w:t>对</w:t>
       </w:r>
       <w:r>
         <w:rPr>
-          <w:rFonts w:ascii="Times New Roman" w:eastAsia="宋体" w:hAnsi="Times New Roman" w:hint="eastAsia"/>
+          <w:rFonts w:ascii="Times New Roman" w:eastAsia="SimSun" w:hAnsi="Times New Roman" w:hint="eastAsia"/>
         </w:rPr>
         <w:t>labor</w:t>
       </w:r>
       <w:r>
         <w:rPr>
-          <w:rFonts w:ascii="Times New Roman" w:eastAsia="宋体" w:hAnsi="Times New Roman" w:hint="eastAsia"/>
+          <w:rFonts w:ascii="Times New Roman" w:eastAsia="SimSun" w:hAnsi="Times New Roman" w:hint="eastAsia"/>
         </w:rPr>
         <w:t>回归，之前是对</w:t>
       </w:r>
-      <w:r>
-        <w:rPr>
-          <w:rFonts w:ascii="Times New Roman" w:eastAsia="宋体" w:hAnsi="Times New Roman" w:hint="eastAsia"/>
+      <w:proofErr w:type="spellStart"/>
+      <w:r>
+        <w:rPr>
+          <w:rFonts w:ascii="Times New Roman" w:eastAsia="SimSun" w:hAnsi="Times New Roman" w:hint="eastAsia"/>
         </w:rPr>
         <w:t>total_wage</w:t>
       </w:r>
-      <w:r>
-        <w:rPr>
-          <w:rFonts w:ascii="Times New Roman" w:eastAsia="宋体" w:hAnsi="Times New Roman" w:hint="eastAsia"/>
+      <w:proofErr w:type="spellEnd"/>
+      <w:r>
+        <w:rPr>
+          <w:rFonts w:ascii="Times New Roman" w:eastAsia="SimSun" w:hAnsi="Times New Roman" w:hint="eastAsia"/>
         </w:rPr>
         <w:t>回归；</w:t>
       </w:r>
       <w:r>
         <w:rPr>
-          <w:rFonts w:ascii="Times New Roman" w:eastAsia="宋体" w:hAnsi="Times New Roman" w:hint="eastAsia"/>
+          <w:rFonts w:ascii="Times New Roman" w:eastAsia="SimSun" w:hAnsi="Times New Roman" w:hint="eastAsia"/>
         </w:rPr>
         <w:t>（</w:t>
       </w:r>
       <w:r>
         <w:rPr>
-          <w:rFonts w:ascii="Times New Roman" w:eastAsia="宋体" w:hAnsi="Times New Roman" w:hint="eastAsia"/>
+          <w:rFonts w:ascii="Times New Roman" w:eastAsia="SimSun" w:hAnsi="Times New Roman" w:hint="eastAsia"/>
         </w:rPr>
         <w:t>2</w:t>
       </w:r>
       <w:r>
         <w:rPr>
-          <w:rFonts w:ascii="Times New Roman" w:eastAsia="宋体" w:hAnsi="Times New Roman" w:hint="eastAsia"/>
+          <w:rFonts w:ascii="Times New Roman" w:eastAsia="SimSun" w:hAnsi="Times New Roman" w:hint="eastAsia"/>
         </w:rPr>
         <w:t>）</w:t>
       </w:r>
       <w:r>
         <w:rPr>
-          <w:rFonts w:ascii="Times New Roman" w:eastAsia="宋体" w:hAnsi="Times New Roman" w:hint="eastAsia"/>
+          <w:rFonts w:ascii="Times New Roman" w:eastAsia="SimSun" w:hAnsi="Times New Roman" w:hint="eastAsia"/>
         </w:rPr>
         <w:t>为使数据的回归系数与模型可比，换用了</w:t>
       </w:r>
@@ -431,7 +435,7 @@
           <m:funcPr>
             <m:ctrlPr>
               <w:rPr>
-                <w:rFonts w:ascii="Cambria Math" w:eastAsia="宋体" w:hAnsi="Cambria Math"/>
+                <w:rFonts w:ascii="Cambria Math" w:eastAsia="SimSun" w:hAnsi="Cambria Math"/>
                 <w:i/>
                 <w:iCs/>
               </w:rPr>
@@ -443,7 +447,7 @@
                 <m:sty m:val="p"/>
               </m:rPr>
               <w:rPr>
-                <w:rFonts w:ascii="Cambria Math" w:eastAsia="宋体" w:hAnsi="Cambria Math"/>
+                <w:rFonts w:ascii="Cambria Math" w:eastAsia="SimSun" w:hAnsi="Cambria Math"/>
               </w:rPr>
               <m:t>ln</m:t>
             </m:r>
@@ -453,7 +457,7 @@
               <m:sSubPr>
                 <m:ctrlPr>
                   <w:rPr>
-                    <w:rFonts w:ascii="Cambria Math" w:eastAsia="宋体" w:hAnsi="Cambria Math"/>
+                    <w:rFonts w:ascii="Cambria Math" w:eastAsia="SimSun" w:hAnsi="Cambria Math"/>
                     <w:i/>
                     <w:iCs/>
                   </w:rPr>
@@ -462,7 +466,7 @@
               <m:e>
                 <m:r>
                   <w:rPr>
-                    <w:rFonts w:ascii="Cambria Math" w:eastAsia="宋体" w:hAnsi="Cambria Math"/>
+                    <w:rFonts w:ascii="Cambria Math" w:eastAsia="SimSun" w:hAnsi="Cambria Math"/>
                   </w:rPr>
                   <m:t>w</m:t>
                 </m:r>
@@ -470,7 +474,7 @@
               <m:sub>
                 <m:r>
                   <w:rPr>
-                    <w:rFonts w:ascii="Cambria Math" w:eastAsia="宋体" w:hAnsi="Cambria Math"/>
+                    <w:rFonts w:ascii="Cambria Math" w:eastAsia="SimSun" w:hAnsi="Cambria Math"/>
                   </w:rPr>
                   <m:t>i0</m:t>
                 </m:r>
@@ -480,7 +484,7 @@
         </m:func>
         <m:r>
           <w:rPr>
-            <w:rFonts w:ascii="Cambria Math" w:eastAsia="宋体" w:hAnsi="Cambria Math"/>
+            <w:rFonts w:ascii="Cambria Math" w:eastAsia="SimSun" w:hAnsi="Cambria Math"/>
           </w:rPr>
           <m:t>-</m:t>
         </m:r>
@@ -489,7 +493,7 @@
             <m:chr m:val="̅"/>
             <m:ctrlPr>
               <w:rPr>
-                <w:rFonts w:ascii="Cambria Math" w:eastAsia="宋体" w:hAnsi="Cambria Math"/>
+                <w:rFonts w:ascii="Cambria Math" w:eastAsia="SimSun" w:hAnsi="Cambria Math"/>
                 <w:i/>
                 <w:iCs/>
               </w:rPr>
@@ -500,7 +504,7 @@
               <m:sSubPr>
                 <m:ctrlPr>
                   <w:rPr>
-                    <w:rFonts w:ascii="Cambria Math" w:eastAsia="宋体" w:hAnsi="Cambria Math"/>
+                    <w:rFonts w:ascii="Cambria Math" w:eastAsia="SimSun" w:hAnsi="Cambria Math"/>
                     <w:i/>
                     <w:iCs/>
                   </w:rPr>
@@ -511,7 +515,7 @@
                   <m:funcPr>
                     <m:ctrlPr>
                       <w:rPr>
-                        <w:rFonts w:ascii="Cambria Math" w:eastAsia="宋体" w:hAnsi="Cambria Math"/>
+                        <w:rFonts w:ascii="Cambria Math" w:eastAsia="SimSun" w:hAnsi="Cambria Math"/>
                         <w:i/>
                         <w:iCs/>
                       </w:rPr>
@@ -523,7 +527,7 @@
                         <m:sty m:val="p"/>
                       </m:rPr>
                       <w:rPr>
-                        <w:rFonts w:ascii="Cambria Math" w:eastAsia="宋体" w:hAnsi="Cambria Math"/>
+                        <w:rFonts w:ascii="Cambria Math" w:eastAsia="SimSun" w:hAnsi="Cambria Math"/>
                       </w:rPr>
                       <m:t>ln</m:t>
                     </m:r>
@@ -531,7 +535,7 @@
                   <m:e>
                     <m:r>
                       <w:rPr>
-                        <w:rFonts w:ascii="Cambria Math" w:eastAsia="宋体" w:hAnsi="Cambria Math"/>
+                        <w:rFonts w:ascii="Cambria Math" w:eastAsia="SimSun" w:hAnsi="Cambria Math"/>
                       </w:rPr>
                       <m:t>w</m:t>
                     </m:r>
@@ -541,7 +545,7 @@
               <m:sub>
                 <m:r>
                   <w:rPr>
-                    <w:rFonts w:ascii="Cambria Math" w:eastAsia="宋体" w:hAnsi="Cambria Math"/>
+                    <w:rFonts w:ascii="Cambria Math" w:eastAsia="SimSun" w:hAnsi="Cambria Math"/>
                   </w:rPr>
                   <m:t>0</m:t>
                 </m:r>
@@ -552,7 +556,7 @@
       </m:oMath>
       <w:r>
         <w:rPr>
-          <w:rFonts w:ascii="Times New Roman" w:eastAsia="宋体" w:hAnsi="Times New Roman" w:hint="eastAsia"/>
+          <w:rFonts w:ascii="Times New Roman" w:eastAsia="SimSun" w:hAnsi="Times New Roman" w:hint="eastAsia"/>
           <w:iCs/>
         </w:rPr>
         <w:t>，</w:t>
@@ -563,7 +567,7 @@
             <m:chr m:val="̅"/>
             <m:ctrlPr>
               <w:rPr>
-                <w:rFonts w:ascii="Cambria Math" w:eastAsia="宋体" w:hAnsi="Cambria Math"/>
+                <w:rFonts w:ascii="Cambria Math" w:eastAsia="SimSun" w:hAnsi="Cambria Math"/>
                 <w:i/>
                 <w:iCs/>
               </w:rPr>
@@ -574,7 +578,7 @@
               <m:sSubPr>
                 <m:ctrlPr>
                   <w:rPr>
-                    <w:rFonts w:ascii="Cambria Math" w:eastAsia="宋体" w:hAnsi="Cambria Math"/>
+                    <w:rFonts w:ascii="Cambria Math" w:eastAsia="SimSun" w:hAnsi="Cambria Math"/>
                     <w:i/>
                     <w:iCs/>
                   </w:rPr>
@@ -585,7 +589,7 @@
                   <m:funcPr>
                     <m:ctrlPr>
                       <w:rPr>
-                        <w:rFonts w:ascii="Cambria Math" w:eastAsia="宋体" w:hAnsi="Cambria Math"/>
+                        <w:rFonts w:ascii="Cambria Math" w:eastAsia="SimSun" w:hAnsi="Cambria Math"/>
                         <w:i/>
                         <w:iCs/>
                       </w:rPr>
@@ -597,7 +601,7 @@
                         <m:sty m:val="p"/>
                       </m:rPr>
                       <w:rPr>
-                        <w:rFonts w:ascii="Cambria Math" w:eastAsia="宋体" w:hAnsi="Cambria Math"/>
+                        <w:rFonts w:ascii="Cambria Math" w:eastAsia="SimSun" w:hAnsi="Cambria Math"/>
                       </w:rPr>
                       <m:t>ln</m:t>
                     </m:r>
@@ -605,7 +609,7 @@
                   <m:e>
                     <m:r>
                       <w:rPr>
-                        <w:rFonts w:ascii="Cambria Math" w:eastAsia="宋体" w:hAnsi="Cambria Math"/>
+                        <w:rFonts w:ascii="Cambria Math" w:eastAsia="SimSun" w:hAnsi="Cambria Math"/>
                       </w:rPr>
                       <m:t>w</m:t>
                     </m:r>
@@ -615,7 +619,7 @@
               <m:sub>
                 <m:r>
                   <w:rPr>
-                    <w:rFonts w:ascii="Cambria Math" w:eastAsia="宋体" w:hAnsi="Cambria Math"/>
+                    <w:rFonts w:ascii="Cambria Math" w:eastAsia="SimSun" w:hAnsi="Cambria Math"/>
                   </w:rPr>
                   <m:t>0</m:t>
                 </m:r>
@@ -626,49 +630,49 @@
       </m:oMath>
       <w:r>
         <w:rPr>
-          <w:rFonts w:ascii="Times New Roman" w:eastAsia="宋体" w:hAnsi="Times New Roman" w:hint="eastAsia"/>
+          <w:rFonts w:ascii="Times New Roman" w:eastAsia="SimSun" w:hAnsi="Times New Roman" w:hint="eastAsia"/>
           <w:iCs/>
         </w:rPr>
         <w:t>为处理组初始</w:t>
       </w:r>
       <w:r>
         <w:rPr>
-          <w:rFonts w:ascii="Times New Roman" w:eastAsia="宋体" w:hAnsi="Times New Roman" w:hint="eastAsia"/>
+          <w:rFonts w:ascii="Times New Roman" w:eastAsia="SimSun" w:hAnsi="Times New Roman" w:hint="eastAsia"/>
           <w:iCs/>
         </w:rPr>
         <w:t>人均</w:t>
       </w:r>
       <w:r>
         <w:rPr>
-          <w:rFonts w:ascii="Times New Roman" w:eastAsia="宋体" w:hAnsi="Times New Roman" w:hint="eastAsia"/>
+          <w:rFonts w:ascii="Times New Roman" w:eastAsia="SimSun" w:hAnsi="Times New Roman" w:hint="eastAsia"/>
           <w:iCs/>
         </w:rPr>
         <w:t>工资。</w:t>
       </w:r>
       <w:r>
         <w:rPr>
-          <w:rFonts w:ascii="Times New Roman" w:eastAsia="宋体" w:hAnsi="Times New Roman" w:hint="eastAsia"/>
+          <w:rFonts w:ascii="Times New Roman" w:eastAsia="SimSun" w:hAnsi="Times New Roman" w:hint="eastAsia"/>
           <w:iCs/>
         </w:rPr>
         <w:t>Reallocation</w:t>
       </w:r>
       <w:r>
         <w:rPr>
-          <w:rFonts w:ascii="Times New Roman" w:eastAsia="宋体" w:hAnsi="Times New Roman" w:hint="eastAsia"/>
+          <w:rFonts w:ascii="Times New Roman" w:eastAsia="SimSun" w:hAnsi="Times New Roman" w:hint="eastAsia"/>
           <w:iCs/>
         </w:rPr>
         <w:t xml:space="preserve"> pattern</w:t>
       </w:r>
       <w:r>
         <w:rPr>
-          <w:rFonts w:ascii="Times New Roman" w:eastAsia="宋体" w:hAnsi="Times New Roman" w:hint="eastAsia"/>
+          <w:rFonts w:ascii="Times New Roman" w:eastAsia="SimSun" w:hAnsi="Times New Roman" w:hint="eastAsia"/>
           <w:iCs/>
         </w:rPr>
         <w:t>仍然存在</w:t>
       </w:r>
       <w:r>
         <w:rPr>
-          <w:rFonts w:ascii="Times New Roman" w:eastAsia="宋体" w:hAnsi="Times New Roman" w:hint="eastAsia"/>
+          <w:rFonts w:ascii="Times New Roman" w:eastAsia="SimSun" w:hAnsi="Times New Roman" w:hint="eastAsia"/>
           <w:iCs/>
         </w:rPr>
         <w:t>。</w:t>
@@ -677,21 +681,21 @@
     <w:p>
       <w:pPr>
         <w:rPr>
-          <w:rFonts w:ascii="Times New Roman" w:eastAsia="宋体" w:hAnsi="Times New Roman"/>
+          <w:rFonts w:ascii="Times New Roman" w:eastAsia="SimSun" w:hAnsi="Times New Roman"/>
         </w:rPr>
       </w:pPr>
     </w:p>
     <w:p>
       <w:pPr>
         <w:rPr>
-          <w:rFonts w:ascii="Times New Roman" w:eastAsia="宋体" w:hAnsi="Times New Roman"/>
+          <w:rFonts w:ascii="Times New Roman" w:eastAsia="SimSun" w:hAnsi="Times New Roman"/>
           <w:b/>
           <w:bCs/>
         </w:rPr>
       </w:pPr>
       <w:r>
         <w:rPr>
-          <w:rFonts w:ascii="Times New Roman" w:eastAsia="宋体" w:hAnsi="Times New Roman" w:hint="eastAsia"/>
+          <w:rFonts w:ascii="Times New Roman" w:eastAsia="SimSun" w:hAnsi="Times New Roman" w:hint="eastAsia"/>
           <w:b/>
           <w:bCs/>
         </w:rPr>
@@ -699,7 +703,7 @@
       </w:r>
       <w:r>
         <w:rPr>
-          <w:rFonts w:ascii="Times New Roman" w:eastAsia="宋体" w:hAnsi="Times New Roman" w:hint="eastAsia"/>
+          <w:rFonts w:ascii="Times New Roman" w:eastAsia="SimSun" w:hAnsi="Times New Roman" w:hint="eastAsia"/>
           <w:b/>
           <w:bCs/>
         </w:rPr>
@@ -707,7 +711,7 @@
       </w:r>
       <w:r>
         <w:rPr>
-          <w:rFonts w:ascii="Times New Roman" w:eastAsia="宋体" w:hAnsi="Times New Roman" w:hint="eastAsia"/>
+          <w:rFonts w:ascii="Times New Roman" w:eastAsia="SimSun" w:hAnsi="Times New Roman" w:hint="eastAsia"/>
           <w:b/>
           <w:bCs/>
         </w:rPr>
@@ -715,7 +719,7 @@
       </w:r>
       <w:r>
         <w:rPr>
-          <w:rFonts w:ascii="Times New Roman" w:eastAsia="宋体" w:hAnsi="Times New Roman" w:hint="eastAsia"/>
+          <w:rFonts w:ascii="Times New Roman" w:eastAsia="SimSun" w:hAnsi="Times New Roman" w:hint="eastAsia"/>
           <w:b/>
           <w:bCs/>
         </w:rPr>
@@ -723,7 +727,7 @@
       </w:r>
       <w:r>
         <w:rPr>
-          <w:rFonts w:ascii="Times New Roman" w:eastAsia="宋体" w:hAnsi="Times New Roman" w:hint="eastAsia"/>
+          <w:rFonts w:ascii="Times New Roman" w:eastAsia="SimSun" w:hAnsi="Times New Roman" w:hint="eastAsia"/>
           <w:b/>
           <w:bCs/>
         </w:rPr>
@@ -733,7 +737,7 @@
     <w:p>
       <w:pPr>
         <w:rPr>
-          <w:rFonts w:ascii="Times New Roman" w:eastAsia="宋体" w:hAnsi="Times New Roman"/>
+          <w:rFonts w:ascii="Times New Roman" w:eastAsia="SimSun" w:hAnsi="Times New Roman"/>
           <w:b/>
           <w:bCs/>
         </w:rPr>
@@ -742,14 +746,14 @@
     <w:p>
       <w:pPr>
         <w:rPr>
-          <w:rFonts w:ascii="Times New Roman" w:eastAsia="宋体" w:hAnsi="Times New Roman"/>
+          <w:rFonts w:ascii="Times New Roman" w:eastAsia="SimSun" w:hAnsi="Times New Roman"/>
           <w:b/>
           <w:bCs/>
         </w:rPr>
       </w:pPr>
       <w:r>
         <w:rPr>
-          <w:rFonts w:ascii="Times New Roman" w:eastAsia="宋体" w:hAnsi="Times New Roman" w:hint="eastAsia"/>
+          <w:rFonts w:ascii="Times New Roman" w:eastAsia="SimSun" w:hAnsi="Times New Roman" w:hint="eastAsia"/>
           <w:b/>
           <w:bCs/>
         </w:rPr>
@@ -759,7 +763,7 @@
     <w:p>
       <w:pPr>
         <w:rPr>
-          <w:rFonts w:ascii="Times New Roman" w:eastAsia="宋体" w:hAnsi="Times New Roman"/>
+          <w:rFonts w:ascii="Times New Roman" w:eastAsia="SimSun" w:hAnsi="Times New Roman"/>
           <w:i/>
         </w:rPr>
       </w:pPr>
@@ -769,7 +773,7 @@
             <m:funcPr>
               <m:ctrlPr>
                 <w:rPr>
-                  <w:rFonts w:ascii="Cambria Math" w:eastAsia="宋体" w:hAnsi="Cambria Math"/>
+                  <w:rFonts w:ascii="Cambria Math" w:eastAsia="SimSun" w:hAnsi="Cambria Math"/>
                   <w:i/>
                 </w:rPr>
               </m:ctrlPr>
@@ -780,7 +784,7 @@
                   <m:sty m:val="p"/>
                 </m:rPr>
                 <w:rPr>
-                  <w:rFonts w:ascii="Cambria Math" w:eastAsia="宋体" w:hAnsi="Cambria Math"/>
+                  <w:rFonts w:ascii="Cambria Math" w:eastAsia="SimSun" w:hAnsi="Cambria Math"/>
                 </w:rPr>
                 <m:t>ln</m:t>
               </m:r>
@@ -790,7 +794,7 @@
                 <m:sSubPr>
                   <m:ctrlPr>
                     <w:rPr>
-                      <w:rFonts w:ascii="Cambria Math" w:eastAsia="宋体" w:hAnsi="Cambria Math"/>
+                      <w:rFonts w:ascii="Cambria Math" w:eastAsia="SimSun" w:hAnsi="Cambria Math"/>
                       <w:i/>
                     </w:rPr>
                   </m:ctrlPr>
@@ -798,7 +802,7 @@
                 <m:e>
                   <m:r>
                     <w:rPr>
-                      <w:rFonts w:ascii="Cambria Math" w:eastAsia="宋体" w:hAnsi="Cambria Math"/>
+                      <w:rFonts w:ascii="Cambria Math" w:eastAsia="SimSun" w:hAnsi="Cambria Math"/>
                     </w:rPr>
                     <m:t>y</m:t>
                   </m:r>
@@ -806,7 +810,7 @@
                 <m:sub>
                   <m:r>
                     <w:rPr>
-                      <w:rFonts w:ascii="Cambria Math" w:eastAsia="宋体" w:hAnsi="Cambria Math"/>
+                      <w:rFonts w:ascii="Cambria Math" w:eastAsia="SimSun" w:hAnsi="Cambria Math"/>
                     </w:rPr>
                     <m:t>it</m:t>
                   </m:r>
@@ -816,7 +820,7 @@
           </m:func>
           <m:r>
             <w:rPr>
-              <w:rFonts w:ascii="Cambria Math" w:eastAsia="宋体" w:hAnsi="Cambria Math"/>
+              <w:rFonts w:ascii="Cambria Math" w:eastAsia="SimSun" w:hAnsi="Cambria Math"/>
             </w:rPr>
             <m:t>=</m:t>
           </m:r>
@@ -826,7 +830,7 @@
               <m:supHide m:val="1"/>
               <m:ctrlPr>
                 <w:rPr>
-                  <w:rFonts w:ascii="Cambria Math" w:eastAsia="宋体" w:hAnsi="Cambria Math"/>
+                  <w:rFonts w:ascii="Cambria Math" w:eastAsia="SimSun" w:hAnsi="Cambria Math"/>
                   <w:i/>
                 </w:rPr>
               </m:ctrlPr>
@@ -834,9 +838,15 @@
             <m:sub>
               <m:r>
                 <w:rPr>
-                  <w:rFonts w:ascii="Cambria Math" w:eastAsia="宋体" w:hAnsi="Cambria Math"/>
+                  <w:rFonts w:ascii="Cambria Math" w:eastAsia="SimSun" w:hAnsi="Cambria Math"/>
                 </w:rPr>
                 <m:t>t</m:t>
+              </m:r>
+              <m:r>
+                <w:rPr>
+                  <w:rFonts w:ascii="Cambria Math" w:eastAsia="SimSun" w:hAnsi="Cambria Math"/>
+                </w:rPr>
+                <m:t>=2008</m:t>
               </m:r>
             </m:sub>
             <m:sup/>
@@ -845,7 +855,7 @@
                 <m:sSubPr>
                   <m:ctrlPr>
                     <w:rPr>
-                      <w:rFonts w:ascii="Cambria Math" w:eastAsia="宋体" w:hAnsi="Cambria Math"/>
+                      <w:rFonts w:ascii="Cambria Math" w:eastAsia="SimSun" w:hAnsi="Cambria Math"/>
                       <w:i/>
                     </w:rPr>
                   </m:ctrlPr>
@@ -853,7 +863,7 @@
                 <m:e>
                   <m:r>
                     <w:rPr>
-                      <w:rFonts w:ascii="Cambria Math" w:eastAsia="宋体" w:hAnsi="Cambria Math"/>
+                      <w:rFonts w:ascii="Cambria Math" w:eastAsia="SimSun" w:hAnsi="Cambria Math"/>
                     </w:rPr>
                     <m:t>β</m:t>
                   </m:r>
@@ -861,7 +871,7 @@
                 <m:sub>
                   <m:r>
                     <w:rPr>
-                      <w:rFonts w:ascii="Cambria Math" w:eastAsia="宋体" w:hAnsi="Cambria Math"/>
+                      <w:rFonts w:ascii="Cambria Math" w:eastAsia="SimSun" w:hAnsi="Cambria Math"/>
                     </w:rPr>
                     <m:t>t</m:t>
                   </m:r>
@@ -869,7 +879,7 @@
               </m:sSub>
               <m:r>
                 <w:rPr>
-                  <w:rFonts w:ascii="Cambria Math" w:eastAsia="宋体" w:hAnsi="Cambria Math"/>
+                  <w:rFonts w:ascii="Cambria Math" w:eastAsia="SimSun" w:hAnsi="Cambria Math"/>
                 </w:rPr>
                 <m:t>BigM</m:t>
               </m:r>
@@ -877,7 +887,7 @@
                 <m:sSubPr>
                   <m:ctrlPr>
                     <w:rPr>
-                      <w:rFonts w:ascii="Cambria Math" w:eastAsia="宋体" w:hAnsi="Cambria Math"/>
+                      <w:rFonts w:ascii="Cambria Math" w:eastAsia="SimSun" w:hAnsi="Cambria Math"/>
                       <w:i/>
                     </w:rPr>
                   </m:ctrlPr>
@@ -885,13 +895,13 @@
                 <m:e>
                   <m:r>
                     <w:rPr>
-                      <w:rFonts w:ascii="Cambria Math" w:eastAsia="宋体" w:hAnsi="Cambria Math" w:hint="eastAsia"/>
+                      <w:rFonts w:ascii="Cambria Math" w:eastAsia="SimSun" w:hAnsi="Cambria Math" w:hint="eastAsia"/>
                     </w:rPr>
                     <m:t>A</m:t>
                   </m:r>
                   <m:ctrlPr>
                     <w:rPr>
-                      <w:rFonts w:ascii="Cambria Math" w:eastAsia="宋体" w:hAnsi="Cambria Math" w:hint="eastAsia"/>
+                      <w:rFonts w:ascii="Cambria Math" w:eastAsia="SimSun" w:hAnsi="Cambria Math" w:hint="eastAsia"/>
                       <w:i/>
                     </w:rPr>
                   </m:ctrlPr>
@@ -899,7 +909,7 @@
                 <m:sub>
                   <m:r>
                     <w:rPr>
-                      <w:rFonts w:ascii="Cambria Math" w:eastAsia="宋体" w:hAnsi="Cambria Math"/>
+                      <w:rFonts w:ascii="Cambria Math" w:eastAsia="SimSun" w:hAnsi="Cambria Math"/>
                     </w:rPr>
                     <m:t>i</m:t>
                   </m:r>
@@ -907,13 +917,13 @@
               </m:sSub>
               <m:r>
                 <w:rPr>
-                  <w:rFonts w:ascii="Cambria Math" w:eastAsia="宋体" w:hAnsi="Cambria Math"/>
+                  <w:rFonts w:ascii="Cambria Math" w:eastAsia="SimSun" w:hAnsi="Cambria Math"/>
                 </w:rPr>
                 <m:t>×</m:t>
               </m:r>
               <m:r>
                 <w:rPr>
-                  <w:rFonts w:ascii="Cambria Math" w:eastAsia="宋体" w:hAnsi="Cambria Math"/>
+                  <w:rFonts w:ascii="Cambria Math" w:eastAsia="SimSun" w:hAnsi="Cambria Math"/>
                 </w:rPr>
                 <m:t>yea</m:t>
               </m:r>
@@ -921,7 +931,7 @@
                 <m:sSubPr>
                   <m:ctrlPr>
                     <w:rPr>
-                      <w:rFonts w:ascii="Cambria Math" w:eastAsia="宋体" w:hAnsi="Cambria Math"/>
+                      <w:rFonts w:ascii="Cambria Math" w:eastAsia="SimSun" w:hAnsi="Cambria Math"/>
                       <w:i/>
                     </w:rPr>
                   </m:ctrlPr>
@@ -929,7 +939,7 @@
                 <m:e>
                   <m:r>
                     <w:rPr>
-                      <w:rFonts w:ascii="Cambria Math" w:eastAsia="宋体" w:hAnsi="Cambria Math"/>
+                      <w:rFonts w:ascii="Cambria Math" w:eastAsia="SimSun" w:hAnsi="Cambria Math"/>
                     </w:rPr>
                     <m:t>r</m:t>
                   </m:r>
@@ -937,7 +947,7 @@
                 <m:sub>
                   <m:r>
                     <w:rPr>
-                      <w:rFonts w:ascii="Cambria Math" w:eastAsia="宋体" w:hAnsi="Cambria Math"/>
+                      <w:rFonts w:ascii="Cambria Math" w:eastAsia="SimSun" w:hAnsi="Cambria Math"/>
                     </w:rPr>
                     <m:t>t</m:t>
                   </m:r>
@@ -945,7 +955,7 @@
               </m:sSub>
               <m:r>
                 <w:rPr>
-                  <w:rFonts w:ascii="Cambria Math" w:eastAsia="宋体" w:hAnsi="Cambria Math"/>
+                  <w:rFonts w:ascii="Cambria Math" w:eastAsia="SimSun" w:hAnsi="Cambria Math"/>
                 </w:rPr>
                 <m:t>+</m:t>
               </m:r>
@@ -953,7 +963,7 @@
                 <m:sSubPr>
                   <m:ctrlPr>
                     <w:rPr>
-                      <w:rFonts w:ascii="Cambria Math" w:eastAsia="宋体" w:hAnsi="Cambria Math"/>
+                      <w:rFonts w:ascii="Cambria Math" w:eastAsia="SimSun" w:hAnsi="Cambria Math"/>
                       <w:i/>
                     </w:rPr>
                   </m:ctrlPr>
@@ -961,7 +971,7 @@
                 <m:e>
                   <m:r>
                     <w:rPr>
-                      <w:rFonts w:ascii="Cambria Math" w:eastAsia="宋体" w:hAnsi="Cambria Math"/>
+                      <w:rFonts w:ascii="Cambria Math" w:eastAsia="SimSun" w:hAnsi="Cambria Math"/>
                     </w:rPr>
                     <m:t>X</m:t>
                   </m:r>
@@ -969,7 +979,7 @@
                 <m:sub>
                   <m:r>
                     <w:rPr>
-                      <w:rFonts w:ascii="Cambria Math" w:eastAsia="宋体" w:hAnsi="Cambria Math"/>
+                      <w:rFonts w:ascii="Cambria Math" w:eastAsia="SimSun" w:hAnsi="Cambria Math"/>
                     </w:rPr>
                     <m:t>i</m:t>
                   </m:r>
@@ -979,7 +989,7 @@
                 <m:sSubPr>
                   <m:ctrlPr>
                     <w:rPr>
-                      <w:rFonts w:ascii="Cambria Math" w:eastAsia="宋体" w:hAnsi="Cambria Math"/>
+                      <w:rFonts w:ascii="Cambria Math" w:eastAsia="SimSun" w:hAnsi="Cambria Math"/>
                     </w:rPr>
                   </m:ctrlPr>
                 </m:sSubPr>
@@ -989,7 +999,7 @@
                       <m:sty m:val="p"/>
                     </m:rPr>
                     <w:rPr>
-                      <w:rFonts w:ascii="Cambria Math" w:eastAsia="宋体" w:hAnsi="Cambria Math"/>
+                      <w:rFonts w:ascii="Cambria Math" w:eastAsia="SimSun" w:hAnsi="Cambria Math"/>
                     </w:rPr>
                     <m:t>Γ</m:t>
                   </m:r>
@@ -997,7 +1007,7 @@
                 <m:sub>
                   <m:r>
                     <w:rPr>
-                      <w:rFonts w:ascii="Cambria Math" w:eastAsia="宋体" w:hAnsi="Cambria Math"/>
+                      <w:rFonts w:ascii="Cambria Math" w:eastAsia="SimSun" w:hAnsi="Cambria Math"/>
                     </w:rPr>
                     <m:t>t</m:t>
                   </m:r>
@@ -1005,7 +1015,7 @@
               </m:sSub>
               <m:r>
                 <w:rPr>
-                  <w:rFonts w:ascii="Cambria Math" w:eastAsia="宋体" w:hAnsi="Cambria Math"/>
+                  <w:rFonts w:ascii="Cambria Math" w:eastAsia="SimSun" w:hAnsi="Cambria Math"/>
                 </w:rPr>
                 <m:t>+</m:t>
               </m:r>
@@ -1013,7 +1023,7 @@
                 <m:sSubPr>
                   <m:ctrlPr>
                     <w:rPr>
-                      <w:rFonts w:ascii="Cambria Math" w:eastAsia="宋体" w:hAnsi="Cambria Math"/>
+                      <w:rFonts w:ascii="Cambria Math" w:eastAsia="SimSun" w:hAnsi="Cambria Math"/>
                       <w:i/>
                     </w:rPr>
                   </m:ctrlPr>
@@ -1021,7 +1031,7 @@
                 <m:e>
                   <m:r>
                     <w:rPr>
-                      <w:rFonts w:ascii="Cambria Math" w:eastAsia="宋体" w:hAnsi="Cambria Math"/>
+                      <w:rFonts w:ascii="Cambria Math" w:eastAsia="SimSun" w:hAnsi="Cambria Math"/>
                     </w:rPr>
                     <m:t>θ</m:t>
                   </m:r>
@@ -1029,7 +1039,7 @@
                 <m:sub>
                   <m:r>
                     <w:rPr>
-                      <w:rFonts w:ascii="Cambria Math" w:eastAsia="宋体" w:hAnsi="Cambria Math"/>
+                      <w:rFonts w:ascii="Cambria Math" w:eastAsia="SimSun" w:hAnsi="Cambria Math"/>
                     </w:rPr>
                     <m:t>i</m:t>
                   </m:r>
@@ -1037,7 +1047,7 @@
               </m:sSub>
               <m:r>
                 <w:rPr>
-                  <w:rFonts w:ascii="Cambria Math" w:eastAsia="宋体" w:hAnsi="Cambria Math"/>
+                  <w:rFonts w:ascii="Cambria Math" w:eastAsia="SimSun" w:hAnsi="Cambria Math"/>
                 </w:rPr>
                 <m:t>+</m:t>
               </m:r>
@@ -1045,7 +1055,7 @@
                 <m:sSubPr>
                   <m:ctrlPr>
                     <w:rPr>
-                      <w:rFonts w:ascii="Cambria Math" w:eastAsia="宋体" w:hAnsi="Cambria Math"/>
+                      <w:rFonts w:ascii="Cambria Math" w:eastAsia="SimSun" w:hAnsi="Cambria Math"/>
                       <w:i/>
                     </w:rPr>
                   </m:ctrlPr>
@@ -1053,7 +1063,7 @@
                 <m:e>
                   <m:r>
                     <w:rPr>
-                      <w:rFonts w:ascii="Cambria Math" w:eastAsia="宋体" w:hAnsi="Cambria Math"/>
+                      <w:rFonts w:ascii="Cambria Math" w:eastAsia="SimSun" w:hAnsi="Cambria Math"/>
                     </w:rPr>
                     <m:t>θ</m:t>
                   </m:r>
@@ -1061,7 +1071,7 @@
                 <m:sub>
                   <m:r>
                     <w:rPr>
-                      <w:rFonts w:ascii="Cambria Math" w:eastAsia="宋体" w:hAnsi="Cambria Math"/>
+                      <w:rFonts w:ascii="Cambria Math" w:eastAsia="SimSun" w:hAnsi="Cambria Math"/>
                     </w:rPr>
                     <m:t>t</m:t>
                   </m:r>
@@ -1069,7 +1079,7 @@
               </m:sSub>
               <m:r>
                 <w:rPr>
-                  <w:rFonts w:ascii="Cambria Math" w:eastAsia="宋体" w:hAnsi="Cambria Math"/>
+                  <w:rFonts w:ascii="Cambria Math" w:eastAsia="SimSun" w:hAnsi="Cambria Math"/>
                 </w:rPr>
                 <m:t>+</m:t>
               </m:r>
@@ -1077,7 +1087,7 @@
                 <m:sSubPr>
                   <m:ctrlPr>
                     <w:rPr>
-                      <w:rFonts w:ascii="Cambria Math" w:eastAsia="宋体" w:hAnsi="Cambria Math"/>
+                      <w:rFonts w:ascii="Cambria Math" w:eastAsia="SimSun" w:hAnsi="Cambria Math"/>
                       <w:i/>
                     </w:rPr>
                   </m:ctrlPr>
@@ -1085,7 +1095,7 @@
                 <m:e>
                   <m:r>
                     <w:rPr>
-                      <w:rFonts w:ascii="Cambria Math" w:eastAsia="宋体" w:hAnsi="Cambria Math"/>
+                      <w:rFonts w:ascii="Cambria Math" w:eastAsia="SimSun" w:hAnsi="Cambria Math"/>
                     </w:rPr>
                     <m:t>e</m:t>
                   </m:r>
@@ -1093,7 +1103,7 @@
                 <m:sub>
                   <m:r>
                     <w:rPr>
-                      <w:rFonts w:ascii="Cambria Math" w:eastAsia="宋体" w:hAnsi="Cambria Math"/>
+                      <w:rFonts w:ascii="Cambria Math" w:eastAsia="SimSun" w:hAnsi="Cambria Math"/>
                     </w:rPr>
                     <m:t>it</m:t>
                   </m:r>
@@ -1101,7 +1111,7 @@
               </m:sSub>
               <m:ctrlPr>
                 <w:rPr>
-                  <w:rFonts w:ascii="Cambria Math" w:eastAsia="宋体" w:hAnsi="Cambria Math" w:hint="eastAsia"/>
+                  <w:rFonts w:ascii="Cambria Math" w:eastAsia="SimSun" w:hAnsi="Cambria Math" w:hint="eastAsia"/>
                   <w:i/>
                 </w:rPr>
               </m:ctrlPr>
@@ -1113,21 +1123,21 @@
     <w:p>
       <w:pPr>
         <w:rPr>
-          <w:rFonts w:ascii="Times New Roman" w:eastAsia="宋体" w:hAnsi="Times New Roman"/>
+          <w:rFonts w:ascii="Times New Roman" w:eastAsia="SimSun" w:hAnsi="Times New Roman"/>
           <w:iCs/>
         </w:rPr>
       </w:pPr>
       <m:oMath>
         <m:r>
           <w:rPr>
-            <w:rFonts w:ascii="Cambria Math" w:eastAsia="宋体" w:hAnsi="Cambria Math" w:hint="eastAsia"/>
+            <w:rFonts w:ascii="Cambria Math" w:eastAsia="SimSun" w:hAnsi="Cambria Math" w:hint="eastAsia"/>
           </w:rPr>
           <m:t>i</m:t>
         </m:r>
       </m:oMath>
       <w:r>
         <w:rPr>
-          <w:rFonts w:ascii="Times New Roman" w:eastAsia="宋体" w:hAnsi="Times New Roman" w:hint="eastAsia"/>
+          <w:rFonts w:ascii="Times New Roman" w:eastAsia="SimSun" w:hAnsi="Times New Roman" w:hint="eastAsia"/>
           <w:iCs/>
         </w:rPr>
         <w:t>表示企业，</w:t>
@@ -1135,14 +1145,14 @@
       <m:oMath>
         <m:r>
           <w:rPr>
-            <w:rFonts w:ascii="Cambria Math" w:eastAsia="宋体" w:hAnsi="Cambria Math" w:hint="eastAsia"/>
+            <w:rFonts w:ascii="Cambria Math" w:eastAsia="SimSun" w:hAnsi="Cambria Math" w:hint="eastAsia"/>
           </w:rPr>
           <m:t>t</m:t>
         </m:r>
       </m:oMath>
       <w:r>
         <w:rPr>
-          <w:rFonts w:ascii="Times New Roman" w:eastAsia="宋体" w:hAnsi="Times New Roman" w:hint="eastAsia"/>
+          <w:rFonts w:ascii="Times New Roman" w:eastAsia="SimSun" w:hAnsi="Times New Roman" w:hint="eastAsia"/>
           <w:iCs/>
         </w:rPr>
         <w:t>表示年份；</w:t>
@@ -1152,7 +1162,7 @@
           <m:sSubPr>
             <m:ctrlPr>
               <w:rPr>
-                <w:rFonts w:ascii="Cambria Math" w:eastAsia="宋体" w:hAnsi="Cambria Math"/>
+                <w:rFonts w:ascii="Cambria Math" w:eastAsia="SimSun" w:hAnsi="Cambria Math"/>
                 <w:i/>
                 <w:iCs/>
               </w:rPr>
@@ -1161,13 +1171,13 @@
           <m:e>
             <m:r>
               <w:rPr>
-                <w:rFonts w:ascii="Cambria Math" w:eastAsia="宋体" w:hAnsi="Cambria Math" w:hint="eastAsia"/>
+                <w:rFonts w:ascii="Cambria Math" w:eastAsia="SimSun" w:hAnsi="Cambria Math" w:hint="eastAsia"/>
               </w:rPr>
               <m:t>X</m:t>
             </m:r>
             <m:ctrlPr>
               <w:rPr>
-                <w:rFonts w:ascii="Cambria Math" w:eastAsia="宋体" w:hAnsi="Cambria Math" w:hint="eastAsia"/>
+                <w:rFonts w:ascii="Cambria Math" w:eastAsia="SimSun" w:hAnsi="Cambria Math" w:hint="eastAsia"/>
                 <w:i/>
                 <w:iCs/>
               </w:rPr>
@@ -1176,7 +1186,7 @@
           <m:sub>
             <m:r>
               <w:rPr>
-                <w:rFonts w:ascii="Cambria Math" w:eastAsia="宋体" w:hAnsi="Cambria Math" w:hint="eastAsia"/>
+                <w:rFonts w:ascii="Cambria Math" w:eastAsia="SimSun" w:hAnsi="Cambria Math" w:hint="eastAsia"/>
               </w:rPr>
               <m:t>i</m:t>
             </m:r>
@@ -1185,63 +1195,63 @@
       </m:oMath>
       <w:r>
         <w:rPr>
-          <w:rFonts w:ascii="Times New Roman" w:eastAsia="宋体" w:hAnsi="Times New Roman" w:hint="eastAsia"/>
+          <w:rFonts w:ascii="Times New Roman" w:eastAsia="SimSun" w:hAnsi="Times New Roman" w:hint="eastAsia"/>
           <w:iCs/>
         </w:rPr>
         <w:t>：</w:t>
       </w:r>
       <w:r>
         <w:rPr>
-          <w:rFonts w:ascii="Times New Roman" w:eastAsia="宋体" w:hAnsi="Times New Roman" w:hint="eastAsia"/>
+          <w:rFonts w:ascii="Times New Roman" w:eastAsia="SimSun" w:hAnsi="Times New Roman" w:hint="eastAsia"/>
           <w:iCs/>
         </w:rPr>
         <w:t>2010</w:t>
       </w:r>
       <w:r>
         <w:rPr>
-          <w:rFonts w:ascii="Times New Roman" w:eastAsia="宋体" w:hAnsi="Times New Roman" w:hint="eastAsia"/>
+          <w:rFonts w:ascii="Times New Roman" w:eastAsia="SimSun" w:hAnsi="Times New Roman" w:hint="eastAsia"/>
           <w:iCs/>
         </w:rPr>
         <w:t>年的工资（工企则为</w:t>
       </w:r>
       <w:r>
         <w:rPr>
-          <w:rFonts w:ascii="Times New Roman" w:eastAsia="宋体" w:hAnsi="Times New Roman" w:hint="eastAsia"/>
+          <w:rFonts w:ascii="Times New Roman" w:eastAsia="SimSun" w:hAnsi="Times New Roman" w:hint="eastAsia"/>
           <w:iCs/>
         </w:rPr>
         <w:t>2011</w:t>
       </w:r>
       <w:r>
         <w:rPr>
-          <w:rFonts w:ascii="Times New Roman" w:eastAsia="宋体" w:hAnsi="Times New Roman" w:hint="eastAsia"/>
+          <w:rFonts w:ascii="Times New Roman" w:eastAsia="SimSun" w:hAnsi="Times New Roman" w:hint="eastAsia"/>
           <w:iCs/>
         </w:rPr>
         <w:t>年）</w:t>
       </w:r>
       <w:r>
         <w:rPr>
-          <w:rFonts w:ascii="Times New Roman" w:eastAsia="宋体" w:hAnsi="Times New Roman" w:hint="eastAsia"/>
+          <w:rFonts w:ascii="Times New Roman" w:eastAsia="SimSun" w:hAnsi="Times New Roman" w:hint="eastAsia"/>
           <w:iCs/>
         </w:rPr>
         <w:t>与处置组</w:t>
       </w:r>
       <w:r>
         <w:rPr>
-          <w:rFonts w:ascii="Times New Roman" w:eastAsia="宋体" w:hAnsi="Times New Roman" w:hint="eastAsia"/>
+          <w:rFonts w:ascii="Times New Roman" w:eastAsia="SimSun" w:hAnsi="Times New Roman" w:hint="eastAsia"/>
           <w:iCs/>
         </w:rPr>
         <w:t>2010</w:t>
       </w:r>
       <w:r>
         <w:rPr>
-          <w:rFonts w:ascii="Times New Roman" w:eastAsia="宋体" w:hAnsi="Times New Roman" w:hint="eastAsia"/>
+          <w:rFonts w:ascii="Times New Roman" w:eastAsia="SimSun" w:hAnsi="Times New Roman" w:hint="eastAsia"/>
           <w:iCs/>
         </w:rPr>
         <w:t>年</w:t>
       </w:r>
       <w:r>
         <w:rPr>
-          <w:rFonts w:ascii="Times New Roman" w:eastAsia="宋体" w:hAnsi="Times New Roman" w:hint="eastAsia"/>
+          <w:rFonts w:ascii="Times New Roman" w:eastAsia="SimSun" w:hAnsi="Times New Roman" w:hint="eastAsia"/>
           <w:iCs/>
         </w:rPr>
         <w:t>平均工资的差值</w:t>
@@ -1251,7 +1261,7 @@
           <m:funcPr>
             <m:ctrlPr>
               <w:rPr>
-                <w:rFonts w:ascii="Cambria Math" w:eastAsia="宋体" w:hAnsi="Cambria Math"/>
+                <w:rFonts w:ascii="Cambria Math" w:eastAsia="SimSun" w:hAnsi="Cambria Math"/>
                 <w:i/>
                 <w:iCs/>
               </w:rPr>
@@ -1263,7 +1273,7 @@
                 <m:sty m:val="p"/>
               </m:rPr>
               <w:rPr>
-                <w:rFonts w:ascii="Cambria Math" w:eastAsia="宋体" w:hAnsi="Cambria Math"/>
+                <w:rFonts w:ascii="Cambria Math" w:eastAsia="SimSun" w:hAnsi="Cambria Math"/>
               </w:rPr>
               <m:t>ln</m:t>
             </m:r>
@@ -1273,7 +1283,7 @@
               <m:sSubPr>
                 <m:ctrlPr>
                   <w:rPr>
-                    <w:rFonts w:ascii="Cambria Math" w:eastAsia="宋体" w:hAnsi="Cambria Math"/>
+                    <w:rFonts w:ascii="Cambria Math" w:eastAsia="SimSun" w:hAnsi="Cambria Math"/>
                     <w:i/>
                     <w:iCs/>
                   </w:rPr>
@@ -1282,7 +1292,7 @@
               <m:e>
                 <m:r>
                   <w:rPr>
-                    <w:rFonts w:ascii="Cambria Math" w:eastAsia="宋体" w:hAnsi="Cambria Math"/>
+                    <w:rFonts w:ascii="Cambria Math" w:eastAsia="SimSun" w:hAnsi="Cambria Math"/>
                   </w:rPr>
                   <m:t>w</m:t>
                 </m:r>
@@ -1290,7 +1300,7 @@
               <m:sub>
                 <m:r>
                   <w:rPr>
-                    <w:rFonts w:ascii="Cambria Math" w:eastAsia="宋体" w:hAnsi="Cambria Math"/>
+                    <w:rFonts w:ascii="Cambria Math" w:eastAsia="SimSun" w:hAnsi="Cambria Math"/>
                   </w:rPr>
                   <m:t>i0</m:t>
                 </m:r>
@@ -1300,7 +1310,7 @@
         </m:func>
         <m:r>
           <w:rPr>
-            <w:rFonts w:ascii="Cambria Math" w:eastAsia="宋体" w:hAnsi="Cambria Math"/>
+            <w:rFonts w:ascii="Cambria Math" w:eastAsia="SimSun" w:hAnsi="Cambria Math"/>
           </w:rPr>
           <m:t>-</m:t>
         </m:r>
@@ -1309,7 +1319,7 @@
             <m:chr m:val="̅"/>
             <m:ctrlPr>
               <w:rPr>
-                <w:rFonts w:ascii="Cambria Math" w:eastAsia="宋体" w:hAnsi="Cambria Math"/>
+                <w:rFonts w:ascii="Cambria Math" w:eastAsia="SimSun" w:hAnsi="Cambria Math"/>
                 <w:i/>
                 <w:iCs/>
               </w:rPr>
@@ -1320,7 +1330,7 @@
               <m:sSubPr>
                 <m:ctrlPr>
                   <w:rPr>
-                    <w:rFonts w:ascii="Cambria Math" w:eastAsia="宋体" w:hAnsi="Cambria Math"/>
+                    <w:rFonts w:ascii="Cambria Math" w:eastAsia="SimSun" w:hAnsi="Cambria Math"/>
                     <w:i/>
                     <w:iCs/>
                   </w:rPr>
@@ -1331,7 +1341,7 @@
                   <m:funcPr>
                     <m:ctrlPr>
                       <w:rPr>
-                        <w:rFonts w:ascii="Cambria Math" w:eastAsia="宋体" w:hAnsi="Cambria Math"/>
+                        <w:rFonts w:ascii="Cambria Math" w:eastAsia="SimSun" w:hAnsi="Cambria Math"/>
                         <w:i/>
                         <w:iCs/>
                       </w:rPr>
@@ -1343,7 +1353,7 @@
                         <m:sty m:val="p"/>
                       </m:rPr>
                       <w:rPr>
-                        <w:rFonts w:ascii="Cambria Math" w:eastAsia="宋体" w:hAnsi="Cambria Math"/>
+                        <w:rFonts w:ascii="Cambria Math" w:eastAsia="SimSun" w:hAnsi="Cambria Math"/>
                       </w:rPr>
                       <m:t>ln</m:t>
                     </m:r>
@@ -1351,7 +1361,7 @@
                   <m:e>
                     <m:r>
                       <w:rPr>
-                        <w:rFonts w:ascii="Cambria Math" w:eastAsia="宋体" w:hAnsi="Cambria Math"/>
+                        <w:rFonts w:ascii="Cambria Math" w:eastAsia="SimSun" w:hAnsi="Cambria Math"/>
                       </w:rPr>
                       <m:t>w</m:t>
                     </m:r>
@@ -1361,7 +1371,7 @@
               <m:sub>
                 <m:r>
                   <w:rPr>
-                    <w:rFonts w:ascii="Cambria Math" w:eastAsia="宋体" w:hAnsi="Cambria Math"/>
+                    <w:rFonts w:ascii="Cambria Math" w:eastAsia="SimSun" w:hAnsi="Cambria Math"/>
                   </w:rPr>
                   <m:t>0</m:t>
                 </m:r>
@@ -1372,28 +1382,28 @@
       </m:oMath>
       <w:r>
         <w:rPr>
-          <w:rFonts w:ascii="Times New Roman" w:eastAsia="宋体" w:hAnsi="Times New Roman" w:hint="eastAsia"/>
+          <w:rFonts w:ascii="Times New Roman" w:eastAsia="SimSun" w:hAnsi="Times New Roman" w:hint="eastAsia"/>
           <w:iCs/>
         </w:rPr>
         <w:t>、</w:t>
       </w:r>
       <w:r>
         <w:rPr>
-          <w:rFonts w:ascii="Times New Roman" w:eastAsia="宋体" w:hAnsi="Times New Roman" w:hint="eastAsia"/>
+          <w:rFonts w:ascii="Times New Roman" w:eastAsia="SimSun" w:hAnsi="Times New Roman" w:hint="eastAsia"/>
           <w:iCs/>
         </w:rPr>
         <w:t>是</w:t>
       </w:r>
       <w:r>
         <w:rPr>
-          <w:rFonts w:ascii="Times New Roman" w:eastAsia="宋体" w:hAnsi="Times New Roman"/>
+          <w:rFonts w:ascii="Times New Roman" w:eastAsia="SimSun" w:hAnsi="Times New Roman"/>
           <w:iCs/>
         </w:rPr>
         <w:t>否为出口企业、企业类型、所属行业，同时还控制了企业</w:t>
       </w:r>
       <w:r>
         <w:rPr>
-          <w:rFonts w:ascii="Times New Roman" w:eastAsia="宋体" w:hAnsi="Times New Roman" w:hint="eastAsia"/>
+          <w:rFonts w:ascii="Times New Roman" w:eastAsia="SimSun" w:hAnsi="Times New Roman" w:hint="eastAsia"/>
           <w:iCs/>
         </w:rPr>
         <w:t>年龄。</w:t>
@@ -1401,7 +1411,7 @@
       <m:oMath>
         <m:r>
           <w:rPr>
-            <w:rFonts w:ascii="Cambria Math" w:eastAsia="宋体" w:hAnsi="Cambria Math"/>
+            <w:rFonts w:ascii="Cambria Math" w:eastAsia="SimSun" w:hAnsi="Cambria Math"/>
           </w:rPr>
           <m:t>BigM</m:t>
         </m:r>
@@ -1409,7 +1419,7 @@
           <m:sSubPr>
             <m:ctrlPr>
               <w:rPr>
-                <w:rFonts w:ascii="Cambria Math" w:eastAsia="宋体" w:hAnsi="Cambria Math"/>
+                <w:rFonts w:ascii="Cambria Math" w:eastAsia="SimSun" w:hAnsi="Cambria Math"/>
                 <w:i/>
               </w:rPr>
             </m:ctrlPr>
@@ -1417,13 +1427,13 @@
           <m:e>
             <m:r>
               <w:rPr>
-                <w:rFonts w:ascii="Cambria Math" w:eastAsia="宋体" w:hAnsi="Cambria Math" w:hint="eastAsia"/>
+                <w:rFonts w:ascii="Cambria Math" w:eastAsia="SimSun" w:hAnsi="Cambria Math" w:hint="eastAsia"/>
               </w:rPr>
               <m:t>A</m:t>
             </m:r>
             <m:ctrlPr>
               <w:rPr>
-                <w:rFonts w:ascii="Cambria Math" w:eastAsia="宋体" w:hAnsi="Cambria Math" w:hint="eastAsia"/>
+                <w:rFonts w:ascii="Cambria Math" w:eastAsia="SimSun" w:hAnsi="Cambria Math" w:hint="eastAsia"/>
                 <w:i/>
               </w:rPr>
             </m:ctrlPr>
@@ -1431,7 +1441,7 @@
           <m:sub>
             <m:r>
               <w:rPr>
-                <w:rFonts w:ascii="Cambria Math" w:eastAsia="宋体" w:hAnsi="Cambria Math"/>
+                <w:rFonts w:ascii="Cambria Math" w:eastAsia="SimSun" w:hAnsi="Cambria Math"/>
               </w:rPr>
               <m:t>i</m:t>
             </m:r>
@@ -1440,70 +1450,70 @@
       </m:oMath>
       <w:r>
         <w:rPr>
-          <w:rFonts w:ascii="Times New Roman" w:eastAsia="宋体" w:hAnsi="Times New Roman" w:hint="eastAsia"/>
+          <w:rFonts w:ascii="Times New Roman" w:eastAsia="SimSun" w:hAnsi="Times New Roman" w:hint="eastAsia"/>
           <w:iCs/>
         </w:rPr>
         <w:t>为</w:t>
       </w:r>
       <w:r>
         <w:rPr>
-          <w:rFonts w:ascii="Times New Roman" w:eastAsia="宋体" w:hAnsi="Times New Roman" w:hint="eastAsia"/>
+          <w:rFonts w:ascii="Times New Roman" w:eastAsia="SimSun" w:hAnsi="Times New Roman" w:hint="eastAsia"/>
           <w:iCs/>
         </w:rPr>
         <w:t>MA</w:t>
       </w:r>
       <w:r>
         <w:rPr>
-          <w:rFonts w:ascii="Times New Roman" w:eastAsia="宋体" w:hAnsi="Times New Roman" w:hint="eastAsia"/>
+          <w:rFonts w:ascii="Times New Roman" w:eastAsia="SimSun" w:hAnsi="Times New Roman" w:hint="eastAsia"/>
           <w:iCs/>
         </w:rPr>
         <w:t>在修桥后是否改善较大</w:t>
       </w:r>
       <w:r>
         <w:rPr>
-          <w:rFonts w:ascii="Times New Roman" w:eastAsia="宋体" w:hAnsi="Times New Roman" w:hint="eastAsia"/>
+          <w:rFonts w:ascii="Times New Roman" w:eastAsia="SimSun" w:hAnsi="Times New Roman" w:hint="eastAsia"/>
           <w:iCs/>
         </w:rPr>
         <w:t>（</w:t>
       </w:r>
       <w:r>
         <w:rPr>
-          <w:rFonts w:ascii="Times New Roman" w:eastAsia="宋体" w:hAnsi="Times New Roman" w:hint="eastAsia"/>
+          <w:rFonts w:ascii="Times New Roman" w:eastAsia="SimSun" w:hAnsi="Times New Roman" w:hint="eastAsia"/>
           <w:iCs/>
         </w:rPr>
         <w:t>=</w:t>
       </w:r>
       <w:r>
         <w:rPr>
-          <w:rFonts w:ascii="Times New Roman" w:eastAsia="宋体" w:hAnsi="Times New Roman" w:hint="eastAsia"/>
+          <w:rFonts w:ascii="Times New Roman" w:eastAsia="SimSun" w:hAnsi="Times New Roman" w:hint="eastAsia"/>
           <w:iCs/>
         </w:rPr>
         <w:t>1</w:t>
       </w:r>
       <w:r>
         <w:rPr>
-          <w:rFonts w:ascii="Times New Roman" w:eastAsia="宋体" w:hAnsi="Times New Roman" w:hint="eastAsia"/>
+          <w:rFonts w:ascii="Times New Roman" w:eastAsia="SimSun" w:hAnsi="Times New Roman" w:hint="eastAsia"/>
           <w:iCs/>
         </w:rPr>
         <w:t>约占</w:t>
       </w:r>
       <w:r>
         <w:rPr>
-          <w:rFonts w:ascii="Times New Roman" w:eastAsia="宋体" w:hAnsi="Times New Roman" w:hint="eastAsia"/>
+          <w:rFonts w:ascii="Times New Roman" w:eastAsia="SimSun" w:hAnsi="Times New Roman" w:hint="eastAsia"/>
           <w:iCs/>
         </w:rPr>
         <w:t>70%</w:t>
       </w:r>
       <w:r>
         <w:rPr>
-          <w:rFonts w:ascii="Times New Roman" w:eastAsia="宋体" w:hAnsi="Times New Roman" w:hint="eastAsia"/>
+          <w:rFonts w:ascii="Times New Roman" w:eastAsia="SimSun" w:hAnsi="Times New Roman" w:hint="eastAsia"/>
           <w:iCs/>
         </w:rPr>
         <w:t>）</w:t>
       </w:r>
       <w:r>
         <w:rPr>
-          <w:rFonts w:ascii="Times New Roman" w:eastAsia="宋体" w:hAnsi="Times New Roman" w:hint="eastAsia"/>
+          <w:rFonts w:ascii="Times New Roman" w:eastAsia="SimSun" w:hAnsi="Times New Roman" w:hint="eastAsia"/>
           <w:iCs/>
         </w:rPr>
         <w:t>。</w:t>
@@ -1512,13 +1522,13 @@
     <w:p>
       <w:pPr>
         <w:rPr>
-          <w:rFonts w:ascii="Times New Roman" w:eastAsia="宋体" w:hAnsi="Times New Roman"/>
+          <w:rFonts w:ascii="Times New Roman" w:eastAsia="SimSun" w:hAnsi="Times New Roman"/>
           <w:iCs/>
         </w:rPr>
       </w:pPr>
       <w:r>
         <w:rPr>
-          <w:rFonts w:ascii="Times New Roman" w:eastAsia="宋体" w:hAnsi="Times New Roman"/>
+          <w:rFonts w:ascii="Times New Roman" w:eastAsia="SimSun" w:hAnsi="Times New Roman"/>
           <w:iCs/>
           <w:noProof/>
         </w:rPr>
@@ -1560,7 +1570,7 @@
       </w:r>
       <w:r>
         <w:rPr>
-          <w:rFonts w:ascii="Times New Roman" w:eastAsia="宋体" w:hAnsi="Times New Roman"/>
+          <w:rFonts w:ascii="Times New Roman" w:eastAsia="SimSun" w:hAnsi="Times New Roman"/>
           <w:iCs/>
           <w:noProof/>
         </w:rPr>
@@ -1604,13 +1614,13 @@
     <w:p>
       <w:pPr>
         <w:rPr>
-          <w:rFonts w:ascii="Times New Roman" w:eastAsia="宋体" w:hAnsi="Times New Roman"/>
+          <w:rFonts w:ascii="Times New Roman" w:eastAsia="SimSun" w:hAnsi="Times New Roman"/>
           <w:iCs/>
         </w:rPr>
       </w:pPr>
       <w:r>
         <w:rPr>
-          <w:rFonts w:ascii="Times New Roman" w:eastAsia="宋体" w:hAnsi="Times New Roman"/>
+          <w:rFonts w:ascii="Times New Roman" w:eastAsia="SimSun" w:hAnsi="Times New Roman"/>
           <w:iCs/>
           <w:noProof/>
         </w:rPr>
@@ -1653,7 +1663,7 @@
       </w:r>
       <w:r>
         <w:rPr>
-          <w:rFonts w:ascii="Times New Roman" w:eastAsia="宋体" w:hAnsi="Times New Roman"/>
+          <w:rFonts w:ascii="Times New Roman" w:eastAsia="SimSun" w:hAnsi="Times New Roman"/>
           <w:iCs/>
           <w:noProof/>
         </w:rPr>
@@ -1697,7 +1707,7 @@
     <w:p>
       <w:pPr>
         <w:rPr>
-          <w:rFonts w:ascii="Times New Roman" w:eastAsia="宋体" w:hAnsi="Times New Roman"/>
+          <w:rFonts w:ascii="Times New Roman" w:eastAsia="SimSun" w:hAnsi="Times New Roman"/>
           <w:iCs/>
         </w:rPr>
       </w:pPr>
@@ -1705,7 +1715,7 @@
     <w:p>
       <w:pPr>
         <w:rPr>
-          <w:rFonts w:ascii="Times New Roman" w:eastAsia="宋体" w:hAnsi="Times New Roman"/>
+          <w:rFonts w:ascii="Times New Roman" w:eastAsia="SimSun" w:hAnsi="Times New Roman"/>
           <w:b/>
           <w:bCs/>
           <w:iCs/>
@@ -1713,7 +1723,7 @@
       </w:pPr>
       <w:r>
         <w:rPr>
-          <w:rFonts w:ascii="Times New Roman" w:eastAsia="宋体" w:hAnsi="Times New Roman" w:hint="eastAsia"/>
+          <w:rFonts w:ascii="Times New Roman" w:eastAsia="SimSun" w:hAnsi="Times New Roman" w:hint="eastAsia"/>
           <w:b/>
           <w:bCs/>
           <w:iCs/>
@@ -1722,7 +1732,7 @@
       </w:r>
       <w:r>
         <w:rPr>
-          <w:rFonts w:ascii="Times New Roman" w:eastAsia="宋体" w:hAnsi="Times New Roman" w:hint="eastAsia"/>
+          <w:rFonts w:ascii="Times New Roman" w:eastAsia="SimSun" w:hAnsi="Times New Roman" w:hint="eastAsia"/>
           <w:b/>
           <w:bCs/>
           <w:iCs/>
@@ -1731,7 +1741,7 @@
       </w:r>
       <w:r>
         <w:rPr>
-          <w:rFonts w:ascii="Times New Roman" w:eastAsia="宋体" w:hAnsi="Times New Roman" w:hint="eastAsia"/>
+          <w:rFonts w:ascii="Times New Roman" w:eastAsia="SimSun" w:hAnsi="Times New Roman" w:hint="eastAsia"/>
           <w:b/>
           <w:bCs/>
           <w:iCs/>
@@ -1776,7 +1786,7 @@
               <w:spacing w:after="0" w:line="240" w:lineRule="auto"/>
               <w:jc w:val="center"/>
               <w:rPr>
-                <w:rFonts w:ascii="Times New Roman" w:eastAsia="宋体" w:hAnsi="Times New Roman" w:cs="宋体"/>
+                <w:rFonts w:ascii="Times New Roman" w:eastAsia="SimSun" w:hAnsi="Times New Roman" w:cs="SimSun"/>
                 <w:kern w:val="0"/>
                 <w:szCs w:val="22"/>
                 <w14:ligatures w14:val="none"/>
@@ -1801,7 +1811,7 @@
               <w:spacing w:after="0" w:line="240" w:lineRule="auto"/>
               <w:jc w:val="center"/>
               <w:rPr>
-                <w:rFonts w:ascii="Times New Roman" w:eastAsia="宋体" w:hAnsi="Times New Roman" w:cs="宋体"/>
+                <w:rFonts w:ascii="Times New Roman" w:eastAsia="SimSun" w:hAnsi="Times New Roman" w:cs="SimSun"/>
                 <w:color w:val="000000"/>
                 <w:kern w:val="0"/>
                 <w:szCs w:val="22"/>
@@ -1810,7 +1820,7 @@
             </w:pPr>
             <w:r>
               <w:rPr>
-                <w:rFonts w:ascii="Times New Roman" w:eastAsia="宋体" w:hAnsi="Times New Roman" w:cs="宋体"/>
+                <w:rFonts w:ascii="Times New Roman" w:eastAsia="SimSun" w:hAnsi="Times New Roman" w:cs="SimSun"/>
                 <w:color w:val="000000"/>
                 <w:kern w:val="0"/>
                 <w:szCs w:val="22"/>
@@ -1837,7 +1847,7 @@
               <w:spacing w:after="0" w:line="240" w:lineRule="auto"/>
               <w:jc w:val="center"/>
               <w:rPr>
-                <w:rFonts w:ascii="Times New Roman" w:eastAsia="宋体" w:hAnsi="Times New Roman" w:cs="宋体"/>
+                <w:rFonts w:ascii="Times New Roman" w:eastAsia="SimSun" w:hAnsi="Times New Roman" w:cs="SimSun"/>
                 <w:color w:val="000000"/>
                 <w:kern w:val="0"/>
                 <w:szCs w:val="22"/>
@@ -1846,7 +1856,7 @@
             </w:pPr>
             <w:r>
               <w:rPr>
-                <w:rFonts w:ascii="Times New Roman" w:eastAsia="宋体" w:hAnsi="Times New Roman" w:cs="宋体"/>
+                <w:rFonts w:ascii="Times New Roman" w:eastAsia="SimSun" w:hAnsi="Times New Roman" w:cs="SimSun"/>
                 <w:color w:val="000000"/>
                 <w:kern w:val="0"/>
                 <w:szCs w:val="22"/>
@@ -1873,7 +1883,7 @@
               <w:spacing w:after="0" w:line="240" w:lineRule="auto"/>
               <w:jc w:val="center"/>
               <w:rPr>
-                <w:rFonts w:ascii="Times New Roman" w:eastAsia="宋体" w:hAnsi="Times New Roman" w:cs="宋体"/>
+                <w:rFonts w:ascii="Times New Roman" w:eastAsia="SimSun" w:hAnsi="Times New Roman" w:cs="SimSun"/>
                 <w:color w:val="000000"/>
                 <w:kern w:val="0"/>
                 <w:szCs w:val="22"/>
@@ -1882,7 +1892,7 @@
             </w:pPr>
             <w:r>
               <w:rPr>
-                <w:rFonts w:ascii="Times New Roman" w:eastAsia="宋体" w:hAnsi="Times New Roman" w:cs="宋体"/>
+                <w:rFonts w:ascii="Times New Roman" w:eastAsia="SimSun" w:hAnsi="Times New Roman" w:cs="SimSun"/>
                 <w:color w:val="000000"/>
                 <w:kern w:val="0"/>
                 <w:szCs w:val="22"/>
@@ -1909,7 +1919,7 @@
               <w:spacing w:after="0" w:line="240" w:lineRule="auto"/>
               <w:jc w:val="center"/>
               <w:rPr>
-                <w:rFonts w:ascii="Times New Roman" w:eastAsia="宋体" w:hAnsi="Times New Roman" w:cs="宋体"/>
+                <w:rFonts w:ascii="Times New Roman" w:eastAsia="SimSun" w:hAnsi="Times New Roman" w:cs="SimSun"/>
                 <w:color w:val="000000"/>
                 <w:kern w:val="0"/>
                 <w:szCs w:val="22"/>
@@ -1918,7 +1928,7 @@
             </w:pPr>
             <w:r>
               <w:rPr>
-                <w:rFonts w:ascii="Times New Roman" w:eastAsia="宋体" w:hAnsi="Times New Roman" w:cs="宋体"/>
+                <w:rFonts w:ascii="Times New Roman" w:eastAsia="SimSun" w:hAnsi="Times New Roman" w:cs="SimSun"/>
                 <w:color w:val="000000"/>
                 <w:kern w:val="0"/>
                 <w:szCs w:val="22"/>
@@ -1949,7 +1959,7 @@
               <w:spacing w:after="0" w:line="240" w:lineRule="auto"/>
               <w:jc w:val="center"/>
               <w:rPr>
-                <w:rFonts w:ascii="Times New Roman" w:eastAsia="宋体" w:hAnsi="Times New Roman" w:cs="宋体"/>
+                <w:rFonts w:ascii="Times New Roman" w:eastAsia="SimSun" w:hAnsi="Times New Roman" w:cs="SimSun"/>
                 <w:color w:val="000000"/>
                 <w:kern w:val="0"/>
                 <w:szCs w:val="22"/>
@@ -1974,16 +1984,17 @@
               <w:spacing w:after="0" w:line="240" w:lineRule="auto"/>
               <w:jc w:val="center"/>
               <w:rPr>
-                <w:rFonts w:ascii="Times New Roman" w:eastAsia="宋体" w:hAnsi="Times New Roman" w:cs="宋体"/>
-                <w:color w:val="000000"/>
-                <w:kern w:val="0"/>
-                <w:szCs w:val="22"/>
-                <w14:ligatures w14:val="none"/>
-              </w:rPr>
-            </w:pPr>
+                <w:rFonts w:ascii="Times New Roman" w:eastAsia="SimSun" w:hAnsi="Times New Roman" w:cs="SimSun"/>
+                <w:color w:val="000000"/>
+                <w:kern w:val="0"/>
+                <w:szCs w:val="22"/>
+                <w14:ligatures w14:val="none"/>
+              </w:rPr>
+            </w:pPr>
+            <w:proofErr w:type="spellStart"/>
             <w:r>
               <w:rPr>
-                <w:rFonts w:ascii="Times New Roman" w:eastAsia="宋体" w:hAnsi="Times New Roman" w:cs="宋体"/>
+                <w:rFonts w:ascii="Times New Roman" w:eastAsia="SimSun" w:hAnsi="Times New Roman" w:cs="SimSun"/>
                 <w:color w:val="000000"/>
                 <w:kern w:val="0"/>
                 <w:szCs w:val="22"/>
@@ -1991,6 +2002,7 @@
               </w:rPr>
               <w:t>ln_employ</w:t>
             </w:r>
+            <w:proofErr w:type="spellEnd"/>
           </w:p>
         </w:tc>
         <w:tc>
@@ -2009,16 +2021,17 @@
               <w:spacing w:after="0" w:line="240" w:lineRule="auto"/>
               <w:jc w:val="center"/>
               <w:rPr>
-                <w:rFonts w:ascii="Times New Roman" w:eastAsia="宋体" w:hAnsi="Times New Roman" w:cs="宋体"/>
-                <w:color w:val="000000"/>
-                <w:kern w:val="0"/>
-                <w:szCs w:val="22"/>
-                <w14:ligatures w14:val="none"/>
-              </w:rPr>
-            </w:pPr>
+                <w:rFonts w:ascii="Times New Roman" w:eastAsia="SimSun" w:hAnsi="Times New Roman" w:cs="SimSun"/>
+                <w:color w:val="000000"/>
+                <w:kern w:val="0"/>
+                <w:szCs w:val="22"/>
+                <w14:ligatures w14:val="none"/>
+              </w:rPr>
+            </w:pPr>
+            <w:proofErr w:type="spellStart"/>
             <w:r>
               <w:rPr>
-                <w:rFonts w:ascii="Times New Roman" w:eastAsia="宋体" w:hAnsi="Times New Roman" w:cs="宋体"/>
+                <w:rFonts w:ascii="Times New Roman" w:eastAsia="SimSun" w:hAnsi="Times New Roman" w:cs="SimSun"/>
                 <w:color w:val="000000"/>
                 <w:kern w:val="0"/>
                 <w:szCs w:val="22"/>
@@ -2026,6 +2039,7 @@
               </w:rPr>
               <w:t>ln_employ</w:t>
             </w:r>
+            <w:proofErr w:type="spellEnd"/>
           </w:p>
         </w:tc>
         <w:tc>
@@ -2044,16 +2058,17 @@
               <w:spacing w:after="0" w:line="240" w:lineRule="auto"/>
               <w:jc w:val="center"/>
               <w:rPr>
-                <w:rFonts w:ascii="Times New Roman" w:eastAsia="宋体" w:hAnsi="Times New Roman" w:cs="宋体"/>
-                <w:color w:val="000000"/>
-                <w:kern w:val="0"/>
-                <w:szCs w:val="22"/>
-                <w14:ligatures w14:val="none"/>
-              </w:rPr>
-            </w:pPr>
+                <w:rFonts w:ascii="Times New Roman" w:eastAsia="SimSun" w:hAnsi="Times New Roman" w:cs="SimSun"/>
+                <w:color w:val="000000"/>
+                <w:kern w:val="0"/>
+                <w:szCs w:val="22"/>
+                <w14:ligatures w14:val="none"/>
+              </w:rPr>
+            </w:pPr>
+            <w:proofErr w:type="spellStart"/>
             <w:r>
               <w:rPr>
-                <w:rFonts w:ascii="Times New Roman" w:eastAsia="宋体" w:hAnsi="Times New Roman" w:cs="宋体"/>
+                <w:rFonts w:ascii="Times New Roman" w:eastAsia="SimSun" w:hAnsi="Times New Roman" w:cs="SimSun"/>
                 <w:color w:val="000000"/>
                 <w:kern w:val="0"/>
                 <w:szCs w:val="22"/>
@@ -2061,6 +2076,7 @@
               </w:rPr>
               <w:t>ln_md</w:t>
             </w:r>
+            <w:proofErr w:type="spellEnd"/>
           </w:p>
         </w:tc>
         <w:tc>
@@ -2079,16 +2095,17 @@
               <w:spacing w:after="0" w:line="240" w:lineRule="auto"/>
               <w:jc w:val="center"/>
               <w:rPr>
-                <w:rFonts w:ascii="Times New Roman" w:eastAsia="宋体" w:hAnsi="Times New Roman" w:cs="宋体"/>
-                <w:color w:val="000000"/>
-                <w:kern w:val="0"/>
-                <w:szCs w:val="22"/>
-                <w14:ligatures w14:val="none"/>
-              </w:rPr>
-            </w:pPr>
+                <w:rFonts w:ascii="Times New Roman" w:eastAsia="SimSun" w:hAnsi="Times New Roman" w:cs="SimSun"/>
+                <w:color w:val="000000"/>
+                <w:kern w:val="0"/>
+                <w:szCs w:val="22"/>
+                <w14:ligatures w14:val="none"/>
+              </w:rPr>
+            </w:pPr>
+            <w:proofErr w:type="spellStart"/>
             <w:r>
               <w:rPr>
-                <w:rFonts w:ascii="Times New Roman" w:eastAsia="宋体" w:hAnsi="Times New Roman" w:cs="宋体"/>
+                <w:rFonts w:ascii="Times New Roman" w:eastAsia="SimSun" w:hAnsi="Times New Roman" w:cs="SimSun"/>
                 <w:color w:val="000000"/>
                 <w:kern w:val="0"/>
                 <w:szCs w:val="22"/>
@@ -2096,6 +2113,7 @@
               </w:rPr>
               <w:t>ln_wage</w:t>
             </w:r>
+            <w:proofErr w:type="spellEnd"/>
           </w:p>
         </w:tc>
       </w:tr>
@@ -2116,7 +2134,7 @@
               <w:spacing w:after="0" w:line="240" w:lineRule="auto"/>
               <w:jc w:val="center"/>
               <w:rPr>
-                <w:rFonts w:ascii="Times New Roman" w:eastAsia="宋体" w:hAnsi="Times New Roman" w:cs="宋体"/>
+                <w:rFonts w:ascii="Times New Roman" w:eastAsia="SimSun" w:hAnsi="Times New Roman" w:cs="SimSun"/>
                 <w:color w:val="000000"/>
                 <w:kern w:val="0"/>
                 <w:szCs w:val="22"/>
@@ -2125,7 +2143,7 @@
             </w:pPr>
             <w:r>
               <w:rPr>
-                <w:rFonts w:ascii="Times New Roman" w:eastAsia="宋体" w:hAnsi="Times New Roman" w:cs="宋体"/>
+                <w:rFonts w:ascii="Times New Roman" w:eastAsia="SimSun" w:hAnsi="Times New Roman" w:cs="SimSun"/>
                 <w:color w:val="000000"/>
                 <w:kern w:val="0"/>
                 <w:szCs w:val="22"/>
@@ -2148,7 +2166,7 @@
               <w:spacing w:after="0" w:line="240" w:lineRule="auto"/>
               <w:jc w:val="center"/>
               <w:rPr>
-                <w:rFonts w:ascii="Times New Roman" w:eastAsia="宋体" w:hAnsi="Times New Roman" w:cs="宋体"/>
+                <w:rFonts w:ascii="Times New Roman" w:eastAsia="SimSun" w:hAnsi="Times New Roman" w:cs="SimSun"/>
                 <w:color w:val="000000"/>
                 <w:kern w:val="0"/>
                 <w:szCs w:val="22"/>
@@ -2157,7 +2175,7 @@
             </w:pPr>
             <w:r>
               <w:rPr>
-                <w:rFonts w:ascii="Times New Roman" w:eastAsia="宋体" w:hAnsi="Times New Roman" w:cs="宋体"/>
+                <w:rFonts w:ascii="Times New Roman" w:eastAsia="SimSun" w:hAnsi="Times New Roman" w:cs="SimSun"/>
                 <w:color w:val="000000"/>
                 <w:kern w:val="0"/>
                 <w:szCs w:val="22"/>
@@ -2180,7 +2198,7 @@
               <w:spacing w:after="0" w:line="240" w:lineRule="auto"/>
               <w:jc w:val="center"/>
               <w:rPr>
-                <w:rFonts w:ascii="Times New Roman" w:eastAsia="宋体" w:hAnsi="Times New Roman" w:cs="宋体"/>
+                <w:rFonts w:ascii="Times New Roman" w:eastAsia="SimSun" w:hAnsi="Times New Roman" w:cs="SimSun"/>
                 <w:color w:val="EE0000"/>
                 <w:kern w:val="0"/>
                 <w:szCs w:val="22"/>
@@ -2189,7 +2207,7 @@
             </w:pPr>
             <w:r>
               <w:rPr>
-                <w:rFonts w:ascii="Times New Roman" w:eastAsia="宋体" w:hAnsi="Times New Roman" w:cs="宋体"/>
+                <w:rFonts w:ascii="Times New Roman" w:eastAsia="SimSun" w:hAnsi="Times New Roman" w:cs="SimSun"/>
                 <w:color w:val="EE0000"/>
                 <w:kern w:val="0"/>
                 <w:szCs w:val="22"/>
@@ -2212,7 +2230,7 @@
               <w:spacing w:after="0" w:line="240" w:lineRule="auto"/>
               <w:jc w:val="center"/>
               <w:rPr>
-                <w:rFonts w:ascii="Times New Roman" w:eastAsia="宋体" w:hAnsi="Times New Roman" w:cs="宋体"/>
+                <w:rFonts w:ascii="Times New Roman" w:eastAsia="SimSun" w:hAnsi="Times New Roman" w:cs="SimSun"/>
                 <w:color w:val="000000"/>
                 <w:kern w:val="0"/>
                 <w:szCs w:val="22"/>
@@ -2221,7 +2239,7 @@
             </w:pPr>
             <w:r>
               <w:rPr>
-                <w:rFonts w:ascii="Times New Roman" w:eastAsia="宋体" w:hAnsi="Times New Roman" w:cs="宋体"/>
+                <w:rFonts w:ascii="Times New Roman" w:eastAsia="SimSun" w:hAnsi="Times New Roman" w:cs="SimSun"/>
                 <w:color w:val="000000"/>
                 <w:kern w:val="0"/>
                 <w:szCs w:val="22"/>
@@ -2244,7 +2262,7 @@
               <w:spacing w:after="0" w:line="240" w:lineRule="auto"/>
               <w:jc w:val="center"/>
               <w:rPr>
-                <w:rFonts w:ascii="Times New Roman" w:eastAsia="宋体" w:hAnsi="Times New Roman" w:cs="宋体"/>
+                <w:rFonts w:ascii="Times New Roman" w:eastAsia="SimSun" w:hAnsi="Times New Roman" w:cs="SimSun"/>
                 <w:color w:val="000000"/>
                 <w:kern w:val="0"/>
                 <w:szCs w:val="22"/>
@@ -2253,7 +2271,7 @@
             </w:pPr>
             <w:r>
               <w:rPr>
-                <w:rFonts w:ascii="Times New Roman" w:eastAsia="宋体" w:hAnsi="Times New Roman" w:cs="宋体"/>
+                <w:rFonts w:ascii="Times New Roman" w:eastAsia="SimSun" w:hAnsi="Times New Roman" w:cs="SimSun"/>
                 <w:color w:val="000000"/>
                 <w:kern w:val="0"/>
                 <w:szCs w:val="22"/>
@@ -2281,7 +2299,7 @@
               <w:spacing w:after="0" w:line="240" w:lineRule="auto"/>
               <w:jc w:val="center"/>
               <w:rPr>
-                <w:rFonts w:ascii="Times New Roman" w:eastAsia="宋体" w:hAnsi="Times New Roman" w:cs="宋体"/>
+                <w:rFonts w:ascii="Times New Roman" w:eastAsia="SimSun" w:hAnsi="Times New Roman" w:cs="SimSun"/>
                 <w:color w:val="000000"/>
                 <w:kern w:val="0"/>
                 <w:szCs w:val="22"/>
@@ -2303,7 +2321,7 @@
               <w:spacing w:after="0" w:line="240" w:lineRule="auto"/>
               <w:jc w:val="center"/>
               <w:rPr>
-                <w:rFonts w:ascii="Times New Roman" w:eastAsia="宋体" w:hAnsi="Times New Roman" w:cs="宋体"/>
+                <w:rFonts w:ascii="Times New Roman" w:eastAsia="SimSun" w:hAnsi="Times New Roman" w:cs="SimSun"/>
                 <w:color w:val="000000"/>
                 <w:kern w:val="0"/>
                 <w:szCs w:val="22"/>
@@ -2312,7 +2330,7 @@
             </w:pPr>
             <w:r>
               <w:rPr>
-                <w:rFonts w:ascii="Times New Roman" w:eastAsia="宋体" w:hAnsi="Times New Roman" w:cs="宋体"/>
+                <w:rFonts w:ascii="Times New Roman" w:eastAsia="SimSun" w:hAnsi="Times New Roman" w:cs="SimSun"/>
                 <w:color w:val="000000"/>
                 <w:kern w:val="0"/>
                 <w:szCs w:val="22"/>
@@ -2335,7 +2353,7 @@
               <w:spacing w:after="0" w:line="240" w:lineRule="auto"/>
               <w:jc w:val="center"/>
               <w:rPr>
-                <w:rFonts w:ascii="Times New Roman" w:eastAsia="宋体" w:hAnsi="Times New Roman" w:cs="宋体"/>
+                <w:rFonts w:ascii="Times New Roman" w:eastAsia="SimSun" w:hAnsi="Times New Roman" w:cs="SimSun"/>
                 <w:color w:val="EE0000"/>
                 <w:kern w:val="0"/>
                 <w:szCs w:val="22"/>
@@ -2344,7 +2362,7 @@
             </w:pPr>
             <w:r>
               <w:rPr>
-                <w:rFonts w:ascii="Times New Roman" w:eastAsia="宋体" w:hAnsi="Times New Roman" w:cs="宋体"/>
+                <w:rFonts w:ascii="Times New Roman" w:eastAsia="SimSun" w:hAnsi="Times New Roman" w:cs="SimSun"/>
                 <w:color w:val="EE0000"/>
                 <w:kern w:val="0"/>
                 <w:szCs w:val="22"/>
@@ -2367,7 +2385,7 @@
               <w:spacing w:after="0" w:line="240" w:lineRule="auto"/>
               <w:jc w:val="center"/>
               <w:rPr>
-                <w:rFonts w:ascii="Times New Roman" w:eastAsia="宋体" w:hAnsi="Times New Roman" w:cs="宋体"/>
+                <w:rFonts w:ascii="Times New Roman" w:eastAsia="SimSun" w:hAnsi="Times New Roman" w:cs="SimSun"/>
                 <w:color w:val="000000"/>
                 <w:kern w:val="0"/>
                 <w:szCs w:val="22"/>
@@ -2376,7 +2394,7 @@
             </w:pPr>
             <w:r>
               <w:rPr>
-                <w:rFonts w:ascii="Times New Roman" w:eastAsia="宋体" w:hAnsi="Times New Roman" w:cs="宋体"/>
+                <w:rFonts w:ascii="Times New Roman" w:eastAsia="SimSun" w:hAnsi="Times New Roman" w:cs="SimSun"/>
                 <w:color w:val="000000"/>
                 <w:kern w:val="0"/>
                 <w:szCs w:val="22"/>
@@ -2399,7 +2417,7 @@
               <w:spacing w:after="0" w:line="240" w:lineRule="auto"/>
               <w:jc w:val="center"/>
               <w:rPr>
-                <w:rFonts w:ascii="Times New Roman" w:eastAsia="宋体" w:hAnsi="Times New Roman" w:cs="宋体"/>
+                <w:rFonts w:ascii="Times New Roman" w:eastAsia="SimSun" w:hAnsi="Times New Roman" w:cs="SimSun"/>
                 <w:color w:val="000000"/>
                 <w:kern w:val="0"/>
                 <w:szCs w:val="22"/>
@@ -2408,7 +2426,7 @@
             </w:pPr>
             <w:r>
               <w:rPr>
-                <w:rFonts w:ascii="Times New Roman" w:eastAsia="宋体" w:hAnsi="Times New Roman" w:cs="宋体"/>
+                <w:rFonts w:ascii="Times New Roman" w:eastAsia="SimSun" w:hAnsi="Times New Roman" w:cs="SimSun"/>
                 <w:color w:val="000000"/>
                 <w:kern w:val="0"/>
                 <w:szCs w:val="22"/>
@@ -2436,7 +2454,7 @@
               <w:spacing w:after="0" w:line="240" w:lineRule="auto"/>
               <w:jc w:val="center"/>
               <w:rPr>
-                <w:rFonts w:ascii="Times New Roman" w:eastAsia="宋体" w:hAnsi="Times New Roman" w:cs="宋体"/>
+                <w:rFonts w:ascii="Times New Roman" w:eastAsia="SimSun" w:hAnsi="Times New Roman" w:cs="SimSun"/>
                 <w:color w:val="000000"/>
                 <w:kern w:val="0"/>
                 <w:szCs w:val="22"/>
@@ -2445,14 +2463,36 @@
             </w:pPr>
             <w:r>
               <w:rPr>
-                <w:rFonts w:ascii="Times New Roman" w:eastAsia="宋体" w:hAnsi="Times New Roman" w:cs="宋体"/>
-                <w:color w:val="000000"/>
-                <w:kern w:val="0"/>
-                <w:szCs w:val="22"/>
-                <w14:ligatures w14:val="none"/>
-              </w:rPr>
-              <w:t>1.big_ma#1.post#c.ln_w0_diff</w:t>
+                <w:rFonts w:ascii="Times New Roman" w:eastAsia="SimSun" w:hAnsi="Times New Roman" w:cs="SimSun"/>
+                <w:color w:val="000000"/>
+                <w:kern w:val="0"/>
+                <w:szCs w:val="22"/>
+                <w14:ligatures w14:val="none"/>
+              </w:rPr>
+              <w:t>1.big_ma#1.post#</w:t>
             </w:r>
+            <w:proofErr w:type="gramStart"/>
+            <w:r>
+              <w:rPr>
+                <w:rFonts w:ascii="Times New Roman" w:eastAsia="SimSun" w:hAnsi="Times New Roman" w:cs="SimSun"/>
+                <w:color w:val="000000"/>
+                <w:kern w:val="0"/>
+                <w:szCs w:val="22"/>
+                <w14:ligatures w14:val="none"/>
+              </w:rPr>
+              <w:t>c.ln</w:t>
+            </w:r>
+            <w:proofErr w:type="gramEnd"/>
+            <w:r>
+              <w:rPr>
+                <w:rFonts w:ascii="Times New Roman" w:eastAsia="SimSun" w:hAnsi="Times New Roman" w:cs="SimSun"/>
+                <w:color w:val="000000"/>
+                <w:kern w:val="0"/>
+                <w:szCs w:val="22"/>
+                <w14:ligatures w14:val="none"/>
+              </w:rPr>
+              <w:t>_w0_diff</w:t>
+            </w:r>
           </w:p>
         </w:tc>
         <w:tc>
@@ -2468,7 +2508,7 @@
               <w:spacing w:after="0" w:line="240" w:lineRule="auto"/>
               <w:jc w:val="center"/>
               <w:rPr>
-                <w:rFonts w:ascii="Times New Roman" w:eastAsia="宋体" w:hAnsi="Times New Roman" w:cs="宋体"/>
+                <w:rFonts w:ascii="Times New Roman" w:eastAsia="SimSun" w:hAnsi="Times New Roman" w:cs="SimSun"/>
                 <w:color w:val="000000"/>
                 <w:kern w:val="0"/>
                 <w:szCs w:val="22"/>
@@ -2477,7 +2517,7 @@
             </w:pPr>
             <w:r>
               <w:rPr>
-                <w:rFonts w:ascii="Times New Roman" w:eastAsia="宋体" w:hAnsi="Times New Roman" w:cs="宋体"/>
+                <w:rFonts w:ascii="Times New Roman" w:eastAsia="SimSun" w:hAnsi="Times New Roman" w:cs="SimSun"/>
                 <w:color w:val="000000"/>
                 <w:kern w:val="0"/>
                 <w:szCs w:val="22"/>
@@ -2500,7 +2540,7 @@
               <w:spacing w:after="0" w:line="240" w:lineRule="auto"/>
               <w:jc w:val="center"/>
               <w:rPr>
-                <w:rFonts w:ascii="Times New Roman" w:eastAsia="宋体" w:hAnsi="Times New Roman" w:cs="宋体"/>
+                <w:rFonts w:ascii="Times New Roman" w:eastAsia="SimSun" w:hAnsi="Times New Roman" w:cs="SimSun"/>
                 <w:color w:val="EE0000"/>
                 <w:kern w:val="0"/>
                 <w:szCs w:val="22"/>
@@ -2509,7 +2549,7 @@
             </w:pPr>
             <w:r>
               <w:rPr>
-                <w:rFonts w:ascii="Times New Roman" w:eastAsia="宋体" w:hAnsi="Times New Roman" w:cs="宋体"/>
+                <w:rFonts w:ascii="Times New Roman" w:eastAsia="SimSun" w:hAnsi="Times New Roman" w:cs="SimSun"/>
                 <w:color w:val="EE0000"/>
                 <w:kern w:val="0"/>
                 <w:szCs w:val="22"/>
@@ -2532,7 +2572,7 @@
               <w:spacing w:after="0" w:line="240" w:lineRule="auto"/>
               <w:jc w:val="center"/>
               <w:rPr>
-                <w:rFonts w:ascii="Times New Roman" w:eastAsia="宋体" w:hAnsi="Times New Roman" w:cs="宋体"/>
+                <w:rFonts w:ascii="Times New Roman" w:eastAsia="SimSun" w:hAnsi="Times New Roman" w:cs="SimSun"/>
                 <w:color w:val="000000"/>
                 <w:kern w:val="0"/>
                 <w:szCs w:val="22"/>
@@ -2541,7 +2581,7 @@
             </w:pPr>
             <w:r>
               <w:rPr>
-                <w:rFonts w:ascii="Times New Roman" w:eastAsia="宋体" w:hAnsi="Times New Roman" w:cs="宋体"/>
+                <w:rFonts w:ascii="Times New Roman" w:eastAsia="SimSun" w:hAnsi="Times New Roman" w:cs="SimSun"/>
                 <w:color w:val="000000"/>
                 <w:kern w:val="0"/>
                 <w:szCs w:val="22"/>
@@ -2564,7 +2604,7 @@
               <w:spacing w:after="0" w:line="240" w:lineRule="auto"/>
               <w:jc w:val="center"/>
               <w:rPr>
-                <w:rFonts w:ascii="Times New Roman" w:eastAsia="宋体" w:hAnsi="Times New Roman" w:cs="宋体"/>
+                <w:rFonts w:ascii="Times New Roman" w:eastAsia="SimSun" w:hAnsi="Times New Roman" w:cs="SimSun"/>
                 <w:color w:val="000000"/>
                 <w:kern w:val="0"/>
                 <w:szCs w:val="22"/>
@@ -2573,7 +2613,7 @@
             </w:pPr>
             <w:r>
               <w:rPr>
-                <w:rFonts w:ascii="Times New Roman" w:eastAsia="宋体" w:hAnsi="Times New Roman" w:cs="宋体"/>
+                <w:rFonts w:ascii="Times New Roman" w:eastAsia="SimSun" w:hAnsi="Times New Roman" w:cs="SimSun"/>
                 <w:color w:val="000000"/>
                 <w:kern w:val="0"/>
                 <w:szCs w:val="22"/>
@@ -2601,7 +2641,7 @@
               <w:spacing w:after="0" w:line="240" w:lineRule="auto"/>
               <w:jc w:val="center"/>
               <w:rPr>
-                <w:rFonts w:ascii="Times New Roman" w:eastAsia="宋体" w:hAnsi="Times New Roman" w:cs="宋体"/>
+                <w:rFonts w:ascii="Times New Roman" w:eastAsia="SimSun" w:hAnsi="Times New Roman" w:cs="SimSun"/>
                 <w:color w:val="000000"/>
                 <w:kern w:val="0"/>
                 <w:szCs w:val="22"/>
@@ -2623,7 +2663,7 @@
               <w:spacing w:after="0" w:line="240" w:lineRule="auto"/>
               <w:jc w:val="center"/>
               <w:rPr>
-                <w:rFonts w:ascii="Times New Roman" w:eastAsia="宋体" w:hAnsi="Times New Roman" w:cs="宋体"/>
+                <w:rFonts w:ascii="Times New Roman" w:eastAsia="SimSun" w:hAnsi="Times New Roman" w:cs="SimSun"/>
                 <w:color w:val="000000"/>
                 <w:kern w:val="0"/>
                 <w:szCs w:val="22"/>
@@ -2632,7 +2672,7 @@
             </w:pPr>
             <w:r>
               <w:rPr>
-                <w:rFonts w:ascii="Times New Roman" w:eastAsia="宋体" w:hAnsi="Times New Roman" w:cs="宋体"/>
+                <w:rFonts w:ascii="Times New Roman" w:eastAsia="SimSun" w:hAnsi="Times New Roman" w:cs="SimSun"/>
                 <w:color w:val="000000"/>
                 <w:kern w:val="0"/>
                 <w:szCs w:val="22"/>
@@ -2655,7 +2695,7 @@
               <w:spacing w:after="0" w:line="240" w:lineRule="auto"/>
               <w:jc w:val="center"/>
               <w:rPr>
-                <w:rFonts w:ascii="Times New Roman" w:eastAsia="宋体" w:hAnsi="Times New Roman" w:cs="宋体"/>
+                <w:rFonts w:ascii="Times New Roman" w:eastAsia="SimSun" w:hAnsi="Times New Roman" w:cs="SimSun"/>
                 <w:color w:val="EE0000"/>
                 <w:kern w:val="0"/>
                 <w:szCs w:val="22"/>
@@ -2664,7 +2704,7 @@
             </w:pPr>
             <w:r>
               <w:rPr>
-                <w:rFonts w:ascii="Times New Roman" w:eastAsia="宋体" w:hAnsi="Times New Roman" w:cs="宋体"/>
+                <w:rFonts w:ascii="Times New Roman" w:eastAsia="SimSun" w:hAnsi="Times New Roman" w:cs="SimSun"/>
                 <w:color w:val="EE0000"/>
                 <w:kern w:val="0"/>
                 <w:szCs w:val="22"/>
@@ -2687,7 +2727,7 @@
               <w:spacing w:after="0" w:line="240" w:lineRule="auto"/>
               <w:jc w:val="center"/>
               <w:rPr>
-                <w:rFonts w:ascii="Times New Roman" w:eastAsia="宋体" w:hAnsi="Times New Roman" w:cs="宋体"/>
+                <w:rFonts w:ascii="Times New Roman" w:eastAsia="SimSun" w:hAnsi="Times New Roman" w:cs="SimSun"/>
                 <w:color w:val="000000"/>
                 <w:kern w:val="0"/>
                 <w:szCs w:val="22"/>
@@ -2696,7 +2736,7 @@
             </w:pPr>
             <w:r>
               <w:rPr>
-                <w:rFonts w:ascii="Times New Roman" w:eastAsia="宋体" w:hAnsi="Times New Roman" w:cs="宋体"/>
+                <w:rFonts w:ascii="Times New Roman" w:eastAsia="SimSun" w:hAnsi="Times New Roman" w:cs="SimSun"/>
                 <w:color w:val="000000"/>
                 <w:kern w:val="0"/>
                 <w:szCs w:val="22"/>
@@ -2719,7 +2759,7 @@
               <w:spacing w:after="0" w:line="240" w:lineRule="auto"/>
               <w:jc w:val="center"/>
               <w:rPr>
-                <w:rFonts w:ascii="Times New Roman" w:eastAsia="宋体" w:hAnsi="Times New Roman" w:cs="宋体"/>
+                <w:rFonts w:ascii="Times New Roman" w:eastAsia="SimSun" w:hAnsi="Times New Roman" w:cs="SimSun"/>
                 <w:color w:val="000000"/>
                 <w:kern w:val="0"/>
                 <w:szCs w:val="22"/>
@@ -2728,7 +2768,7 @@
             </w:pPr>
             <w:r>
               <w:rPr>
-                <w:rFonts w:ascii="Times New Roman" w:eastAsia="宋体" w:hAnsi="Times New Roman" w:cs="宋体"/>
+                <w:rFonts w:ascii="Times New Roman" w:eastAsia="SimSun" w:hAnsi="Times New Roman" w:cs="SimSun"/>
                 <w:color w:val="000000"/>
                 <w:kern w:val="0"/>
                 <w:szCs w:val="22"/>
@@ -2756,7 +2796,7 @@
               <w:spacing w:after="0" w:line="240" w:lineRule="auto"/>
               <w:jc w:val="center"/>
               <w:rPr>
-                <w:rFonts w:ascii="Times New Roman" w:eastAsia="宋体" w:hAnsi="Times New Roman" w:cs="宋体"/>
+                <w:rFonts w:ascii="Times New Roman" w:eastAsia="SimSun" w:hAnsi="Times New Roman" w:cs="SimSun"/>
                 <w:color w:val="000000"/>
                 <w:kern w:val="0"/>
                 <w:szCs w:val="22"/>
@@ -2765,14 +2805,36 @@
             </w:pPr>
             <w:r>
               <w:rPr>
-                <w:rFonts w:ascii="Times New Roman" w:eastAsia="宋体" w:hAnsi="Times New Roman" w:cs="宋体"/>
-                <w:color w:val="000000"/>
-                <w:kern w:val="0"/>
-                <w:szCs w:val="22"/>
-                <w14:ligatures w14:val="none"/>
-              </w:rPr>
-              <w:t>1.post#c.ln_w0_diff</w:t>
+                <w:rFonts w:ascii="Times New Roman" w:eastAsia="SimSun" w:hAnsi="Times New Roman" w:cs="SimSun"/>
+                <w:color w:val="000000"/>
+                <w:kern w:val="0"/>
+                <w:szCs w:val="22"/>
+                <w14:ligatures w14:val="none"/>
+              </w:rPr>
+              <w:t>1.post#</w:t>
             </w:r>
+            <w:proofErr w:type="gramStart"/>
+            <w:r>
+              <w:rPr>
+                <w:rFonts w:ascii="Times New Roman" w:eastAsia="SimSun" w:hAnsi="Times New Roman" w:cs="SimSun"/>
+                <w:color w:val="000000"/>
+                <w:kern w:val="0"/>
+                <w:szCs w:val="22"/>
+                <w14:ligatures w14:val="none"/>
+              </w:rPr>
+              <w:t>c.ln</w:t>
+            </w:r>
+            <w:proofErr w:type="gramEnd"/>
+            <w:r>
+              <w:rPr>
+                <w:rFonts w:ascii="Times New Roman" w:eastAsia="SimSun" w:hAnsi="Times New Roman" w:cs="SimSun"/>
+                <w:color w:val="000000"/>
+                <w:kern w:val="0"/>
+                <w:szCs w:val="22"/>
+                <w14:ligatures w14:val="none"/>
+              </w:rPr>
+              <w:t>_w0_diff</w:t>
+            </w:r>
           </w:p>
         </w:tc>
         <w:tc>
@@ -2788,7 +2850,7 @@
               <w:spacing w:after="0" w:line="240" w:lineRule="auto"/>
               <w:jc w:val="center"/>
               <w:rPr>
-                <w:rFonts w:ascii="Times New Roman" w:eastAsia="宋体" w:hAnsi="Times New Roman" w:cs="宋体"/>
+                <w:rFonts w:ascii="Times New Roman" w:eastAsia="SimSun" w:hAnsi="Times New Roman" w:cs="SimSun"/>
                 <w:color w:val="000000"/>
                 <w:kern w:val="0"/>
                 <w:szCs w:val="22"/>
@@ -2797,7 +2859,7 @@
             </w:pPr>
             <w:r>
               <w:rPr>
-                <w:rFonts w:ascii="Times New Roman" w:eastAsia="宋体" w:hAnsi="Times New Roman" w:cs="宋体"/>
+                <w:rFonts w:ascii="Times New Roman" w:eastAsia="SimSun" w:hAnsi="Times New Roman" w:cs="SimSun"/>
                 <w:color w:val="000000"/>
                 <w:kern w:val="0"/>
                 <w:szCs w:val="22"/>
@@ -2820,7 +2882,7 @@
               <w:spacing w:after="0" w:line="240" w:lineRule="auto"/>
               <w:jc w:val="center"/>
               <w:rPr>
-                <w:rFonts w:ascii="Times New Roman" w:eastAsia="宋体" w:hAnsi="Times New Roman" w:cs="宋体"/>
+                <w:rFonts w:ascii="Times New Roman" w:eastAsia="SimSun" w:hAnsi="Times New Roman" w:cs="SimSun"/>
                 <w:color w:val="000000"/>
                 <w:kern w:val="0"/>
                 <w:szCs w:val="22"/>
@@ -2829,7 +2891,7 @@
             </w:pPr>
             <w:r>
               <w:rPr>
-                <w:rFonts w:ascii="Times New Roman" w:eastAsia="宋体" w:hAnsi="Times New Roman" w:cs="宋体"/>
+                <w:rFonts w:ascii="Times New Roman" w:eastAsia="SimSun" w:hAnsi="Times New Roman" w:cs="SimSun"/>
                 <w:color w:val="000000"/>
                 <w:kern w:val="0"/>
                 <w:szCs w:val="22"/>
@@ -2852,7 +2914,7 @@
               <w:spacing w:after="0" w:line="240" w:lineRule="auto"/>
               <w:jc w:val="center"/>
               <w:rPr>
-                <w:rFonts w:ascii="Times New Roman" w:eastAsia="宋体" w:hAnsi="Times New Roman" w:cs="宋体"/>
+                <w:rFonts w:ascii="Times New Roman" w:eastAsia="SimSun" w:hAnsi="Times New Roman" w:cs="SimSun"/>
                 <w:color w:val="000000"/>
                 <w:kern w:val="0"/>
                 <w:szCs w:val="22"/>
@@ -2861,7 +2923,7 @@
             </w:pPr>
             <w:r>
               <w:rPr>
-                <w:rFonts w:ascii="Times New Roman" w:eastAsia="宋体" w:hAnsi="Times New Roman" w:cs="宋体"/>
+                <w:rFonts w:ascii="Times New Roman" w:eastAsia="SimSun" w:hAnsi="Times New Roman" w:cs="SimSun"/>
                 <w:color w:val="000000"/>
                 <w:kern w:val="0"/>
                 <w:szCs w:val="22"/>
@@ -2884,7 +2946,7 @@
               <w:spacing w:after="0" w:line="240" w:lineRule="auto"/>
               <w:jc w:val="center"/>
               <w:rPr>
-                <w:rFonts w:ascii="Times New Roman" w:eastAsia="宋体" w:hAnsi="Times New Roman" w:cs="宋体"/>
+                <w:rFonts w:ascii="Times New Roman" w:eastAsia="SimSun" w:hAnsi="Times New Roman" w:cs="SimSun"/>
                 <w:color w:val="000000"/>
                 <w:kern w:val="0"/>
                 <w:szCs w:val="22"/>
@@ -2893,7 +2955,7 @@
             </w:pPr>
             <w:r>
               <w:rPr>
-                <w:rFonts w:ascii="Times New Roman" w:eastAsia="宋体" w:hAnsi="Times New Roman" w:cs="宋体"/>
+                <w:rFonts w:ascii="Times New Roman" w:eastAsia="SimSun" w:hAnsi="Times New Roman" w:cs="SimSun"/>
                 <w:color w:val="000000"/>
                 <w:kern w:val="0"/>
                 <w:szCs w:val="22"/>
@@ -2921,7 +2983,7 @@
               <w:spacing w:after="0" w:line="240" w:lineRule="auto"/>
               <w:jc w:val="center"/>
               <w:rPr>
-                <w:rFonts w:ascii="Times New Roman" w:eastAsia="宋体" w:hAnsi="Times New Roman" w:cs="宋体"/>
+                <w:rFonts w:ascii="Times New Roman" w:eastAsia="SimSun" w:hAnsi="Times New Roman" w:cs="SimSun"/>
                 <w:color w:val="000000"/>
                 <w:kern w:val="0"/>
                 <w:szCs w:val="22"/>
@@ -2943,7 +3005,7 @@
               <w:spacing w:after="0" w:line="240" w:lineRule="auto"/>
               <w:jc w:val="center"/>
               <w:rPr>
-                <w:rFonts w:ascii="Times New Roman" w:eastAsia="宋体" w:hAnsi="Times New Roman" w:cs="宋体"/>
+                <w:rFonts w:ascii="Times New Roman" w:eastAsia="SimSun" w:hAnsi="Times New Roman" w:cs="SimSun"/>
                 <w:color w:val="000000"/>
                 <w:kern w:val="0"/>
                 <w:szCs w:val="22"/>
@@ -2952,7 +3014,7 @@
             </w:pPr>
             <w:r>
               <w:rPr>
-                <w:rFonts w:ascii="Times New Roman" w:eastAsia="宋体" w:hAnsi="Times New Roman" w:cs="宋体"/>
+                <w:rFonts w:ascii="Times New Roman" w:eastAsia="SimSun" w:hAnsi="Times New Roman" w:cs="SimSun"/>
                 <w:color w:val="000000"/>
                 <w:kern w:val="0"/>
                 <w:szCs w:val="22"/>
@@ -2975,7 +3037,7 @@
               <w:spacing w:after="0" w:line="240" w:lineRule="auto"/>
               <w:jc w:val="center"/>
               <w:rPr>
-                <w:rFonts w:ascii="Times New Roman" w:eastAsia="宋体" w:hAnsi="Times New Roman" w:cs="宋体"/>
+                <w:rFonts w:ascii="Times New Roman" w:eastAsia="SimSun" w:hAnsi="Times New Roman" w:cs="SimSun"/>
                 <w:color w:val="000000"/>
                 <w:kern w:val="0"/>
                 <w:szCs w:val="22"/>
@@ -2984,7 +3046,7 @@
             </w:pPr>
             <w:r>
               <w:rPr>
-                <w:rFonts w:ascii="Times New Roman" w:eastAsia="宋体" w:hAnsi="Times New Roman" w:cs="宋体"/>
+                <w:rFonts w:ascii="Times New Roman" w:eastAsia="SimSun" w:hAnsi="Times New Roman" w:cs="SimSun"/>
                 <w:color w:val="000000"/>
                 <w:kern w:val="0"/>
                 <w:szCs w:val="22"/>
@@ -3007,7 +3069,7 @@
               <w:spacing w:after="0" w:line="240" w:lineRule="auto"/>
               <w:jc w:val="center"/>
               <w:rPr>
-                <w:rFonts w:ascii="Times New Roman" w:eastAsia="宋体" w:hAnsi="Times New Roman" w:cs="宋体"/>
+                <w:rFonts w:ascii="Times New Roman" w:eastAsia="SimSun" w:hAnsi="Times New Roman" w:cs="SimSun"/>
                 <w:color w:val="000000"/>
                 <w:kern w:val="0"/>
                 <w:szCs w:val="22"/>
@@ -3016,7 +3078,7 @@
             </w:pPr>
             <w:r>
               <w:rPr>
-                <w:rFonts w:ascii="Times New Roman" w:eastAsia="宋体" w:hAnsi="Times New Roman" w:cs="宋体"/>
+                <w:rFonts w:ascii="Times New Roman" w:eastAsia="SimSun" w:hAnsi="Times New Roman" w:cs="SimSun"/>
                 <w:color w:val="000000"/>
                 <w:kern w:val="0"/>
                 <w:szCs w:val="22"/>
@@ -3039,7 +3101,7 @@
               <w:spacing w:after="0" w:line="240" w:lineRule="auto"/>
               <w:jc w:val="center"/>
               <w:rPr>
-                <w:rFonts w:ascii="Times New Roman" w:eastAsia="宋体" w:hAnsi="Times New Roman" w:cs="宋体"/>
+                <w:rFonts w:ascii="Times New Roman" w:eastAsia="SimSun" w:hAnsi="Times New Roman" w:cs="SimSun"/>
                 <w:color w:val="000000"/>
                 <w:kern w:val="0"/>
                 <w:szCs w:val="22"/>
@@ -3048,7 +3110,7 @@
             </w:pPr>
             <w:r>
               <w:rPr>
-                <w:rFonts w:ascii="Times New Roman" w:eastAsia="宋体" w:hAnsi="Times New Roman" w:cs="宋体"/>
+                <w:rFonts w:ascii="Times New Roman" w:eastAsia="SimSun" w:hAnsi="Times New Roman" w:cs="SimSun"/>
                 <w:color w:val="000000"/>
                 <w:kern w:val="0"/>
                 <w:szCs w:val="22"/>
@@ -3076,16 +3138,17 @@
               <w:spacing w:after="0" w:line="240" w:lineRule="auto"/>
               <w:jc w:val="center"/>
               <w:rPr>
-                <w:rFonts w:ascii="Times New Roman" w:eastAsia="宋体" w:hAnsi="Times New Roman" w:cs="宋体"/>
-                <w:color w:val="000000"/>
-                <w:kern w:val="0"/>
-                <w:szCs w:val="22"/>
-                <w14:ligatures w14:val="none"/>
-              </w:rPr>
-            </w:pPr>
+                <w:rFonts w:ascii="Times New Roman" w:eastAsia="SimSun" w:hAnsi="Times New Roman" w:cs="SimSun"/>
+                <w:color w:val="000000"/>
+                <w:kern w:val="0"/>
+                <w:szCs w:val="22"/>
+                <w14:ligatures w14:val="none"/>
+              </w:rPr>
+            </w:pPr>
+            <w:proofErr w:type="spellStart"/>
             <w:r>
               <w:rPr>
-                <w:rFonts w:ascii="Times New Roman" w:eastAsia="宋体" w:hAnsi="Times New Roman" w:cs="宋体"/>
+                <w:rFonts w:ascii="Times New Roman" w:eastAsia="SimSun" w:hAnsi="Times New Roman" w:cs="SimSun"/>
                 <w:color w:val="000000"/>
                 <w:kern w:val="0"/>
                 <w:szCs w:val="22"/>
@@ -3093,6 +3156,7 @@
               </w:rPr>
               <w:t>ln_age</w:t>
             </w:r>
+            <w:proofErr w:type="spellEnd"/>
           </w:p>
         </w:tc>
         <w:tc>
@@ -3108,7 +3172,7 @@
               <w:spacing w:after="0" w:line="240" w:lineRule="auto"/>
               <w:jc w:val="center"/>
               <w:rPr>
-                <w:rFonts w:ascii="Times New Roman" w:eastAsia="宋体" w:hAnsi="Times New Roman" w:cs="宋体"/>
+                <w:rFonts w:ascii="Times New Roman" w:eastAsia="SimSun" w:hAnsi="Times New Roman" w:cs="SimSun"/>
                 <w:color w:val="000000"/>
                 <w:kern w:val="0"/>
                 <w:szCs w:val="22"/>
@@ -3117,7 +3181,7 @@
             </w:pPr>
             <w:r>
               <w:rPr>
-                <w:rFonts w:ascii="Times New Roman" w:eastAsia="宋体" w:hAnsi="Times New Roman" w:cs="宋体"/>
+                <w:rFonts w:ascii="Times New Roman" w:eastAsia="SimSun" w:hAnsi="Times New Roman" w:cs="SimSun"/>
                 <w:color w:val="000000"/>
                 <w:kern w:val="0"/>
                 <w:szCs w:val="22"/>
@@ -3140,7 +3204,7 @@
               <w:spacing w:after="0" w:line="240" w:lineRule="auto"/>
               <w:jc w:val="center"/>
               <w:rPr>
-                <w:rFonts w:ascii="Times New Roman" w:eastAsia="宋体" w:hAnsi="Times New Roman" w:cs="宋体"/>
+                <w:rFonts w:ascii="Times New Roman" w:eastAsia="SimSun" w:hAnsi="Times New Roman" w:cs="SimSun"/>
                 <w:color w:val="000000"/>
                 <w:kern w:val="0"/>
                 <w:szCs w:val="22"/>
@@ -3149,7 +3213,7 @@
             </w:pPr>
             <w:r>
               <w:rPr>
-                <w:rFonts w:ascii="Times New Roman" w:eastAsia="宋体" w:hAnsi="Times New Roman" w:cs="宋体"/>
+                <w:rFonts w:ascii="Times New Roman" w:eastAsia="SimSun" w:hAnsi="Times New Roman" w:cs="SimSun"/>
                 <w:color w:val="000000"/>
                 <w:kern w:val="0"/>
                 <w:szCs w:val="22"/>
@@ -3172,7 +3236,7 @@
               <w:spacing w:after="0" w:line="240" w:lineRule="auto"/>
               <w:jc w:val="center"/>
               <w:rPr>
-                <w:rFonts w:ascii="Times New Roman" w:eastAsia="宋体" w:hAnsi="Times New Roman" w:cs="宋体"/>
+                <w:rFonts w:ascii="Times New Roman" w:eastAsia="SimSun" w:hAnsi="Times New Roman" w:cs="SimSun"/>
                 <w:color w:val="000000"/>
                 <w:kern w:val="0"/>
                 <w:szCs w:val="22"/>
@@ -3181,7 +3245,7 @@
             </w:pPr>
             <w:r>
               <w:rPr>
-                <w:rFonts w:ascii="Times New Roman" w:eastAsia="宋体" w:hAnsi="Times New Roman" w:cs="宋体"/>
+                <w:rFonts w:ascii="Times New Roman" w:eastAsia="SimSun" w:hAnsi="Times New Roman" w:cs="SimSun"/>
                 <w:color w:val="000000"/>
                 <w:kern w:val="0"/>
                 <w:szCs w:val="22"/>
@@ -3204,7 +3268,7 @@
               <w:spacing w:after="0" w:line="240" w:lineRule="auto"/>
               <w:jc w:val="center"/>
               <w:rPr>
-                <w:rFonts w:ascii="Times New Roman" w:eastAsia="宋体" w:hAnsi="Times New Roman" w:cs="宋体"/>
+                <w:rFonts w:ascii="Times New Roman" w:eastAsia="SimSun" w:hAnsi="Times New Roman" w:cs="SimSun"/>
                 <w:color w:val="000000"/>
                 <w:kern w:val="0"/>
                 <w:szCs w:val="22"/>
@@ -3213,7 +3277,7 @@
             </w:pPr>
             <w:r>
               <w:rPr>
-                <w:rFonts w:ascii="Times New Roman" w:eastAsia="宋体" w:hAnsi="Times New Roman" w:cs="宋体"/>
+                <w:rFonts w:ascii="Times New Roman" w:eastAsia="SimSun" w:hAnsi="Times New Roman" w:cs="SimSun"/>
                 <w:color w:val="000000"/>
                 <w:kern w:val="0"/>
                 <w:szCs w:val="22"/>
@@ -3244,7 +3308,7 @@
               <w:spacing w:after="0" w:line="240" w:lineRule="auto"/>
               <w:jc w:val="center"/>
               <w:rPr>
-                <w:rFonts w:ascii="Times New Roman" w:eastAsia="宋体" w:hAnsi="Times New Roman" w:cs="宋体"/>
+                <w:rFonts w:ascii="Times New Roman" w:eastAsia="SimSun" w:hAnsi="Times New Roman" w:cs="SimSun"/>
                 <w:color w:val="000000"/>
                 <w:kern w:val="0"/>
                 <w:szCs w:val="22"/>
@@ -3269,7 +3333,7 @@
               <w:spacing w:after="0" w:line="240" w:lineRule="auto"/>
               <w:jc w:val="center"/>
               <w:rPr>
-                <w:rFonts w:ascii="Times New Roman" w:eastAsia="宋体" w:hAnsi="Times New Roman" w:cs="宋体"/>
+                <w:rFonts w:ascii="Times New Roman" w:eastAsia="SimSun" w:hAnsi="Times New Roman" w:cs="SimSun"/>
                 <w:color w:val="000000"/>
                 <w:kern w:val="0"/>
                 <w:szCs w:val="22"/>
@@ -3278,7 +3342,7 @@
             </w:pPr>
             <w:r>
               <w:rPr>
-                <w:rFonts w:ascii="Times New Roman" w:eastAsia="宋体" w:hAnsi="Times New Roman" w:cs="宋体"/>
+                <w:rFonts w:ascii="Times New Roman" w:eastAsia="SimSun" w:hAnsi="Times New Roman" w:cs="SimSun"/>
                 <w:color w:val="000000"/>
                 <w:kern w:val="0"/>
                 <w:szCs w:val="22"/>
@@ -3304,7 +3368,7 @@
               <w:spacing w:after="0" w:line="240" w:lineRule="auto"/>
               <w:jc w:val="center"/>
               <w:rPr>
-                <w:rFonts w:ascii="Times New Roman" w:eastAsia="宋体" w:hAnsi="Times New Roman" w:cs="宋体"/>
+                <w:rFonts w:ascii="Times New Roman" w:eastAsia="SimSun" w:hAnsi="Times New Roman" w:cs="SimSun"/>
                 <w:color w:val="000000"/>
                 <w:kern w:val="0"/>
                 <w:szCs w:val="22"/>
@@ -3313,7 +3377,7 @@
             </w:pPr>
             <w:r>
               <w:rPr>
-                <w:rFonts w:ascii="Times New Roman" w:eastAsia="宋体" w:hAnsi="Times New Roman" w:cs="宋体"/>
+                <w:rFonts w:ascii="Times New Roman" w:eastAsia="SimSun" w:hAnsi="Times New Roman" w:cs="SimSun"/>
                 <w:color w:val="000000"/>
                 <w:kern w:val="0"/>
                 <w:szCs w:val="22"/>
@@ -3339,7 +3403,7 @@
               <w:spacing w:after="0" w:line="240" w:lineRule="auto"/>
               <w:jc w:val="center"/>
               <w:rPr>
-                <w:rFonts w:ascii="Times New Roman" w:eastAsia="宋体" w:hAnsi="Times New Roman" w:cs="宋体"/>
+                <w:rFonts w:ascii="Times New Roman" w:eastAsia="SimSun" w:hAnsi="Times New Roman" w:cs="SimSun"/>
                 <w:color w:val="000000"/>
                 <w:kern w:val="0"/>
                 <w:szCs w:val="22"/>
@@ -3348,7 +3412,7 @@
             </w:pPr>
             <w:r>
               <w:rPr>
-                <w:rFonts w:ascii="Times New Roman" w:eastAsia="宋体" w:hAnsi="Times New Roman" w:cs="宋体"/>
+                <w:rFonts w:ascii="Times New Roman" w:eastAsia="SimSun" w:hAnsi="Times New Roman" w:cs="SimSun"/>
                 <w:color w:val="000000"/>
                 <w:kern w:val="0"/>
                 <w:szCs w:val="22"/>
@@ -3374,7 +3438,7 @@
               <w:spacing w:after="0" w:line="240" w:lineRule="auto"/>
               <w:jc w:val="center"/>
               <w:rPr>
-                <w:rFonts w:ascii="Times New Roman" w:eastAsia="宋体" w:hAnsi="Times New Roman" w:cs="宋体"/>
+                <w:rFonts w:ascii="Times New Roman" w:eastAsia="SimSun" w:hAnsi="Times New Roman" w:cs="SimSun"/>
                 <w:color w:val="000000"/>
                 <w:kern w:val="0"/>
                 <w:szCs w:val="22"/>
@@ -3383,7 +3447,7 @@
             </w:pPr>
             <w:r>
               <w:rPr>
-                <w:rFonts w:ascii="Times New Roman" w:eastAsia="宋体" w:hAnsi="Times New Roman" w:cs="宋体"/>
+                <w:rFonts w:ascii="Times New Roman" w:eastAsia="SimSun" w:hAnsi="Times New Roman" w:cs="SimSun"/>
                 <w:color w:val="000000"/>
                 <w:kern w:val="0"/>
                 <w:szCs w:val="22"/>
@@ -3415,7 +3479,7 @@
               <w:spacing w:after="0" w:line="240" w:lineRule="auto"/>
               <w:jc w:val="center"/>
               <w:rPr>
-                <w:rFonts w:ascii="Times New Roman" w:eastAsia="宋体" w:hAnsi="Times New Roman" w:cs="宋体"/>
+                <w:rFonts w:ascii="Times New Roman" w:eastAsia="SimSun" w:hAnsi="Times New Roman" w:cs="SimSun"/>
                 <w:color w:val="000000"/>
                 <w:kern w:val="0"/>
                 <w:szCs w:val="22"/>
@@ -3424,7 +3488,7 @@
             </w:pPr>
             <w:r>
               <w:rPr>
-                <w:rFonts w:ascii="Times New Roman" w:eastAsia="宋体" w:hAnsi="Times New Roman" w:cs="宋体"/>
+                <w:rFonts w:ascii="Times New Roman" w:eastAsia="SimSun" w:hAnsi="Times New Roman" w:cs="SimSun"/>
                 <w:color w:val="000000"/>
                 <w:kern w:val="0"/>
                 <w:szCs w:val="22"/>
@@ -3451,7 +3515,7 @@
               <w:spacing w:after="0" w:line="240" w:lineRule="auto"/>
               <w:jc w:val="center"/>
               <w:rPr>
-                <w:rFonts w:ascii="Times New Roman" w:eastAsia="宋体" w:hAnsi="Times New Roman" w:cs="宋体"/>
+                <w:rFonts w:ascii="Times New Roman" w:eastAsia="SimSun" w:hAnsi="Times New Roman" w:cs="SimSun"/>
                 <w:color w:val="000000"/>
                 <w:kern w:val="0"/>
                 <w:szCs w:val="22"/>
@@ -3460,7 +3524,7 @@
             </w:pPr>
             <w:r>
               <w:rPr>
-                <w:rFonts w:ascii="Times New Roman" w:eastAsia="宋体" w:hAnsi="Times New Roman" w:cs="宋体"/>
+                <w:rFonts w:ascii="Times New Roman" w:eastAsia="SimSun" w:hAnsi="Times New Roman" w:cs="SimSun"/>
                 <w:color w:val="000000"/>
                 <w:kern w:val="0"/>
                 <w:szCs w:val="22"/>
@@ -3487,7 +3551,7 @@
               <w:spacing w:after="0" w:line="240" w:lineRule="auto"/>
               <w:jc w:val="center"/>
               <w:rPr>
-                <w:rFonts w:ascii="Times New Roman" w:eastAsia="宋体" w:hAnsi="Times New Roman" w:cs="宋体"/>
+                <w:rFonts w:ascii="Times New Roman" w:eastAsia="SimSun" w:hAnsi="Times New Roman" w:cs="SimSun"/>
                 <w:color w:val="000000"/>
                 <w:kern w:val="0"/>
                 <w:szCs w:val="22"/>
@@ -3496,7 +3560,7 @@
             </w:pPr>
             <w:r>
               <w:rPr>
-                <w:rFonts w:ascii="Times New Roman" w:eastAsia="宋体" w:hAnsi="Times New Roman" w:cs="宋体"/>
+                <w:rFonts w:ascii="Times New Roman" w:eastAsia="SimSun" w:hAnsi="Times New Roman" w:cs="SimSun"/>
                 <w:color w:val="000000"/>
                 <w:kern w:val="0"/>
                 <w:szCs w:val="22"/>
@@ -3523,7 +3587,7 @@
               <w:spacing w:after="0" w:line="240" w:lineRule="auto"/>
               <w:jc w:val="center"/>
               <w:rPr>
-                <w:rFonts w:ascii="Times New Roman" w:eastAsia="宋体" w:hAnsi="Times New Roman" w:cs="宋体"/>
+                <w:rFonts w:ascii="Times New Roman" w:eastAsia="SimSun" w:hAnsi="Times New Roman" w:cs="SimSun"/>
                 <w:color w:val="000000"/>
                 <w:kern w:val="0"/>
                 <w:szCs w:val="22"/>
@@ -3532,7 +3596,7 @@
             </w:pPr>
             <w:r>
               <w:rPr>
-                <w:rFonts w:ascii="Times New Roman" w:eastAsia="宋体" w:hAnsi="Times New Roman" w:cs="宋体"/>
+                <w:rFonts w:ascii="Times New Roman" w:eastAsia="SimSun" w:hAnsi="Times New Roman" w:cs="SimSun"/>
                 <w:color w:val="000000"/>
                 <w:kern w:val="0"/>
                 <w:szCs w:val="22"/>
@@ -3559,7 +3623,7 @@
               <w:spacing w:after="0" w:line="240" w:lineRule="auto"/>
               <w:jc w:val="center"/>
               <w:rPr>
-                <w:rFonts w:ascii="Times New Roman" w:eastAsia="宋体" w:hAnsi="Times New Roman" w:cs="宋体"/>
+                <w:rFonts w:ascii="Times New Roman" w:eastAsia="SimSun" w:hAnsi="Times New Roman" w:cs="SimSun"/>
                 <w:color w:val="000000"/>
                 <w:kern w:val="0"/>
                 <w:szCs w:val="22"/>
@@ -3568,7 +3632,7 @@
             </w:pPr>
             <w:r>
               <w:rPr>
-                <w:rFonts w:ascii="Times New Roman" w:eastAsia="宋体" w:hAnsi="Times New Roman" w:cs="宋体"/>
+                <w:rFonts w:ascii="Times New Roman" w:eastAsia="SimSun" w:hAnsi="Times New Roman" w:cs="SimSun"/>
                 <w:color w:val="000000"/>
                 <w:kern w:val="0"/>
                 <w:szCs w:val="22"/>
@@ -3600,7 +3664,7 @@
               <w:spacing w:after="0" w:line="240" w:lineRule="auto"/>
               <w:jc w:val="center"/>
               <w:rPr>
-                <w:rFonts w:ascii="Times New Roman" w:eastAsia="宋体" w:hAnsi="Times New Roman" w:cs="宋体"/>
+                <w:rFonts w:ascii="Times New Roman" w:eastAsia="SimSun" w:hAnsi="Times New Roman" w:cs="SimSun"/>
                 <w:color w:val="000000"/>
                 <w:kern w:val="0"/>
                 <w:szCs w:val="22"/>
@@ -3609,7 +3673,7 @@
             </w:pPr>
             <w:r>
               <w:rPr>
-                <w:rFonts w:ascii="Times New Roman" w:eastAsia="宋体" w:hAnsi="Times New Roman" w:cs="宋体"/>
+                <w:rFonts w:ascii="Times New Roman" w:eastAsia="SimSun" w:hAnsi="Times New Roman" w:cs="SimSun"/>
                 <w:color w:val="000000"/>
                 <w:kern w:val="0"/>
                 <w:szCs w:val="22"/>
@@ -3636,7 +3700,7 @@
               <w:spacing w:after="0" w:line="240" w:lineRule="auto"/>
               <w:jc w:val="center"/>
               <w:rPr>
-                <w:rFonts w:ascii="Times New Roman" w:eastAsia="宋体" w:hAnsi="Times New Roman" w:cs="宋体"/>
+                <w:rFonts w:ascii="Times New Roman" w:eastAsia="SimSun" w:hAnsi="Times New Roman" w:cs="SimSun"/>
                 <w:color w:val="000000"/>
                 <w:kern w:val="0"/>
                 <w:szCs w:val="22"/>
@@ -3645,7 +3709,7 @@
             </w:pPr>
             <w:r>
               <w:rPr>
-                <w:rFonts w:ascii="Times New Roman" w:eastAsia="宋体" w:hAnsi="Times New Roman" w:cs="宋体"/>
+                <w:rFonts w:ascii="Times New Roman" w:eastAsia="SimSun" w:hAnsi="Times New Roman" w:cs="SimSun"/>
                 <w:color w:val="000000"/>
                 <w:kern w:val="0"/>
                 <w:szCs w:val="22"/>
@@ -3672,7 +3736,7 @@
               <w:spacing w:after="0" w:line="240" w:lineRule="auto"/>
               <w:jc w:val="center"/>
               <w:rPr>
-                <w:rFonts w:ascii="Times New Roman" w:eastAsia="宋体" w:hAnsi="Times New Roman" w:cs="宋体"/>
+                <w:rFonts w:ascii="Times New Roman" w:eastAsia="SimSun" w:hAnsi="Times New Roman" w:cs="SimSun"/>
                 <w:color w:val="000000"/>
                 <w:kern w:val="0"/>
                 <w:szCs w:val="22"/>
@@ -3681,7 +3745,7 @@
             </w:pPr>
             <w:r>
               <w:rPr>
-                <w:rFonts w:ascii="Times New Roman" w:eastAsia="宋体" w:hAnsi="Times New Roman" w:cs="宋体"/>
+                <w:rFonts w:ascii="Times New Roman" w:eastAsia="SimSun" w:hAnsi="Times New Roman" w:cs="SimSun"/>
                 <w:color w:val="000000"/>
                 <w:kern w:val="0"/>
                 <w:szCs w:val="22"/>
@@ -3708,7 +3772,7 @@
               <w:spacing w:after="0" w:line="240" w:lineRule="auto"/>
               <w:jc w:val="center"/>
               <w:rPr>
-                <w:rFonts w:ascii="Times New Roman" w:eastAsia="宋体" w:hAnsi="Times New Roman" w:cs="宋体"/>
+                <w:rFonts w:ascii="Times New Roman" w:eastAsia="SimSun" w:hAnsi="Times New Roman" w:cs="SimSun"/>
                 <w:color w:val="000000"/>
                 <w:kern w:val="0"/>
                 <w:szCs w:val="22"/>
@@ -3717,7 +3781,7 @@
             </w:pPr>
             <w:r>
               <w:rPr>
-                <w:rFonts w:ascii="Times New Roman" w:eastAsia="宋体" w:hAnsi="Times New Roman" w:cs="宋体"/>
+                <w:rFonts w:ascii="Times New Roman" w:eastAsia="SimSun" w:hAnsi="Times New Roman" w:cs="SimSun"/>
                 <w:color w:val="000000"/>
                 <w:kern w:val="0"/>
                 <w:szCs w:val="22"/>
@@ -3744,7 +3808,7 @@
               <w:spacing w:after="0" w:line="240" w:lineRule="auto"/>
               <w:jc w:val="center"/>
               <w:rPr>
-                <w:rFonts w:ascii="Times New Roman" w:eastAsia="宋体" w:hAnsi="Times New Roman" w:cs="宋体"/>
+                <w:rFonts w:ascii="Times New Roman" w:eastAsia="SimSun" w:hAnsi="Times New Roman" w:cs="SimSun"/>
                 <w:color w:val="000000"/>
                 <w:kern w:val="0"/>
                 <w:szCs w:val="22"/>
@@ -3753,7 +3817,7 @@
             </w:pPr>
             <w:r>
               <w:rPr>
-                <w:rFonts w:ascii="Times New Roman" w:eastAsia="宋体" w:hAnsi="Times New Roman" w:cs="宋体"/>
+                <w:rFonts w:ascii="Times New Roman" w:eastAsia="SimSun" w:hAnsi="Times New Roman" w:cs="SimSun"/>
                 <w:color w:val="000000"/>
                 <w:kern w:val="0"/>
                 <w:szCs w:val="22"/>
@@ -3768,7 +3832,7 @@
     <w:p>
       <w:pPr>
         <w:rPr>
-          <w:rFonts w:ascii="Times New Roman" w:eastAsia="宋体" w:hAnsi="Times New Roman"/>
+          <w:rFonts w:ascii="Times New Roman" w:eastAsia="SimSun" w:hAnsi="Times New Roman"/>
           <w:b/>
           <w:bCs/>
           <w:iCs/>
@@ -3778,7 +3842,7 @@
     <w:p>
       <w:pPr>
         <w:rPr>
-          <w:rFonts w:ascii="Times New Roman" w:eastAsia="宋体" w:hAnsi="Times New Roman"/>
+          <w:rFonts w:ascii="Times New Roman" w:eastAsia="SimSun" w:hAnsi="Times New Roman"/>
           <w:b/>
           <w:bCs/>
           <w:iCs/>
@@ -3786,7 +3850,7 @@
       </w:pPr>
       <w:r>
         <w:rPr>
-          <w:rFonts w:ascii="Times New Roman" w:eastAsia="宋体" w:hAnsi="Times New Roman" w:hint="eastAsia"/>
+          <w:rFonts w:ascii="Times New Roman" w:eastAsia="SimSun" w:hAnsi="Times New Roman" w:hint="eastAsia"/>
           <w:b/>
           <w:bCs/>
           <w:iCs/>
@@ -3795,7 +3859,7 @@
       </w:r>
       <w:r>
         <w:rPr>
-          <w:rFonts w:ascii="Times New Roman" w:eastAsia="宋体" w:hAnsi="Times New Roman" w:hint="eastAsia"/>
+          <w:rFonts w:ascii="Times New Roman" w:eastAsia="SimSun" w:hAnsi="Times New Roman" w:hint="eastAsia"/>
           <w:b/>
           <w:bCs/>
           <w:iCs/>
@@ -3804,7 +3868,7 @@
       </w:r>
       <w:r>
         <w:rPr>
-          <w:rFonts w:ascii="Times New Roman" w:eastAsia="宋体" w:hAnsi="Times New Roman" w:hint="eastAsia"/>
+          <w:rFonts w:ascii="Times New Roman" w:eastAsia="SimSun" w:hAnsi="Times New Roman" w:hint="eastAsia"/>
           <w:b/>
           <w:bCs/>
           <w:iCs/>
@@ -3813,7 +3877,7 @@
       </w:r>
       <w:r>
         <w:rPr>
-          <w:rFonts w:ascii="Times New Roman" w:eastAsia="宋体" w:hAnsi="Times New Roman" w:hint="eastAsia"/>
+          <w:rFonts w:ascii="Times New Roman" w:eastAsia="SimSun" w:hAnsi="Times New Roman" w:hint="eastAsia"/>
           <w:b/>
           <w:bCs/>
           <w:iCs/>
@@ -3824,7 +3888,7 @@
     <w:p>
       <w:pPr>
         <w:rPr>
-          <w:rFonts w:ascii="Times New Roman" w:eastAsia="宋体" w:hAnsi="Times New Roman"/>
+          <w:rFonts w:ascii="Times New Roman" w:eastAsia="SimSun" w:hAnsi="Times New Roman"/>
           <w:b/>
           <w:bCs/>
           <w:iCs/>
@@ -3832,7 +3896,7 @@
       </w:pPr>
       <w:r>
         <w:rPr>
-          <w:rFonts w:ascii="Times New Roman" w:eastAsia="宋体" w:hAnsi="Times New Roman" w:hint="eastAsia"/>
+          <w:rFonts w:ascii="Times New Roman" w:eastAsia="SimSun" w:hAnsi="Times New Roman" w:hint="eastAsia"/>
           <w:b/>
           <w:bCs/>
           <w:iCs/>
@@ -3841,7 +3905,7 @@
       </w:r>
       <w:r>
         <w:rPr>
-          <w:rFonts w:ascii="Times New Roman" w:eastAsia="宋体" w:hAnsi="Times New Roman" w:hint="eastAsia"/>
+          <w:rFonts w:ascii="Times New Roman" w:eastAsia="SimSun" w:hAnsi="Times New Roman" w:hint="eastAsia"/>
           <w:b/>
           <w:bCs/>
           <w:iCs/>
@@ -3850,7 +3914,7 @@
       </w:r>
       <w:r>
         <w:rPr>
-          <w:rFonts w:ascii="Times New Roman" w:eastAsia="宋体" w:hAnsi="Times New Roman" w:hint="eastAsia"/>
+          <w:rFonts w:ascii="Times New Roman" w:eastAsia="SimSun" w:hAnsi="Times New Roman" w:hint="eastAsia"/>
           <w:b/>
           <w:bCs/>
           <w:iCs/>
@@ -3860,30 +3924,32 @@
       <m:oMath>
         <m:r>
           <w:rPr>
-            <w:rFonts w:ascii="Cambria Math" w:eastAsia="宋体" w:hAnsi="Cambria Math"/>
+            <w:rFonts w:ascii="Cambria Math" w:eastAsia="SimSun" w:hAnsi="Cambria Math"/>
           </w:rPr>
           <m:t>η=1</m:t>
         </m:r>
       </m:oMath>
       <w:r>
         <w:rPr>
-          <w:rFonts w:ascii="Times New Roman" w:eastAsia="宋体" w:hAnsi="Times New Roman" w:hint="eastAsia"/>
+          <w:rFonts w:ascii="Times New Roman" w:eastAsia="SimSun" w:hAnsi="Times New Roman" w:hint="eastAsia"/>
           <w:iCs/>
         </w:rPr>
         <w:t>；</w:t>
       </w:r>
-      <w:r>
-        <w:rPr>
-          <w:rFonts w:ascii="Times New Roman" w:eastAsia="宋体" w:hAnsi="Times New Roman" w:hint="eastAsia"/>
+      <w:proofErr w:type="spellStart"/>
+      <w:r>
+        <w:rPr>
+          <w:rFonts w:ascii="Times New Roman" w:eastAsia="SimSun" w:hAnsi="Times New Roman" w:hint="eastAsia"/>
           <w:b/>
           <w:bCs/>
           <w:iCs/>
         </w:rPr>
         <w:t>frechet</w:t>
       </w:r>
-      <w:r>
-        <w:rPr>
-          <w:rFonts w:ascii="Times New Roman" w:eastAsia="宋体" w:hAnsi="Times New Roman" w:hint="eastAsia"/>
+      <w:proofErr w:type="spellEnd"/>
+      <w:r>
+        <w:rPr>
+          <w:rFonts w:ascii="Times New Roman" w:eastAsia="SimSun" w:hAnsi="Times New Roman" w:hint="eastAsia"/>
           <w:b/>
           <w:bCs/>
           <w:iCs/>
@@ -3892,7 +3958,7 @@
       </w:r>
       <w:r>
         <w:rPr>
-          <w:rFonts w:ascii="Times New Roman" w:eastAsia="宋体" w:hAnsi="Times New Roman" w:hint="eastAsia"/>
+          <w:rFonts w:ascii="Times New Roman" w:eastAsia="SimSun" w:hAnsi="Times New Roman" w:hint="eastAsia"/>
           <w:b/>
           <w:bCs/>
           <w:iCs/>
@@ -3901,7 +3967,7 @@
       </w:r>
       <w:r>
         <w:rPr>
-          <w:rFonts w:ascii="Times New Roman" w:eastAsia="宋体" w:hAnsi="Times New Roman" w:hint="eastAsia"/>
+          <w:rFonts w:ascii="Times New Roman" w:eastAsia="SimSun" w:hAnsi="Times New Roman" w:hint="eastAsia"/>
           <w:b/>
           <w:bCs/>
           <w:iCs/>
@@ -3911,21 +3977,21 @@
       <m:oMath>
         <m:r>
           <w:rPr>
-            <w:rFonts w:ascii="Cambria Math" w:eastAsia="宋体" w:hAnsi="Cambria Math"/>
+            <w:rFonts w:ascii="Cambria Math" w:eastAsia="SimSun" w:hAnsi="Cambria Math"/>
           </w:rPr>
           <m:t>θ=5</m:t>
         </m:r>
       </m:oMath>
       <w:r>
         <w:rPr>
-          <w:rFonts w:ascii="Times New Roman" w:eastAsia="宋体" w:hAnsi="Times New Roman" w:hint="eastAsia"/>
+          <w:rFonts w:ascii="Times New Roman" w:eastAsia="SimSun" w:hAnsi="Times New Roman" w:hint="eastAsia"/>
           <w:iCs/>
         </w:rPr>
         <w:t>；</w:t>
       </w:r>
       <w:r>
         <w:rPr>
-          <w:rFonts w:ascii="Times New Roman" w:eastAsia="宋体" w:hAnsi="Times New Roman" w:hint="eastAsia"/>
+          <w:rFonts w:ascii="Times New Roman" w:eastAsia="SimSun" w:hAnsi="Times New Roman" w:hint="eastAsia"/>
           <w:b/>
           <w:bCs/>
           <w:iCs/>
@@ -3934,16 +4000,27 @@
       </w:r>
       <w:r>
         <w:rPr>
-          <w:rFonts w:ascii="Times New Roman" w:eastAsia="宋体" w:hAnsi="Times New Roman" w:hint="eastAsia"/>
+          <w:rFonts w:ascii="Times New Roman" w:eastAsia="SimSun" w:hAnsi="Times New Roman" w:hint="eastAsia"/>
           <w:b/>
           <w:bCs/>
           <w:iCs/>
         </w:rPr>
-        <w:t>decreasing returen</w:t>
-      </w:r>
-      <w:r>
-        <w:rPr>
-          <w:rFonts w:ascii="Times New Roman" w:eastAsia="宋体" w:hAnsi="Times New Roman" w:hint="eastAsia"/>
+        <w:t xml:space="preserve">decreasing </w:t>
+      </w:r>
+      <w:proofErr w:type="spellStart"/>
+      <w:r>
+        <w:rPr>
+          <w:rFonts w:ascii="Times New Roman" w:eastAsia="SimSun" w:hAnsi="Times New Roman" w:hint="eastAsia"/>
+          <w:b/>
+          <w:bCs/>
+          <w:iCs/>
+        </w:rPr>
+        <w:t>returen</w:t>
+      </w:r>
+      <w:proofErr w:type="spellEnd"/>
+      <w:r>
+        <w:rPr>
+          <w:rFonts w:ascii="Times New Roman" w:eastAsia="SimSun" w:hAnsi="Times New Roman" w:hint="eastAsia"/>
           <w:b/>
           <w:bCs/>
           <w:iCs/>
@@ -3953,13 +4030,13 @@
       <m:oMath>
         <m:r>
           <w:rPr>
-            <w:rFonts w:ascii="Cambria Math" w:eastAsia="宋体" w:hAnsi="Cambria Math" w:hint="eastAsia"/>
+            <w:rFonts w:ascii="Cambria Math" w:eastAsia="SimSun" w:hAnsi="Cambria Math" w:hint="eastAsia"/>
           </w:rPr>
           <m:t>α</m:t>
         </m:r>
         <m:r>
           <w:rPr>
-            <w:rFonts w:ascii="Cambria Math" w:eastAsia="宋体" w:hAnsi="Cambria Math"/>
+            <w:rFonts w:ascii="Cambria Math" w:eastAsia="SimSun" w:hAnsi="Cambria Math"/>
           </w:rPr>
           <m:t>=0.4</m:t>
         </m:r>
@@ -3968,7 +4045,7 @@
     <w:p>
       <w:pPr>
         <w:rPr>
-          <w:rFonts w:ascii="Times New Roman" w:eastAsia="宋体" w:hAnsi="Times New Roman"/>
+          <w:rFonts w:ascii="Times New Roman" w:eastAsia="SimSun" w:hAnsi="Times New Roman"/>
           <w:b/>
           <w:bCs/>
           <w:iCs/>
@@ -3976,7 +4053,7 @@
       </w:pPr>
       <w:r>
         <w:rPr>
-          <w:rFonts w:ascii="Times New Roman" w:eastAsia="宋体" w:hAnsi="Times New Roman" w:hint="eastAsia"/>
+          <w:rFonts w:ascii="Times New Roman" w:eastAsia="SimSun" w:hAnsi="Times New Roman" w:hint="eastAsia"/>
           <w:b/>
           <w:bCs/>
           <w:iCs/>
@@ -4029,7 +4106,7 @@
       <w:pPr>
         <w:widowControl/>
         <w:rPr>
-          <w:rFonts w:ascii="宋体" w:eastAsia="宋体" w:hAnsi="宋体" w:cs="宋体"/>
+          <w:rFonts w:ascii="SimSun" w:eastAsia="SimSun" w:hAnsi="SimSun" w:cs="SimSun"/>
           <w:kern w:val="0"/>
           <w:sz w:val="24"/>
           <w14:ligatures w14:val="none"/>
@@ -4039,7 +4116,7 @@
         <m:oMath>
           <m:r>
             <w:rPr>
-              <w:rFonts w:ascii="Cambria Math" w:eastAsia="宋体" w:hAnsi="Cambria Math" w:cs="宋体"/>
+              <w:rFonts w:ascii="Cambria Math" w:eastAsia="SimSun" w:hAnsi="Cambria Math" w:cs="SimSun"/>
               <w:kern w:val="0"/>
               <w:sz w:val="24"/>
               <w14:ligatures w14:val="none"/>
@@ -4050,7 +4127,7 @@
             <m:sSubPr>
               <m:ctrlPr>
                 <w:rPr>
-                  <w:rFonts w:ascii="Cambria Math" w:eastAsia="宋体" w:hAnsi="Cambria Math" w:cs="宋体"/>
+                  <w:rFonts w:ascii="Cambria Math" w:eastAsia="SimSun" w:hAnsi="Cambria Math" w:cs="SimSun"/>
                   <w:kern w:val="0"/>
                   <w:sz w:val="24"/>
                   <w14:ligatures w14:val="none"/>
@@ -4060,7 +4137,7 @@
             <m:e>
               <m:r>
                 <w:rPr>
-                  <w:rFonts w:ascii="Cambria Math" w:eastAsia="宋体" w:hAnsi="Cambria Math" w:cs="宋体"/>
+                  <w:rFonts w:ascii="Cambria Math" w:eastAsia="SimSun" w:hAnsi="Cambria Math" w:cs="SimSun"/>
                   <w:kern w:val="0"/>
                   <w:sz w:val="24"/>
                   <w14:ligatures w14:val="none"/>
@@ -4071,7 +4148,7 @@
             <m:sub>
               <m:r>
                 <w:rPr>
-                  <w:rFonts w:ascii="Cambria Math" w:eastAsia="宋体" w:hAnsi="Cambria Math" w:cs="宋体"/>
+                  <w:rFonts w:ascii="Cambria Math" w:eastAsia="SimSun" w:hAnsi="Cambria Math" w:cs="SimSun"/>
                   <w:kern w:val="0"/>
                   <w:sz w:val="24"/>
                   <w14:ligatures w14:val="none"/>
@@ -4082,7 +4159,7 @@
           </m:sSub>
           <m:r>
             <w:rPr>
-              <w:rFonts w:ascii="Cambria Math" w:eastAsia="宋体" w:hAnsi="Cambria Math" w:cs="宋体"/>
+              <w:rFonts w:ascii="Cambria Math" w:eastAsia="SimSun" w:hAnsi="Cambria Math" w:cs="SimSun"/>
               <w:kern w:val="0"/>
               <w:sz w:val="24"/>
               <w14:ligatures w14:val="none"/>
@@ -4093,7 +4170,7 @@
             <m:sSubPr>
               <m:ctrlPr>
                 <w:rPr>
-                  <w:rFonts w:ascii="Cambria Math" w:eastAsia="宋体" w:hAnsi="Cambria Math" w:cs="宋体"/>
+                  <w:rFonts w:ascii="Cambria Math" w:eastAsia="SimSun" w:hAnsi="Cambria Math" w:cs="SimSun"/>
                   <w:kern w:val="0"/>
                   <w:sz w:val="24"/>
                   <w14:ligatures w14:val="none"/>
@@ -4103,7 +4180,7 @@
             <m:e>
               <m:r>
                 <w:rPr>
-                  <w:rFonts w:ascii="Cambria Math" w:eastAsia="宋体" w:hAnsi="Cambria Math" w:cs="宋体"/>
+                  <w:rFonts w:ascii="Cambria Math" w:eastAsia="SimSun" w:hAnsi="Cambria Math" w:cs="SimSun"/>
                   <w:kern w:val="0"/>
                   <w:sz w:val="24"/>
                   <w14:ligatures w14:val="none"/>
@@ -4114,7 +4191,7 @@
             <m:sub>
               <m:r>
                 <w:rPr>
-                  <w:rFonts w:ascii="Cambria Math" w:eastAsia="宋体" w:hAnsi="Cambria Math" w:cs="宋体"/>
+                  <w:rFonts w:ascii="Cambria Math" w:eastAsia="SimSun" w:hAnsi="Cambria Math" w:cs="SimSun"/>
                   <w:kern w:val="0"/>
                   <w:sz w:val="24"/>
                   <w14:ligatures w14:val="none"/>
@@ -4125,7 +4202,7 @@
           </m:sSub>
           <m:r>
             <w:rPr>
-              <w:rFonts w:ascii="Cambria Math" w:eastAsia="宋体" w:hAnsi="Cambria Math" w:cs="宋体"/>
+              <w:rFonts w:ascii="Cambria Math" w:eastAsia="SimSun" w:hAnsi="Cambria Math" w:cs="SimSun"/>
               <w:kern w:val="0"/>
               <w:sz w:val="24"/>
               <w14:ligatures w14:val="none"/>
@@ -4136,7 +4213,7 @@
             <m:sSubPr>
               <m:ctrlPr>
                 <w:rPr>
-                  <w:rFonts w:ascii="Cambria Math" w:eastAsia="宋体" w:hAnsi="Cambria Math" w:cs="宋体"/>
+                  <w:rFonts w:ascii="Cambria Math" w:eastAsia="SimSun" w:hAnsi="Cambria Math" w:cs="SimSun"/>
                   <w:kern w:val="0"/>
                   <w:sz w:val="24"/>
                   <w14:ligatures w14:val="none"/>
@@ -4146,7 +4223,7 @@
             <m:e>
               <m:r>
                 <w:rPr>
-                  <w:rFonts w:ascii="Cambria Math" w:eastAsia="宋体" w:hAnsi="Cambria Math" w:cs="宋体"/>
+                  <w:rFonts w:ascii="Cambria Math" w:eastAsia="SimSun" w:hAnsi="Cambria Math" w:cs="SimSun"/>
                   <w:kern w:val="0"/>
                   <w:sz w:val="24"/>
                   <w14:ligatures w14:val="none"/>
@@ -4157,7 +4234,7 @@
             <m:sub>
               <m:r>
                 <w:rPr>
-                  <w:rFonts w:ascii="Cambria Math" w:eastAsia="宋体" w:hAnsi="Cambria Math" w:cs="宋体"/>
+                  <w:rFonts w:ascii="Cambria Math" w:eastAsia="SimSun" w:hAnsi="Cambria Math" w:cs="SimSun"/>
                   <w:kern w:val="0"/>
                   <w:sz w:val="24"/>
                   <w14:ligatures w14:val="none"/>
@@ -4171,7 +4248,7 @@
               <m:nor/>
             </m:rPr>
             <w:rPr>
-              <w:rFonts w:ascii="宋体" w:eastAsia="宋体" w:hAnsi="宋体" w:cs="宋体"/>
+              <w:rFonts w:ascii="SimSun" w:eastAsia="SimSun" w:hAnsi="SimSun" w:cs="SimSun"/>
               <w:kern w:val="0"/>
               <w:sz w:val="24"/>
               <w14:ligatures w14:val="none"/>
@@ -4180,7 +4257,7 @@
           </m:r>
           <m:r>
             <w:rPr>
-              <w:rFonts w:ascii="Cambria Math" w:eastAsia="宋体" w:hAnsi="Cambria Math" w:cs="宋体"/>
+              <w:rFonts w:ascii="Cambria Math" w:eastAsia="SimSun" w:hAnsi="Cambria Math" w:cs="SimSun"/>
               <w:kern w:val="0"/>
               <w:sz w:val="24"/>
               <w14:ligatures w14:val="none"/>
@@ -4191,7 +4268,7 @@
             <m:sSubPr>
               <m:ctrlPr>
                 <w:rPr>
-                  <w:rFonts w:ascii="Cambria Math" w:eastAsia="宋体" w:hAnsi="Cambria Math" w:cs="宋体"/>
+                  <w:rFonts w:ascii="Cambria Math" w:eastAsia="SimSun" w:hAnsi="Cambria Math" w:cs="SimSun"/>
                   <w:kern w:val="0"/>
                   <w:sz w:val="24"/>
                   <w14:ligatures w14:val="none"/>
@@ -4201,7 +4278,7 @@
             <m:e>
               <m:r>
                 <w:rPr>
-                  <w:rFonts w:ascii="Cambria Math" w:eastAsia="宋体" w:hAnsi="Cambria Math" w:cs="宋体"/>
+                  <w:rFonts w:ascii="Cambria Math" w:eastAsia="SimSun" w:hAnsi="Cambria Math" w:cs="SimSun"/>
                   <w:kern w:val="0"/>
                   <w:sz w:val="24"/>
                   <w14:ligatures w14:val="none"/>
@@ -4212,7 +4289,7 @@
             <m:sub>
               <m:r>
                 <w:rPr>
-                  <w:rFonts w:ascii="Cambria Math" w:eastAsia="宋体" w:hAnsi="Cambria Math" w:cs="宋体"/>
+                  <w:rFonts w:ascii="Cambria Math" w:eastAsia="SimSun" w:hAnsi="Cambria Math" w:cs="SimSun"/>
                   <w:kern w:val="0"/>
                   <w:sz w:val="24"/>
                   <w14:ligatures w14:val="none"/>
@@ -4223,7 +4300,7 @@
           </m:sSub>
           <m:r>
             <w:rPr>
-              <w:rFonts w:ascii="Cambria Math" w:eastAsia="宋体" w:hAnsi="Cambria Math" w:cs="宋体"/>
+              <w:rFonts w:ascii="Cambria Math" w:eastAsia="SimSun" w:hAnsi="Cambria Math" w:cs="SimSun"/>
               <w:kern w:val="0"/>
               <w:sz w:val="24"/>
               <w14:ligatures w14:val="none"/>
@@ -4235,7 +4312,7 @@
               <m:nor/>
             </m:rPr>
             <w:rPr>
-              <w:rFonts w:ascii="宋体" w:eastAsia="宋体" w:hAnsi="宋体" w:cs="宋体"/>
+              <w:rFonts w:ascii="SimSun" w:eastAsia="SimSun" w:hAnsi="SimSun" w:cs="SimSun"/>
               <w:kern w:val="0"/>
               <w:sz w:val="24"/>
               <w14:ligatures w14:val="none"/>
@@ -4244,7 +4321,7 @@
           </m:r>
           <m:r>
             <w:rPr>
-              <w:rFonts w:ascii="Cambria Math" w:eastAsia="宋体" w:hAnsi="Cambria Math" w:cs="宋体"/>
+              <w:rFonts w:ascii="Cambria Math" w:eastAsia="SimSun" w:hAnsi="Cambria Math" w:cs="SimSun"/>
               <w:kern w:val="0"/>
               <w:sz w:val="24"/>
               <w14:ligatures w14:val="none"/>
@@ -4255,7 +4332,7 @@
             <m:dPr>
               <m:ctrlPr>
                 <w:rPr>
-                  <w:rFonts w:ascii="Cambria Math" w:eastAsia="宋体" w:hAnsi="Cambria Math" w:cs="宋体"/>
+                  <w:rFonts w:ascii="Cambria Math" w:eastAsia="SimSun" w:hAnsi="Cambria Math" w:cs="SimSun"/>
                   <w:kern w:val="0"/>
                   <w:sz w:val="24"/>
                   <w14:ligatures w14:val="none"/>
@@ -4265,7 +4342,7 @@
             <m:e>
               <m:r>
                 <w:rPr>
-                  <w:rFonts w:ascii="Cambria Math" w:eastAsia="宋体" w:hAnsi="Cambria Math" w:cs="宋体"/>
+                  <w:rFonts w:ascii="Cambria Math" w:eastAsia="SimSun" w:hAnsi="Cambria Math" w:cs="SimSun"/>
                   <w:kern w:val="0"/>
                   <w:sz w:val="24"/>
                   <w14:ligatures w14:val="none"/>
@@ -4276,7 +4353,7 @@
                 <m:sSubPr>
                   <m:ctrlPr>
                     <w:rPr>
-                      <w:rFonts w:ascii="Cambria Math" w:eastAsia="宋体" w:hAnsi="Cambria Math" w:cs="宋体"/>
+                      <w:rFonts w:ascii="Cambria Math" w:eastAsia="SimSun" w:hAnsi="Cambria Math" w:cs="SimSun"/>
                       <w:kern w:val="0"/>
                       <w:sz w:val="24"/>
                       <w14:ligatures w14:val="none"/>
@@ -4286,7 +4363,7 @@
                 <m:e>
                   <m:r>
                     <w:rPr>
-                      <w:rFonts w:ascii="Cambria Math" w:eastAsia="宋体" w:hAnsi="Cambria Math" w:cs="宋体"/>
+                      <w:rFonts w:ascii="Cambria Math" w:eastAsia="SimSun" w:hAnsi="Cambria Math" w:cs="SimSun"/>
                       <w:kern w:val="0"/>
                       <w:sz w:val="24"/>
                       <w14:ligatures w14:val="none"/>
@@ -4297,7 +4374,7 @@
                 <m:sub>
                   <m:r>
                     <w:rPr>
-                      <w:rFonts w:ascii="Cambria Math" w:eastAsia="宋体" w:hAnsi="Cambria Math" w:cs="宋体"/>
+                      <w:rFonts w:ascii="Cambria Math" w:eastAsia="SimSun" w:hAnsi="Cambria Math" w:cs="SimSun"/>
                       <w:kern w:val="0"/>
                       <w:sz w:val="24"/>
                       <w14:ligatures w14:val="none"/>
@@ -4308,7 +4385,7 @@
               </m:sSub>
               <m:r>
                 <w:rPr>
-                  <w:rFonts w:ascii="Cambria Math" w:eastAsia="宋体" w:hAnsi="Cambria Math" w:cs="宋体"/>
+                  <w:rFonts w:ascii="Cambria Math" w:eastAsia="SimSun" w:hAnsi="Cambria Math" w:cs="SimSun"/>
                   <w:kern w:val="0"/>
                   <w:sz w:val="24"/>
                   <w14:ligatures w14:val="none"/>
@@ -4320,7 +4397,7 @@
                   <m:pos m:val="top"/>
                   <m:ctrlPr>
                     <w:rPr>
-                      <w:rFonts w:ascii="Cambria Math" w:eastAsia="宋体" w:hAnsi="Cambria Math" w:cs="宋体"/>
+                      <w:rFonts w:ascii="Cambria Math" w:eastAsia="SimSun" w:hAnsi="Cambria Math" w:cs="SimSun"/>
                       <w:kern w:val="0"/>
                       <w:sz w:val="24"/>
                       <w14:ligatures w14:val="none"/>
@@ -4330,7 +4407,7 @@
                 <m:e>
                   <m:r>
                     <w:rPr>
-                      <w:rFonts w:ascii="Cambria Math" w:eastAsia="宋体" w:hAnsi="Cambria Math" w:cs="宋体"/>
+                      <w:rFonts w:ascii="Cambria Math" w:eastAsia="SimSun" w:hAnsi="Cambria Math" w:cs="SimSun"/>
                       <w:kern w:val="0"/>
                       <w:sz w:val="24"/>
                       <w14:ligatures w14:val="none"/>
@@ -4341,7 +4418,7 @@
                     <m:sSubPr>
                       <m:ctrlPr>
                         <w:rPr>
-                          <w:rFonts w:ascii="Cambria Math" w:eastAsia="宋体" w:hAnsi="Cambria Math" w:cs="宋体"/>
+                          <w:rFonts w:ascii="Cambria Math" w:eastAsia="SimSun" w:hAnsi="Cambria Math" w:cs="SimSun"/>
                           <w:kern w:val="0"/>
                           <w:sz w:val="24"/>
                           <w14:ligatures w14:val="none"/>
@@ -4351,7 +4428,7 @@
                     <m:e>
                       <m:r>
                         <w:rPr>
-                          <w:rFonts w:ascii="Cambria Math" w:eastAsia="宋体" w:hAnsi="Cambria Math" w:cs="宋体"/>
+                          <w:rFonts w:ascii="Cambria Math" w:eastAsia="SimSun" w:hAnsi="Cambria Math" w:cs="SimSun"/>
                           <w:kern w:val="0"/>
                           <w:sz w:val="24"/>
                           <w14:ligatures w14:val="none"/>
@@ -4362,7 +4439,7 @@
                     <m:sub>
                       <m:r>
                         <w:rPr>
-                          <w:rFonts w:ascii="Cambria Math" w:eastAsia="宋体" w:hAnsi="Cambria Math" w:cs="宋体"/>
+                          <w:rFonts w:ascii="Cambria Math" w:eastAsia="SimSun" w:hAnsi="Cambria Math" w:cs="SimSun"/>
                           <w:kern w:val="0"/>
                           <w:sz w:val="24"/>
                           <w14:ligatures w14:val="none"/>
@@ -4377,7 +4454,7 @@
           </m:d>
           <m:r>
             <w:rPr>
-              <w:rFonts w:ascii="Cambria Math" w:eastAsia="宋体" w:hAnsi="Cambria Math" w:cs="宋体"/>
+              <w:rFonts w:ascii="Cambria Math" w:eastAsia="SimSun" w:hAnsi="Cambria Math" w:cs="SimSun"/>
               <w:kern w:val="0"/>
               <w:sz w:val="24"/>
               <w14:ligatures w14:val="none"/>
@@ -4390,7 +4467,7 @@
     <w:p>
       <w:pPr>
         <w:rPr>
-          <w:rFonts w:ascii="Times New Roman" w:eastAsia="宋体" w:hAnsi="Times New Roman"/>
+          <w:rFonts w:ascii="Times New Roman" w:eastAsia="SimSun" w:hAnsi="Times New Roman"/>
           <w:b/>
           <w:bCs/>
           <w:iCs/>
@@ -4398,7 +4475,7 @@
       </w:pPr>
       <w:r>
         <w:rPr>
-          <w:rFonts w:ascii="Times New Roman" w:eastAsia="宋体" w:hAnsi="Times New Roman"/>
+          <w:rFonts w:ascii="Times New Roman" w:eastAsia="SimSun" w:hAnsi="Times New Roman"/>
           <w:b/>
           <w:bCs/>
           <w:iCs/>
@@ -4445,7 +4522,7 @@
     <w:p>
       <w:pPr>
         <w:rPr>
-          <w:rFonts w:ascii="Times New Roman" w:eastAsia="宋体" w:hAnsi="Times New Roman"/>
+          <w:rFonts w:ascii="Times New Roman" w:eastAsia="SimSun" w:hAnsi="Times New Roman"/>
           <w:b/>
           <w:bCs/>
           <w:iCs/>
@@ -4859,7 +4936,7 @@
     <w:lsdException w:name="Unresolved Mention" w:semiHidden="1" w:unhideWhenUsed="1"/>
     <w:lsdException w:name="Smart Link" w:semiHidden="1" w:unhideWhenUsed="1"/>
   </w:latentStyles>
-  <w:style w:type="paragraph" w:default="1" w:styleId="a">
+  <w:style w:type="paragraph" w:default="1" w:styleId="Normal">
     <w:name w:val="Normal"/>
     <w:qFormat/>
     <w:rsid w:val="005A4817"/>
@@ -4867,11 +4944,11 @@
       <w:widowControl w:val="0"/>
     </w:pPr>
   </w:style>
-  <w:style w:type="paragraph" w:styleId="1">
+  <w:style w:type="paragraph" w:styleId="Heading1">
     <w:name w:val="heading 1"/>
-    <w:basedOn w:val="a"/>
-    <w:next w:val="a"/>
-    <w:link w:val="10"/>
+    <w:basedOn w:val="Normal"/>
+    <w:next w:val="Normal"/>
+    <w:link w:val="Heading1Char"/>
     <w:uiPriority w:val="9"/>
     <w:qFormat/>
     <w:rsid w:val="00011880"/>
@@ -4888,11 +4965,11 @@
       <w:szCs w:val="48"/>
     </w:rPr>
   </w:style>
-  <w:style w:type="paragraph" w:styleId="2">
+  <w:style w:type="paragraph" w:styleId="Heading2">
     <w:name w:val="heading 2"/>
-    <w:basedOn w:val="a"/>
-    <w:next w:val="a"/>
-    <w:link w:val="20"/>
+    <w:basedOn w:val="Normal"/>
+    <w:next w:val="Normal"/>
+    <w:link w:val="Heading2Char"/>
     <w:uiPriority w:val="9"/>
     <w:semiHidden/>
     <w:unhideWhenUsed/>
@@ -4911,11 +4988,11 @@
       <w:szCs w:val="40"/>
     </w:rPr>
   </w:style>
-  <w:style w:type="paragraph" w:styleId="3">
+  <w:style w:type="paragraph" w:styleId="Heading3">
     <w:name w:val="heading 3"/>
-    <w:basedOn w:val="a"/>
-    <w:next w:val="a"/>
-    <w:link w:val="30"/>
+    <w:basedOn w:val="Normal"/>
+    <w:next w:val="Normal"/>
+    <w:link w:val="Heading3Char"/>
     <w:uiPriority w:val="9"/>
     <w:semiHidden/>
     <w:unhideWhenUsed/>
@@ -4934,11 +5011,11 @@
       <w:szCs w:val="32"/>
     </w:rPr>
   </w:style>
-  <w:style w:type="paragraph" w:styleId="4">
+  <w:style w:type="paragraph" w:styleId="Heading4">
     <w:name w:val="heading 4"/>
-    <w:basedOn w:val="a"/>
-    <w:next w:val="a"/>
-    <w:link w:val="40"/>
+    <w:basedOn w:val="Normal"/>
+    <w:next w:val="Normal"/>
+    <w:link w:val="Heading4Char"/>
     <w:uiPriority w:val="9"/>
     <w:semiHidden/>
     <w:unhideWhenUsed/>
@@ -4957,11 +5034,11 @@
       <w:szCs w:val="28"/>
     </w:rPr>
   </w:style>
-  <w:style w:type="paragraph" w:styleId="5">
+  <w:style w:type="paragraph" w:styleId="Heading5">
     <w:name w:val="heading 5"/>
-    <w:basedOn w:val="a"/>
-    <w:next w:val="a"/>
-    <w:link w:val="50"/>
+    <w:basedOn w:val="Normal"/>
+    <w:next w:val="Normal"/>
+    <w:link w:val="Heading5Char"/>
     <w:uiPriority w:val="9"/>
     <w:semiHidden/>
     <w:unhideWhenUsed/>
@@ -4979,11 +5056,11 @@
       <w:sz w:val="24"/>
     </w:rPr>
   </w:style>
-  <w:style w:type="paragraph" w:styleId="6">
+  <w:style w:type="paragraph" w:styleId="Heading6">
     <w:name w:val="heading 6"/>
-    <w:basedOn w:val="a"/>
-    <w:next w:val="a"/>
-    <w:link w:val="60"/>
+    <w:basedOn w:val="Normal"/>
+    <w:next w:val="Normal"/>
+    <w:link w:val="Heading6Char"/>
     <w:uiPriority w:val="9"/>
     <w:semiHidden/>
     <w:unhideWhenUsed/>
@@ -5002,11 +5079,11 @@
       <w:color w:val="0F4761" w:themeColor="accent1" w:themeShade="BF"/>
     </w:rPr>
   </w:style>
-  <w:style w:type="paragraph" w:styleId="7">
+  <w:style w:type="paragraph" w:styleId="Heading7">
     <w:name w:val="heading 7"/>
-    <w:basedOn w:val="a"/>
-    <w:next w:val="a"/>
-    <w:link w:val="70"/>
+    <w:basedOn w:val="Normal"/>
+    <w:next w:val="Normal"/>
+    <w:link w:val="Heading7Char"/>
     <w:uiPriority w:val="9"/>
     <w:semiHidden/>
     <w:unhideWhenUsed/>
@@ -5025,11 +5102,11 @@
       <w:color w:val="595959" w:themeColor="text1" w:themeTint="A6"/>
     </w:rPr>
   </w:style>
-  <w:style w:type="paragraph" w:styleId="8">
+  <w:style w:type="paragraph" w:styleId="Heading8">
     <w:name w:val="heading 8"/>
-    <w:basedOn w:val="a"/>
-    <w:next w:val="a"/>
-    <w:link w:val="80"/>
+    <w:basedOn w:val="Normal"/>
+    <w:next w:val="Normal"/>
+    <w:link w:val="Heading8Char"/>
     <w:uiPriority w:val="9"/>
     <w:semiHidden/>
     <w:unhideWhenUsed/>
@@ -5046,11 +5123,11 @@
       <w:color w:val="595959" w:themeColor="text1" w:themeTint="A6"/>
     </w:rPr>
   </w:style>
-  <w:style w:type="paragraph" w:styleId="9">
+  <w:style w:type="paragraph" w:styleId="Heading9">
     <w:name w:val="heading 9"/>
-    <w:basedOn w:val="a"/>
-    <w:next w:val="a"/>
-    <w:link w:val="90"/>
+    <w:basedOn w:val="Normal"/>
+    <w:next w:val="Normal"/>
+    <w:link w:val="Heading9Char"/>
     <w:uiPriority w:val="9"/>
     <w:semiHidden/>
     <w:unhideWhenUsed/>
@@ -5067,13 +5144,13 @@
       <w:color w:val="595959" w:themeColor="text1" w:themeTint="A6"/>
     </w:rPr>
   </w:style>
-  <w:style w:type="character" w:default="1" w:styleId="a0">
+  <w:style w:type="character" w:default="1" w:styleId="DefaultParagraphFont">
     <w:name w:val="Default Paragraph Font"/>
     <w:uiPriority w:val="1"/>
     <w:semiHidden/>
     <w:unhideWhenUsed/>
   </w:style>
-  <w:style w:type="table" w:default="1" w:styleId="a1">
+  <w:style w:type="table" w:default="1" w:styleId="TableNormal">
     <w:name w:val="Normal Table"/>
     <w:uiPriority w:val="99"/>
     <w:semiHidden/>
@@ -5088,16 +5165,16 @@
       </w:tblCellMar>
     </w:tblPr>
   </w:style>
-  <w:style w:type="numbering" w:default="1" w:styleId="a2">
+  <w:style w:type="numbering" w:default="1" w:styleId="NoList">
     <w:name w:val="No List"/>
     <w:uiPriority w:val="99"/>
     <w:semiHidden/>
     <w:unhideWhenUsed/>
   </w:style>
-  <w:style w:type="character" w:customStyle="1" w:styleId="10">
-    <w:name w:val="标题 1 字符"/>
-    <w:basedOn w:val="a0"/>
-    <w:link w:val="1"/>
+  <w:style w:type="character" w:customStyle="1" w:styleId="Heading1Char">
+    <w:name w:val="Heading 1 Char"/>
+    <w:basedOn w:val="DefaultParagraphFont"/>
+    <w:link w:val="Heading1"/>
     <w:uiPriority w:val="9"/>
     <w:rsid w:val="00011880"/>
     <w:rPr>
@@ -5107,10 +5184,10 @@
       <w:szCs w:val="48"/>
     </w:rPr>
   </w:style>
-  <w:style w:type="character" w:customStyle="1" w:styleId="20">
-    <w:name w:val="标题 2 字符"/>
-    <w:basedOn w:val="a0"/>
-    <w:link w:val="2"/>
+  <w:style w:type="character" w:customStyle="1" w:styleId="Heading2Char">
+    <w:name w:val="Heading 2 Char"/>
+    <w:basedOn w:val="DefaultParagraphFont"/>
+    <w:link w:val="Heading2"/>
     <w:uiPriority w:val="9"/>
     <w:semiHidden/>
     <w:rsid w:val="00011880"/>
@@ -5121,10 +5198,10 @@
       <w:szCs w:val="40"/>
     </w:rPr>
   </w:style>
-  <w:style w:type="character" w:customStyle="1" w:styleId="30">
-    <w:name w:val="标题 3 字符"/>
-    <w:basedOn w:val="a0"/>
-    <w:link w:val="3"/>
+  <w:style w:type="character" w:customStyle="1" w:styleId="Heading3Char">
+    <w:name w:val="Heading 3 Char"/>
+    <w:basedOn w:val="DefaultParagraphFont"/>
+    <w:link w:val="Heading3"/>
     <w:uiPriority w:val="9"/>
     <w:semiHidden/>
     <w:rsid w:val="00011880"/>
@@ -5135,10 +5212,10 @@
       <w:szCs w:val="32"/>
     </w:rPr>
   </w:style>
-  <w:style w:type="character" w:customStyle="1" w:styleId="40">
-    <w:name w:val="标题 4 字符"/>
-    <w:basedOn w:val="a0"/>
-    <w:link w:val="4"/>
+  <w:style w:type="character" w:customStyle="1" w:styleId="Heading4Char">
+    <w:name w:val="Heading 4 Char"/>
+    <w:basedOn w:val="DefaultParagraphFont"/>
+    <w:link w:val="Heading4"/>
     <w:uiPriority w:val="9"/>
     <w:semiHidden/>
     <w:rsid w:val="00011880"/>
@@ -5149,10 +5226,10 @@
       <w:szCs w:val="28"/>
     </w:rPr>
   </w:style>
-  <w:style w:type="character" w:customStyle="1" w:styleId="50">
-    <w:name w:val="标题 5 字符"/>
-    <w:basedOn w:val="a0"/>
-    <w:link w:val="5"/>
+  <w:style w:type="character" w:customStyle="1" w:styleId="Heading5Char">
+    <w:name w:val="Heading 5 Char"/>
+    <w:basedOn w:val="DefaultParagraphFont"/>
+    <w:link w:val="Heading5"/>
     <w:uiPriority w:val="9"/>
     <w:semiHidden/>
     <w:rsid w:val="00011880"/>
@@ -5162,10 +5239,10 @@
       <w:sz w:val="24"/>
     </w:rPr>
   </w:style>
-  <w:style w:type="character" w:customStyle="1" w:styleId="60">
-    <w:name w:val="标题 6 字符"/>
-    <w:basedOn w:val="a0"/>
-    <w:link w:val="6"/>
+  <w:style w:type="character" w:customStyle="1" w:styleId="Heading6Char">
+    <w:name w:val="Heading 6 Char"/>
+    <w:basedOn w:val="DefaultParagraphFont"/>
+    <w:link w:val="Heading6"/>
     <w:uiPriority w:val="9"/>
     <w:semiHidden/>
     <w:rsid w:val="00011880"/>
@@ -5176,10 +5253,10 @@
       <w:color w:val="0F4761" w:themeColor="accent1" w:themeShade="BF"/>
     </w:rPr>
   </w:style>
-  <w:style w:type="character" w:customStyle="1" w:styleId="70">
-    <w:name w:val="标题 7 字符"/>
-    <w:basedOn w:val="a0"/>
-    <w:link w:val="7"/>
+  <w:style w:type="character" w:customStyle="1" w:styleId="Heading7Char">
+    <w:name w:val="Heading 7 Char"/>
+    <w:basedOn w:val="DefaultParagraphFont"/>
+    <w:link w:val="Heading7"/>
     <w:uiPriority w:val="9"/>
     <w:semiHidden/>
     <w:rsid w:val="00011880"/>
@@ -5190,10 +5267,10 @@
       <w:color w:val="595959" w:themeColor="text1" w:themeTint="A6"/>
     </w:rPr>
   </w:style>
-  <w:style w:type="character" w:customStyle="1" w:styleId="80">
-    <w:name w:val="标题 8 字符"/>
-    <w:basedOn w:val="a0"/>
-    <w:link w:val="8"/>
+  <w:style w:type="character" w:customStyle="1" w:styleId="Heading8Char">
+    <w:name w:val="Heading 8 Char"/>
+    <w:basedOn w:val="DefaultParagraphFont"/>
+    <w:link w:val="Heading8"/>
     <w:uiPriority w:val="9"/>
     <w:semiHidden/>
     <w:rsid w:val="00011880"/>
@@ -5202,10 +5279,10 @@
       <w:color w:val="595959" w:themeColor="text1" w:themeTint="A6"/>
     </w:rPr>
   </w:style>
-  <w:style w:type="character" w:customStyle="1" w:styleId="90">
-    <w:name w:val="标题 9 字符"/>
-    <w:basedOn w:val="a0"/>
-    <w:link w:val="9"/>
+  <w:style w:type="character" w:customStyle="1" w:styleId="Heading9Char">
+    <w:name w:val="Heading 9 Char"/>
+    <w:basedOn w:val="DefaultParagraphFont"/>
+    <w:link w:val="Heading9"/>
     <w:uiPriority w:val="9"/>
     <w:semiHidden/>
     <w:rsid w:val="00011880"/>
@@ -5214,11 +5291,11 @@
       <w:color w:val="595959" w:themeColor="text1" w:themeTint="A6"/>
     </w:rPr>
   </w:style>
-  <w:style w:type="paragraph" w:styleId="a3">
+  <w:style w:type="paragraph" w:styleId="Title">
     <w:name w:val="Title"/>
-    <w:basedOn w:val="a"/>
-    <w:next w:val="a"/>
-    <w:link w:val="a4"/>
+    <w:basedOn w:val="Normal"/>
+    <w:next w:val="Normal"/>
+    <w:link w:val="TitleChar"/>
     <w:uiPriority w:val="10"/>
     <w:qFormat/>
     <w:rsid w:val="00011880"/>
@@ -5235,10 +5312,10 @@
       <w:szCs w:val="56"/>
     </w:rPr>
   </w:style>
-  <w:style w:type="character" w:customStyle="1" w:styleId="a4">
-    <w:name w:val="标题 字符"/>
-    <w:basedOn w:val="a0"/>
-    <w:link w:val="a3"/>
+  <w:style w:type="character" w:customStyle="1" w:styleId="TitleChar">
+    <w:name w:val="Title Char"/>
+    <w:basedOn w:val="DefaultParagraphFont"/>
+    <w:link w:val="Title"/>
     <w:uiPriority w:val="10"/>
     <w:rsid w:val="00011880"/>
     <w:rPr>
@@ -5249,11 +5326,11 @@
       <w:szCs w:val="56"/>
     </w:rPr>
   </w:style>
-  <w:style w:type="paragraph" w:styleId="a5">
+  <w:style w:type="paragraph" w:styleId="Subtitle">
     <w:name w:val="Subtitle"/>
-    <w:basedOn w:val="a"/>
-    <w:next w:val="a"/>
-    <w:link w:val="a6"/>
+    <w:basedOn w:val="Normal"/>
+    <w:next w:val="Normal"/>
+    <w:link w:val="SubtitleChar"/>
     <w:uiPriority w:val="11"/>
     <w:qFormat/>
     <w:rsid w:val="00011880"/>
@@ -5271,10 +5348,10 @@
       <w:szCs w:val="28"/>
     </w:rPr>
   </w:style>
-  <w:style w:type="character" w:customStyle="1" w:styleId="a6">
-    <w:name w:val="副标题 字符"/>
-    <w:basedOn w:val="a0"/>
-    <w:link w:val="a5"/>
+  <w:style w:type="character" w:customStyle="1" w:styleId="SubtitleChar">
+    <w:name w:val="Subtitle Char"/>
+    <w:basedOn w:val="DefaultParagraphFont"/>
+    <w:link w:val="Subtitle"/>
     <w:uiPriority w:val="11"/>
     <w:rsid w:val="00011880"/>
     <w:rPr>
@@ -5285,11 +5362,11 @@
       <w:szCs w:val="28"/>
     </w:rPr>
   </w:style>
-  <w:style w:type="paragraph" w:styleId="a7">
+  <w:style w:type="paragraph" w:styleId="Quote">
     <w:name w:val="Quote"/>
-    <w:basedOn w:val="a"/>
-    <w:next w:val="a"/>
-    <w:link w:val="a8"/>
+    <w:basedOn w:val="Normal"/>
+    <w:next w:val="Normal"/>
+    <w:link w:val="QuoteChar"/>
     <w:uiPriority w:val="29"/>
     <w:qFormat/>
     <w:rsid w:val="00011880"/>
@@ -5303,10 +5380,10 @@
       <w:color w:val="404040" w:themeColor="text1" w:themeTint="BF"/>
     </w:rPr>
   </w:style>
-  <w:style w:type="character" w:customStyle="1" w:styleId="a8">
-    <w:name w:val="引用 字符"/>
-    <w:basedOn w:val="a0"/>
-    <w:link w:val="a7"/>
+  <w:style w:type="character" w:customStyle="1" w:styleId="QuoteChar">
+    <w:name w:val="Quote Char"/>
+    <w:basedOn w:val="DefaultParagraphFont"/>
+    <w:link w:val="Quote"/>
     <w:uiPriority w:val="29"/>
     <w:rsid w:val="00011880"/>
     <w:rPr>
@@ -5315,9 +5392,9 @@
       <w:color w:val="404040" w:themeColor="text1" w:themeTint="BF"/>
     </w:rPr>
   </w:style>
-  <w:style w:type="paragraph" w:styleId="a9">
+  <w:style w:type="paragraph" w:styleId="ListParagraph">
     <w:name w:val="List Paragraph"/>
-    <w:basedOn w:val="a"/>
+    <w:basedOn w:val="Normal"/>
     <w:uiPriority w:val="34"/>
     <w:qFormat/>
     <w:rsid w:val="00011880"/>
@@ -5326,9 +5403,9 @@
       <w:contextualSpacing/>
     </w:pPr>
   </w:style>
-  <w:style w:type="character" w:styleId="aa">
+  <w:style w:type="character" w:styleId="IntenseEmphasis">
     <w:name w:val="Intense Emphasis"/>
-    <w:basedOn w:val="a0"/>
+    <w:basedOn w:val="DefaultParagraphFont"/>
     <w:uiPriority w:val="21"/>
     <w:qFormat/>
     <w:rsid w:val="00011880"/>
@@ -5338,11 +5415,11 @@
       <w:color w:val="0F4761" w:themeColor="accent1" w:themeShade="BF"/>
     </w:rPr>
   </w:style>
-  <w:style w:type="paragraph" w:styleId="ab">
+  <w:style w:type="paragraph" w:styleId="IntenseQuote">
     <w:name w:val="Intense Quote"/>
-    <w:basedOn w:val="a"/>
-    <w:next w:val="a"/>
-    <w:link w:val="ac"/>
+    <w:basedOn w:val="Normal"/>
+    <w:next w:val="Normal"/>
+    <w:link w:val="IntenseQuoteChar"/>
     <w:uiPriority w:val="30"/>
     <w:qFormat/>
     <w:rsid w:val="00011880"/>
@@ -5361,10 +5438,10 @@
       <w:color w:val="0F4761" w:themeColor="accent1" w:themeShade="BF"/>
     </w:rPr>
   </w:style>
-  <w:style w:type="character" w:customStyle="1" w:styleId="ac">
-    <w:name w:val="明显引用 字符"/>
-    <w:basedOn w:val="a0"/>
-    <w:link w:val="ab"/>
+  <w:style w:type="character" w:customStyle="1" w:styleId="IntenseQuoteChar">
+    <w:name w:val="Intense Quote Char"/>
+    <w:basedOn w:val="DefaultParagraphFont"/>
+    <w:link w:val="IntenseQuote"/>
     <w:uiPriority w:val="30"/>
     <w:rsid w:val="00011880"/>
     <w:rPr>
@@ -5373,9 +5450,9 @@
       <w:color w:val="0F4761" w:themeColor="accent1" w:themeShade="BF"/>
     </w:rPr>
   </w:style>
-  <w:style w:type="character" w:styleId="ad">
+  <w:style w:type="character" w:styleId="IntenseReference">
     <w:name w:val="Intense Reference"/>
-    <w:basedOn w:val="a0"/>
+    <w:basedOn w:val="DefaultParagraphFont"/>
     <w:uiPriority w:val="32"/>
     <w:qFormat/>
     <w:rsid w:val="00011880"/>
@@ -5387,9 +5464,9 @@
       <w:spacing w:val="5"/>
     </w:rPr>
   </w:style>
-  <w:style w:type="character" w:styleId="ae">
+  <w:style w:type="character" w:styleId="PlaceholderText">
     <w:name w:val="Placeholder Text"/>
-    <w:basedOn w:val="a0"/>
+    <w:basedOn w:val="DefaultParagraphFont"/>
     <w:uiPriority w:val="99"/>
     <w:semiHidden/>
     <w:rsid w:val="006B5563"/>

</xml_diff>